<commit_message>
SQL COMMANDS WORD FILE
SQL COMMANDS WORD FILE
</commit_message>
<xml_diff>
--- a/IMDB SQL TABLE ANALYSIS.docx
+++ b/IMDB SQL TABLE ANALYSIS.docx
@@ -18,14 +18,27 @@
           <w:sz w:val="24"/>
           <w:szCs w:val="24"/>
         </w:rPr>
-        <w:t>#TOP 10 MOVIES BY THEIR RATINGS</w:t>
+        <w:t xml:space="preserve">#CHECKING </w:t>
+      </w:r>
+      <w:r>
+        <w:rPr>
+          <w:b/>
+          <w:bCs/>
+          <w:sz w:val="24"/>
+          <w:szCs w:val="24"/>
+        </w:rPr>
+        <w:t>REVENUE COLUMNS HAVING NULL OR EMPTY VALUES</w:t>
       </w:r>
     </w:p>
     <w:p>
       <w:pPr>
         <w:rPr>
-          <w:sz w:val="24"/>
-          <w:szCs w:val="24"/>
+          <w:rStyle w:val="cm-punctuation"/>
+          <w:rFonts w:ascii="Courier New" w:hAnsi="Courier New" w:cs="Courier New"/>
+          <w:color w:val="444444"/>
+          <w:sz w:val="20"/>
+          <w:szCs w:val="20"/>
+          <w:shd w:val="clear" w:color="auto" w:fill="E5E5E5"/>
         </w:rPr>
       </w:pPr>
       <w:hyperlink r:id="rId4" w:tgtFrame="mysql_doc" w:history="1">
@@ -48,6 +61,827 @@
           <w:szCs w:val="20"/>
           <w:shd w:val="clear" w:color="auto" w:fill="E5E5E5"/>
         </w:rPr>
+        <w:t> </w:t>
+      </w:r>
+      <w:hyperlink r:id="rId5" w:tgtFrame="mysql_doc" w:history="1">
+        <w:r>
+          <w:rPr>
+            <w:rStyle w:val="Hyperlink"/>
+            <w:rFonts w:ascii="Courier New" w:hAnsi="Courier New" w:cs="Courier New"/>
+            <w:sz w:val="20"/>
+            <w:szCs w:val="20"/>
+            <w:shd w:val="clear" w:color="auto" w:fill="E5E5E5"/>
+          </w:rPr>
+          <w:t>COUNT</w:t>
+        </w:r>
+      </w:hyperlink>
+      <w:r>
+        <w:rPr>
+          <w:rStyle w:val="cm-bracket"/>
+          <w:rFonts w:ascii="Courier New" w:hAnsi="Courier New" w:cs="Courier New"/>
+          <w:color w:val="999977"/>
+          <w:sz w:val="20"/>
+          <w:szCs w:val="20"/>
+          <w:shd w:val="clear" w:color="auto" w:fill="E5E5E5"/>
+        </w:rPr>
+        <w:t>(</w:t>
+      </w:r>
+      <w:r>
+        <w:rPr>
+          <w:rStyle w:val="cm-operator"/>
+          <w:rFonts w:ascii="Courier New" w:hAnsi="Courier New" w:cs="Courier New"/>
+          <w:color w:val="FF00FF"/>
+          <w:sz w:val="20"/>
+          <w:szCs w:val="20"/>
+          <w:shd w:val="clear" w:color="auto" w:fill="E5E5E5"/>
+        </w:rPr>
+        <w:t>*</w:t>
+      </w:r>
+      <w:r>
+        <w:rPr>
+          <w:rStyle w:val="cm-bracket"/>
+          <w:rFonts w:ascii="Courier New" w:hAnsi="Courier New" w:cs="Courier New"/>
+          <w:color w:val="999977"/>
+          <w:sz w:val="20"/>
+          <w:szCs w:val="20"/>
+          <w:shd w:val="clear" w:color="auto" w:fill="E5E5E5"/>
+        </w:rPr>
+        <w:t>)</w:t>
+      </w:r>
+      <w:r>
+        <w:rPr>
+          <w:rFonts w:ascii="Courier New" w:hAnsi="Courier New" w:cs="Courier New"/>
+          <w:color w:val="444444"/>
+          <w:sz w:val="20"/>
+          <w:szCs w:val="20"/>
+          <w:shd w:val="clear" w:color="auto" w:fill="E5E5E5"/>
+        </w:rPr>
+        <w:t> </w:t>
+      </w:r>
+      <w:r>
+        <w:rPr>
+          <w:rStyle w:val="cm-keyword"/>
+          <w:rFonts w:ascii="Courier New" w:hAnsi="Courier New" w:cs="Courier New"/>
+          <w:color w:val="770088"/>
+          <w:sz w:val="20"/>
+          <w:szCs w:val="20"/>
+          <w:shd w:val="clear" w:color="auto" w:fill="E5E5E5"/>
+        </w:rPr>
+        <w:t>AS</w:t>
+      </w:r>
+      <w:r>
+        <w:rPr>
+          <w:rFonts w:ascii="Courier New" w:hAnsi="Courier New" w:cs="Courier New"/>
+          <w:color w:val="444444"/>
+          <w:sz w:val="20"/>
+          <w:szCs w:val="20"/>
+          <w:shd w:val="clear" w:color="auto" w:fill="E5E5E5"/>
+        </w:rPr>
+        <w:t> empty_revenue_rows </w:t>
+      </w:r>
+      <w:r>
+        <w:rPr>
+          <w:rStyle w:val="cm-keyword"/>
+          <w:rFonts w:ascii="Courier New" w:hAnsi="Courier New" w:cs="Courier New"/>
+          <w:color w:val="770088"/>
+          <w:sz w:val="20"/>
+          <w:szCs w:val="20"/>
+          <w:shd w:val="clear" w:color="auto" w:fill="E5E5E5"/>
+        </w:rPr>
+        <w:t>FROM</w:t>
+      </w:r>
+      <w:r>
+        <w:rPr>
+          <w:rFonts w:ascii="Courier New" w:hAnsi="Courier New" w:cs="Courier New"/>
+          <w:color w:val="444444"/>
+          <w:sz w:val="20"/>
+          <w:szCs w:val="20"/>
+          <w:shd w:val="clear" w:color="auto" w:fill="E5E5E5"/>
+        </w:rPr>
+        <w:t> imdb_movie_data </w:t>
+      </w:r>
+      <w:r>
+        <w:rPr>
+          <w:rStyle w:val="cm-keyword"/>
+          <w:rFonts w:ascii="Courier New" w:hAnsi="Courier New" w:cs="Courier New"/>
+          <w:color w:val="770088"/>
+          <w:sz w:val="20"/>
+          <w:szCs w:val="20"/>
+          <w:shd w:val="clear" w:color="auto" w:fill="E5E5E5"/>
+        </w:rPr>
+        <w:t>WHERE</w:t>
+      </w:r>
+      <w:r>
+        <w:rPr>
+          <w:rFonts w:ascii="Courier New" w:hAnsi="Courier New" w:cs="Courier New"/>
+          <w:color w:val="444444"/>
+          <w:sz w:val="20"/>
+          <w:szCs w:val="20"/>
+          <w:shd w:val="clear" w:color="auto" w:fill="E5E5E5"/>
+        </w:rPr>
+        <w:t> revenue_millions </w:t>
+      </w:r>
+      <w:hyperlink r:id="rId6" w:tgtFrame="mysql_doc" w:history="1">
+        <w:r>
+          <w:rPr>
+            <w:rStyle w:val="Hyperlink"/>
+            <w:rFonts w:ascii="Courier New" w:hAnsi="Courier New" w:cs="Courier New"/>
+            <w:sz w:val="20"/>
+            <w:szCs w:val="20"/>
+            <w:shd w:val="clear" w:color="auto" w:fill="E5E5E5"/>
+          </w:rPr>
+          <w:t>IS</w:t>
+        </w:r>
+      </w:hyperlink>
+      <w:r>
+        <w:rPr>
+          <w:rFonts w:ascii="Courier New" w:hAnsi="Courier New" w:cs="Courier New"/>
+          <w:color w:val="444444"/>
+          <w:sz w:val="20"/>
+          <w:szCs w:val="20"/>
+          <w:shd w:val="clear" w:color="auto" w:fill="E5E5E5"/>
+        </w:rPr>
+        <w:t> </w:t>
+      </w:r>
+      <w:r>
+        <w:rPr>
+          <w:rStyle w:val="cm-atom"/>
+          <w:rFonts w:ascii="Courier New" w:hAnsi="Courier New" w:cs="Courier New"/>
+          <w:color w:val="221199"/>
+          <w:sz w:val="20"/>
+          <w:szCs w:val="20"/>
+          <w:shd w:val="clear" w:color="auto" w:fill="E5E5E5"/>
+        </w:rPr>
+        <w:t>NULL</w:t>
+      </w:r>
+      <w:r>
+        <w:rPr>
+          <w:rFonts w:ascii="Courier New" w:hAnsi="Courier New" w:cs="Courier New"/>
+          <w:color w:val="444444"/>
+          <w:sz w:val="20"/>
+          <w:szCs w:val="20"/>
+          <w:shd w:val="clear" w:color="auto" w:fill="E5E5E5"/>
+        </w:rPr>
+        <w:t> </w:t>
+      </w:r>
+      <w:hyperlink r:id="rId7" w:tgtFrame="mysql_doc" w:history="1">
+        <w:r>
+          <w:rPr>
+            <w:rStyle w:val="Hyperlink"/>
+            <w:rFonts w:ascii="Courier New" w:hAnsi="Courier New" w:cs="Courier New"/>
+            <w:sz w:val="20"/>
+            <w:szCs w:val="20"/>
+            <w:shd w:val="clear" w:color="auto" w:fill="E5E5E5"/>
+          </w:rPr>
+          <w:t>OR</w:t>
+        </w:r>
+      </w:hyperlink>
+      <w:r>
+        <w:rPr>
+          <w:rFonts w:ascii="Courier New" w:hAnsi="Courier New" w:cs="Courier New"/>
+          <w:color w:val="444444"/>
+          <w:sz w:val="20"/>
+          <w:szCs w:val="20"/>
+          <w:shd w:val="clear" w:color="auto" w:fill="E5E5E5"/>
+        </w:rPr>
+        <w:t> TRIM</w:t>
+      </w:r>
+      <w:r>
+        <w:rPr>
+          <w:rStyle w:val="cm-bracket"/>
+          <w:rFonts w:ascii="Courier New" w:hAnsi="Courier New" w:cs="Courier New"/>
+          <w:color w:val="999977"/>
+          <w:sz w:val="20"/>
+          <w:szCs w:val="20"/>
+          <w:shd w:val="clear" w:color="auto" w:fill="E5E5E5"/>
+        </w:rPr>
+        <w:t>(</w:t>
+      </w:r>
+      <w:r>
+        <w:rPr>
+          <w:rFonts w:ascii="Courier New" w:hAnsi="Courier New" w:cs="Courier New"/>
+          <w:color w:val="444444"/>
+          <w:sz w:val="20"/>
+          <w:szCs w:val="20"/>
+          <w:shd w:val="clear" w:color="auto" w:fill="E5E5E5"/>
+        </w:rPr>
+        <w:t>revenue_millions</w:t>
+      </w:r>
+      <w:r>
+        <w:rPr>
+          <w:rStyle w:val="cm-bracket"/>
+          <w:rFonts w:ascii="Courier New" w:hAnsi="Courier New" w:cs="Courier New"/>
+          <w:color w:val="999977"/>
+          <w:sz w:val="20"/>
+          <w:szCs w:val="20"/>
+          <w:shd w:val="clear" w:color="auto" w:fill="E5E5E5"/>
+        </w:rPr>
+        <w:t>)</w:t>
+      </w:r>
+      <w:r>
+        <w:rPr>
+          <w:rFonts w:ascii="Courier New" w:hAnsi="Courier New" w:cs="Courier New"/>
+          <w:color w:val="444444"/>
+          <w:sz w:val="20"/>
+          <w:szCs w:val="20"/>
+          <w:shd w:val="clear" w:color="auto" w:fill="E5E5E5"/>
+        </w:rPr>
+        <w:t> </w:t>
+      </w:r>
+      <w:r>
+        <w:rPr>
+          <w:rStyle w:val="cm-operator"/>
+          <w:rFonts w:ascii="Courier New" w:hAnsi="Courier New" w:cs="Courier New"/>
+          <w:color w:val="FF00FF"/>
+          <w:sz w:val="20"/>
+          <w:szCs w:val="20"/>
+          <w:shd w:val="clear" w:color="auto" w:fill="E5E5E5"/>
+        </w:rPr>
+        <w:t>=</w:t>
+      </w:r>
+      <w:r>
+        <w:rPr>
+          <w:rFonts w:ascii="Courier New" w:hAnsi="Courier New" w:cs="Courier New"/>
+          <w:color w:val="444444"/>
+          <w:sz w:val="20"/>
+          <w:szCs w:val="20"/>
+          <w:shd w:val="clear" w:color="auto" w:fill="E5E5E5"/>
+        </w:rPr>
+        <w:t> </w:t>
+      </w:r>
+      <w:r>
+        <w:rPr>
+          <w:rStyle w:val="cm-string"/>
+          <w:rFonts w:ascii="Courier New" w:hAnsi="Courier New" w:cs="Courier New"/>
+          <w:color w:val="AA1111"/>
+          <w:sz w:val="20"/>
+          <w:szCs w:val="20"/>
+          <w:shd w:val="clear" w:color="auto" w:fill="E5E5E5"/>
+        </w:rPr>
+        <w:t>''</w:t>
+      </w:r>
+      <w:r>
+        <w:rPr>
+          <w:rStyle w:val="cm-punctuation"/>
+          <w:rFonts w:ascii="Courier New" w:hAnsi="Courier New" w:cs="Courier New"/>
+          <w:color w:val="444444"/>
+          <w:sz w:val="20"/>
+          <w:szCs w:val="20"/>
+          <w:shd w:val="clear" w:color="auto" w:fill="E5E5E5"/>
+        </w:rPr>
+        <w:t>;</w:t>
+      </w:r>
+    </w:p>
+    <w:p>
+      <w:pPr>
+        <w:rPr>
+          <w:rStyle w:val="cm-punctuation"/>
+          <w:rFonts w:ascii="Courier New" w:hAnsi="Courier New" w:cs="Courier New"/>
+          <w:color w:val="444444"/>
+          <w:sz w:val="20"/>
+          <w:szCs w:val="20"/>
+          <w:shd w:val="clear" w:color="auto" w:fill="E5E5E5"/>
+        </w:rPr>
+      </w:pPr>
+      <w:r>
+        <w:rPr>
+          <w:rStyle w:val="cm-punctuation"/>
+          <w:rFonts w:ascii="Courier New" w:hAnsi="Courier New" w:cs="Courier New"/>
+          <w:noProof/>
+          <w:color w:val="444444"/>
+          <w:sz w:val="20"/>
+          <w:szCs w:val="20"/>
+          <w:shd w:val="clear" w:color="auto" w:fill="E5E5E5"/>
+        </w:rPr>
+        <w:drawing>
+          <wp:inline distT="0" distB="0" distL="0" distR="0" wp14:anchorId="7C476F79" wp14:editId="786EAB7A">
+            <wp:extent cx="5724525" cy="1409700"/>
+            <wp:effectExtent l="0" t="0" r="9525" b="0"/>
+            <wp:docPr id="236776108" name="Picture 6"/>
+            <wp:cNvGraphicFramePr>
+              <a:graphicFrameLocks xmlns:a="http://schemas.openxmlformats.org/drawingml/2006/main" noChangeAspect="1"/>
+            </wp:cNvGraphicFramePr>
+            <a:graphic xmlns:a="http://schemas.openxmlformats.org/drawingml/2006/main">
+              <a:graphicData uri="http://schemas.openxmlformats.org/drawingml/2006/picture">
+                <pic:pic xmlns:pic="http://schemas.openxmlformats.org/drawingml/2006/picture">
+                  <pic:nvPicPr>
+                    <pic:cNvPr id="0" name="Picture 6"/>
+                    <pic:cNvPicPr>
+                      <a:picLocks noChangeAspect="1" noChangeArrowheads="1"/>
+                    </pic:cNvPicPr>
+                  </pic:nvPicPr>
+                  <pic:blipFill>
+                    <a:blip r:embed="rId8">
+                      <a:extLst>
+                        <a:ext uri="{28A0092B-C50C-407E-A947-70E740481C1C}">
+                          <a14:useLocalDpi xmlns:a14="http://schemas.microsoft.com/office/drawing/2010/main" val="0"/>
+                        </a:ext>
+                      </a:extLst>
+                    </a:blip>
+                    <a:srcRect/>
+                    <a:stretch>
+                      <a:fillRect/>
+                    </a:stretch>
+                  </pic:blipFill>
+                  <pic:spPr bwMode="auto">
+                    <a:xfrm>
+                      <a:off x="0" y="0"/>
+                      <a:ext cx="5724525" cy="1409700"/>
+                    </a:xfrm>
+                    <a:prstGeom prst="rect">
+                      <a:avLst/>
+                    </a:prstGeom>
+                    <a:noFill/>
+                    <a:ln>
+                      <a:noFill/>
+                    </a:ln>
+                  </pic:spPr>
+                </pic:pic>
+              </a:graphicData>
+            </a:graphic>
+          </wp:inline>
+        </w:drawing>
+      </w:r>
+    </w:p>
+    <w:p>
+      <w:pPr>
+        <w:rPr>
+          <w:rStyle w:val="cm-punctuation"/>
+          <w:b/>
+          <w:bCs/>
+          <w:sz w:val="24"/>
+          <w:szCs w:val="24"/>
+        </w:rPr>
+      </w:pPr>
+      <w:r>
+        <w:rPr>
+          <w:b/>
+          <w:bCs/>
+          <w:sz w:val="24"/>
+          <w:szCs w:val="24"/>
+        </w:rPr>
+        <w:t xml:space="preserve">#CHECKING </w:t>
+      </w:r>
+      <w:r>
+        <w:rPr>
+          <w:b/>
+          <w:bCs/>
+          <w:sz w:val="24"/>
+          <w:szCs w:val="24"/>
+        </w:rPr>
+        <w:t>METASCORE</w:t>
+      </w:r>
+      <w:r>
+        <w:rPr>
+          <w:b/>
+          <w:bCs/>
+          <w:sz w:val="24"/>
+          <w:szCs w:val="24"/>
+        </w:rPr>
+        <w:t xml:space="preserve"> COLUMNS HAVING NULL OR EMPTY VALUES</w:t>
+      </w:r>
+    </w:p>
+    <w:p>
+      <w:pPr>
+        <w:rPr>
+          <w:rStyle w:val="cm-punctuation"/>
+          <w:rFonts w:ascii="Courier New" w:hAnsi="Courier New" w:cs="Courier New"/>
+          <w:color w:val="444444"/>
+          <w:sz w:val="20"/>
+          <w:szCs w:val="20"/>
+          <w:shd w:val="clear" w:color="auto" w:fill="E5E5E5"/>
+        </w:rPr>
+      </w:pPr>
+      <w:hyperlink r:id="rId9" w:tgtFrame="mysql_doc" w:history="1">
+        <w:r>
+          <w:rPr>
+            <w:rStyle w:val="Hyperlink"/>
+            <w:rFonts w:ascii="Courier New" w:hAnsi="Courier New" w:cs="Courier New"/>
+            <w:sz w:val="20"/>
+            <w:szCs w:val="20"/>
+            <w:shd w:val="clear" w:color="auto" w:fill="E5E5E5"/>
+          </w:rPr>
+          <w:t>SELECT</w:t>
+        </w:r>
+      </w:hyperlink>
+      <w:r>
+        <w:rPr>
+          <w:rFonts w:ascii="Courier New" w:hAnsi="Courier New" w:cs="Courier New"/>
+          <w:color w:val="444444"/>
+          <w:sz w:val="20"/>
+          <w:szCs w:val="20"/>
+          <w:shd w:val="clear" w:color="auto" w:fill="E5E5E5"/>
+        </w:rPr>
+        <w:t> </w:t>
+      </w:r>
+      <w:hyperlink r:id="rId10" w:tgtFrame="mysql_doc" w:history="1">
+        <w:r>
+          <w:rPr>
+            <w:rStyle w:val="Hyperlink"/>
+            <w:rFonts w:ascii="Courier New" w:hAnsi="Courier New" w:cs="Courier New"/>
+            <w:sz w:val="20"/>
+            <w:szCs w:val="20"/>
+            <w:shd w:val="clear" w:color="auto" w:fill="E5E5E5"/>
+          </w:rPr>
+          <w:t>COUNT</w:t>
+        </w:r>
+      </w:hyperlink>
+      <w:r>
+        <w:rPr>
+          <w:rStyle w:val="cm-bracket"/>
+          <w:rFonts w:ascii="Courier New" w:hAnsi="Courier New" w:cs="Courier New"/>
+          <w:color w:val="999977"/>
+          <w:sz w:val="20"/>
+          <w:szCs w:val="20"/>
+          <w:shd w:val="clear" w:color="auto" w:fill="E5E5E5"/>
+        </w:rPr>
+        <w:t>(</w:t>
+      </w:r>
+      <w:r>
+        <w:rPr>
+          <w:rStyle w:val="cm-operator"/>
+          <w:rFonts w:ascii="Courier New" w:hAnsi="Courier New" w:cs="Courier New"/>
+          <w:color w:val="FF00FF"/>
+          <w:sz w:val="20"/>
+          <w:szCs w:val="20"/>
+          <w:shd w:val="clear" w:color="auto" w:fill="E5E5E5"/>
+        </w:rPr>
+        <w:t>*</w:t>
+      </w:r>
+      <w:r>
+        <w:rPr>
+          <w:rStyle w:val="cm-bracket"/>
+          <w:rFonts w:ascii="Courier New" w:hAnsi="Courier New" w:cs="Courier New"/>
+          <w:color w:val="999977"/>
+          <w:sz w:val="20"/>
+          <w:szCs w:val="20"/>
+          <w:shd w:val="clear" w:color="auto" w:fill="E5E5E5"/>
+        </w:rPr>
+        <w:t>)</w:t>
+      </w:r>
+      <w:r>
+        <w:rPr>
+          <w:rFonts w:ascii="Courier New" w:hAnsi="Courier New" w:cs="Courier New"/>
+          <w:color w:val="444444"/>
+          <w:sz w:val="20"/>
+          <w:szCs w:val="20"/>
+          <w:shd w:val="clear" w:color="auto" w:fill="E5E5E5"/>
+        </w:rPr>
+        <w:t> </w:t>
+      </w:r>
+      <w:r>
+        <w:rPr>
+          <w:rStyle w:val="cm-keyword"/>
+          <w:rFonts w:ascii="Courier New" w:hAnsi="Courier New" w:cs="Courier New"/>
+          <w:color w:val="770088"/>
+          <w:sz w:val="20"/>
+          <w:szCs w:val="20"/>
+          <w:shd w:val="clear" w:color="auto" w:fill="E5E5E5"/>
+        </w:rPr>
+        <w:t>AS</w:t>
+      </w:r>
+      <w:r>
+        <w:rPr>
+          <w:rFonts w:ascii="Courier New" w:hAnsi="Courier New" w:cs="Courier New"/>
+          <w:color w:val="444444"/>
+          <w:sz w:val="20"/>
+          <w:szCs w:val="20"/>
+          <w:shd w:val="clear" w:color="auto" w:fill="E5E5E5"/>
+        </w:rPr>
+        <w:t> empty_metascore_rows </w:t>
+      </w:r>
+      <w:r>
+        <w:rPr>
+          <w:rStyle w:val="cm-keyword"/>
+          <w:rFonts w:ascii="Courier New" w:hAnsi="Courier New" w:cs="Courier New"/>
+          <w:color w:val="770088"/>
+          <w:sz w:val="20"/>
+          <w:szCs w:val="20"/>
+          <w:shd w:val="clear" w:color="auto" w:fill="E5E5E5"/>
+        </w:rPr>
+        <w:t>FROM</w:t>
+      </w:r>
+      <w:r>
+        <w:rPr>
+          <w:rFonts w:ascii="Courier New" w:hAnsi="Courier New" w:cs="Courier New"/>
+          <w:color w:val="444444"/>
+          <w:sz w:val="20"/>
+          <w:szCs w:val="20"/>
+          <w:shd w:val="clear" w:color="auto" w:fill="E5E5E5"/>
+        </w:rPr>
+        <w:t> imdb_movie_data </w:t>
+      </w:r>
+      <w:r>
+        <w:rPr>
+          <w:rStyle w:val="cm-keyword"/>
+          <w:rFonts w:ascii="Courier New" w:hAnsi="Courier New" w:cs="Courier New"/>
+          <w:color w:val="770088"/>
+          <w:sz w:val="20"/>
+          <w:szCs w:val="20"/>
+          <w:shd w:val="clear" w:color="auto" w:fill="E5E5E5"/>
+        </w:rPr>
+        <w:t>WHERE</w:t>
+      </w:r>
+      <w:r>
+        <w:rPr>
+          <w:rFonts w:ascii="Courier New" w:hAnsi="Courier New" w:cs="Courier New"/>
+          <w:color w:val="444444"/>
+          <w:sz w:val="20"/>
+          <w:szCs w:val="20"/>
+          <w:shd w:val="clear" w:color="auto" w:fill="E5E5E5"/>
+        </w:rPr>
+        <w:t> metascore </w:t>
+      </w:r>
+      <w:hyperlink r:id="rId11" w:tgtFrame="mysql_doc" w:history="1">
+        <w:r>
+          <w:rPr>
+            <w:rStyle w:val="Hyperlink"/>
+            <w:rFonts w:ascii="Courier New" w:hAnsi="Courier New" w:cs="Courier New"/>
+            <w:sz w:val="20"/>
+            <w:szCs w:val="20"/>
+            <w:shd w:val="clear" w:color="auto" w:fill="E5E5E5"/>
+          </w:rPr>
+          <w:t>IS</w:t>
+        </w:r>
+      </w:hyperlink>
+      <w:r>
+        <w:rPr>
+          <w:rFonts w:ascii="Courier New" w:hAnsi="Courier New" w:cs="Courier New"/>
+          <w:color w:val="444444"/>
+          <w:sz w:val="20"/>
+          <w:szCs w:val="20"/>
+          <w:shd w:val="clear" w:color="auto" w:fill="E5E5E5"/>
+        </w:rPr>
+        <w:t> </w:t>
+      </w:r>
+      <w:r>
+        <w:rPr>
+          <w:rStyle w:val="cm-atom"/>
+          <w:rFonts w:ascii="Courier New" w:hAnsi="Courier New" w:cs="Courier New"/>
+          <w:color w:val="221199"/>
+          <w:sz w:val="20"/>
+          <w:szCs w:val="20"/>
+          <w:shd w:val="clear" w:color="auto" w:fill="E5E5E5"/>
+        </w:rPr>
+        <w:t>NULL</w:t>
+      </w:r>
+      <w:r>
+        <w:rPr>
+          <w:rFonts w:ascii="Courier New" w:hAnsi="Courier New" w:cs="Courier New"/>
+          <w:color w:val="444444"/>
+          <w:sz w:val="20"/>
+          <w:szCs w:val="20"/>
+          <w:shd w:val="clear" w:color="auto" w:fill="E5E5E5"/>
+        </w:rPr>
+        <w:t> </w:t>
+      </w:r>
+      <w:hyperlink r:id="rId12" w:tgtFrame="mysql_doc" w:history="1">
+        <w:r>
+          <w:rPr>
+            <w:rStyle w:val="Hyperlink"/>
+            <w:rFonts w:ascii="Courier New" w:hAnsi="Courier New" w:cs="Courier New"/>
+            <w:sz w:val="20"/>
+            <w:szCs w:val="20"/>
+            <w:shd w:val="clear" w:color="auto" w:fill="E5E5E5"/>
+          </w:rPr>
+          <w:t>OR</w:t>
+        </w:r>
+      </w:hyperlink>
+      <w:r>
+        <w:rPr>
+          <w:rFonts w:ascii="Courier New" w:hAnsi="Courier New" w:cs="Courier New"/>
+          <w:color w:val="444444"/>
+          <w:sz w:val="20"/>
+          <w:szCs w:val="20"/>
+          <w:shd w:val="clear" w:color="auto" w:fill="E5E5E5"/>
+        </w:rPr>
+        <w:t> TRIM</w:t>
+      </w:r>
+      <w:r>
+        <w:rPr>
+          <w:rStyle w:val="cm-bracket"/>
+          <w:rFonts w:ascii="Courier New" w:hAnsi="Courier New" w:cs="Courier New"/>
+          <w:color w:val="999977"/>
+          <w:sz w:val="20"/>
+          <w:szCs w:val="20"/>
+          <w:shd w:val="clear" w:color="auto" w:fill="E5E5E5"/>
+        </w:rPr>
+        <w:t>(</w:t>
+      </w:r>
+      <w:r>
+        <w:rPr>
+          <w:rFonts w:ascii="Courier New" w:hAnsi="Courier New" w:cs="Courier New"/>
+          <w:color w:val="444444"/>
+          <w:sz w:val="20"/>
+          <w:szCs w:val="20"/>
+          <w:shd w:val="clear" w:color="auto" w:fill="E5E5E5"/>
+        </w:rPr>
+        <w:t>metascore</w:t>
+      </w:r>
+      <w:r>
+        <w:rPr>
+          <w:rStyle w:val="cm-bracket"/>
+          <w:rFonts w:ascii="Courier New" w:hAnsi="Courier New" w:cs="Courier New"/>
+          <w:color w:val="999977"/>
+          <w:sz w:val="20"/>
+          <w:szCs w:val="20"/>
+          <w:shd w:val="clear" w:color="auto" w:fill="E5E5E5"/>
+        </w:rPr>
+        <w:t>)</w:t>
+      </w:r>
+      <w:r>
+        <w:rPr>
+          <w:rFonts w:ascii="Courier New" w:hAnsi="Courier New" w:cs="Courier New"/>
+          <w:color w:val="444444"/>
+          <w:sz w:val="20"/>
+          <w:szCs w:val="20"/>
+          <w:shd w:val="clear" w:color="auto" w:fill="E5E5E5"/>
+        </w:rPr>
+        <w:t> </w:t>
+      </w:r>
+      <w:r>
+        <w:rPr>
+          <w:rStyle w:val="cm-operator"/>
+          <w:rFonts w:ascii="Courier New" w:hAnsi="Courier New" w:cs="Courier New"/>
+          <w:color w:val="FF00FF"/>
+          <w:sz w:val="20"/>
+          <w:szCs w:val="20"/>
+          <w:shd w:val="clear" w:color="auto" w:fill="E5E5E5"/>
+        </w:rPr>
+        <w:t>=</w:t>
+      </w:r>
+      <w:r>
+        <w:rPr>
+          <w:rFonts w:ascii="Courier New" w:hAnsi="Courier New" w:cs="Courier New"/>
+          <w:color w:val="444444"/>
+          <w:sz w:val="20"/>
+          <w:szCs w:val="20"/>
+          <w:shd w:val="clear" w:color="auto" w:fill="E5E5E5"/>
+        </w:rPr>
+        <w:t> </w:t>
+      </w:r>
+      <w:r>
+        <w:rPr>
+          <w:rStyle w:val="cm-string"/>
+          <w:rFonts w:ascii="Courier New" w:hAnsi="Courier New" w:cs="Courier New"/>
+          <w:color w:val="AA1111"/>
+          <w:sz w:val="20"/>
+          <w:szCs w:val="20"/>
+          <w:shd w:val="clear" w:color="auto" w:fill="E5E5E5"/>
+        </w:rPr>
+        <w:t>''</w:t>
+      </w:r>
+      <w:r>
+        <w:rPr>
+          <w:rStyle w:val="cm-punctuation"/>
+          <w:rFonts w:ascii="Courier New" w:hAnsi="Courier New" w:cs="Courier New"/>
+          <w:color w:val="444444"/>
+          <w:sz w:val="20"/>
+          <w:szCs w:val="20"/>
+          <w:shd w:val="clear" w:color="auto" w:fill="E5E5E5"/>
+        </w:rPr>
+        <w:t>;</w:t>
+      </w:r>
+    </w:p>
+    <w:p>
+      <w:pPr>
+        <w:rPr>
+          <w:rStyle w:val="cm-punctuation"/>
+          <w:rFonts w:ascii="Courier New" w:hAnsi="Courier New" w:cs="Courier New"/>
+          <w:color w:val="444444"/>
+          <w:sz w:val="20"/>
+          <w:szCs w:val="20"/>
+          <w:shd w:val="clear" w:color="auto" w:fill="E5E5E5"/>
+        </w:rPr>
+      </w:pPr>
+    </w:p>
+    <w:p>
+      <w:pPr>
+        <w:rPr>
+          <w:rStyle w:val="cm-punctuation"/>
+          <w:rFonts w:ascii="Courier New" w:hAnsi="Courier New" w:cs="Courier New"/>
+          <w:color w:val="444444"/>
+          <w:sz w:val="20"/>
+          <w:szCs w:val="20"/>
+          <w:shd w:val="clear" w:color="auto" w:fill="E5E5E5"/>
+        </w:rPr>
+      </w:pPr>
+      <w:r>
+        <w:rPr>
+          <w:rStyle w:val="cm-punctuation"/>
+          <w:rFonts w:ascii="Courier New" w:hAnsi="Courier New" w:cs="Courier New"/>
+          <w:noProof/>
+          <w:color w:val="444444"/>
+          <w:sz w:val="20"/>
+          <w:szCs w:val="20"/>
+          <w:shd w:val="clear" w:color="auto" w:fill="E5E5E5"/>
+        </w:rPr>
+        <w:drawing>
+          <wp:inline distT="0" distB="0" distL="0" distR="0" wp14:anchorId="331F4F61" wp14:editId="0F690A5D">
+            <wp:extent cx="5724525" cy="1543050"/>
+            <wp:effectExtent l="0" t="0" r="9525" b="0"/>
+            <wp:docPr id="529284799" name="Picture 7"/>
+            <wp:cNvGraphicFramePr>
+              <a:graphicFrameLocks xmlns:a="http://schemas.openxmlformats.org/drawingml/2006/main" noChangeAspect="1"/>
+            </wp:cNvGraphicFramePr>
+            <a:graphic xmlns:a="http://schemas.openxmlformats.org/drawingml/2006/main">
+              <a:graphicData uri="http://schemas.openxmlformats.org/drawingml/2006/picture">
+                <pic:pic xmlns:pic="http://schemas.openxmlformats.org/drawingml/2006/picture">
+                  <pic:nvPicPr>
+                    <pic:cNvPr id="0" name="Picture 7"/>
+                    <pic:cNvPicPr>
+                      <a:picLocks noChangeAspect="1" noChangeArrowheads="1"/>
+                    </pic:cNvPicPr>
+                  </pic:nvPicPr>
+                  <pic:blipFill>
+                    <a:blip r:embed="rId13">
+                      <a:extLst>
+                        <a:ext uri="{28A0092B-C50C-407E-A947-70E740481C1C}">
+                          <a14:useLocalDpi xmlns:a14="http://schemas.microsoft.com/office/drawing/2010/main" val="0"/>
+                        </a:ext>
+                      </a:extLst>
+                    </a:blip>
+                    <a:srcRect/>
+                    <a:stretch>
+                      <a:fillRect/>
+                    </a:stretch>
+                  </pic:blipFill>
+                  <pic:spPr bwMode="auto">
+                    <a:xfrm>
+                      <a:off x="0" y="0"/>
+                      <a:ext cx="5724525" cy="1543050"/>
+                    </a:xfrm>
+                    <a:prstGeom prst="rect">
+                      <a:avLst/>
+                    </a:prstGeom>
+                    <a:noFill/>
+                    <a:ln>
+                      <a:noFill/>
+                    </a:ln>
+                  </pic:spPr>
+                </pic:pic>
+              </a:graphicData>
+            </a:graphic>
+          </wp:inline>
+        </w:drawing>
+      </w:r>
+    </w:p>
+    <w:p>
+      <w:pPr>
+        <w:rPr>
+          <w:b/>
+          <w:bCs/>
+          <w:sz w:val="24"/>
+          <w:szCs w:val="24"/>
+        </w:rPr>
+      </w:pPr>
+    </w:p>
+    <w:p>
+      <w:pPr>
+        <w:rPr>
+          <w:b/>
+          <w:bCs/>
+          <w:sz w:val="24"/>
+          <w:szCs w:val="24"/>
+        </w:rPr>
+      </w:pPr>
+      <w:r>
+        <w:rPr>
+          <w:b/>
+          <w:bCs/>
+          <w:sz w:val="24"/>
+          <w:szCs w:val="24"/>
+        </w:rPr>
+        <w:t>#TOP 10 MOVIES BY THEIR RATINGS</w:t>
+      </w:r>
+    </w:p>
+    <w:p>
+      <w:pPr>
+        <w:rPr>
+          <w:sz w:val="24"/>
+          <w:szCs w:val="24"/>
+        </w:rPr>
+      </w:pPr>
+      <w:hyperlink r:id="rId14" w:tgtFrame="mysql_doc" w:history="1">
+        <w:r>
+          <w:rPr>
+            <w:rStyle w:val="Hyperlink"/>
+            <w:rFonts w:ascii="Courier New" w:hAnsi="Courier New" w:cs="Courier New"/>
+            <w:sz w:val="20"/>
+            <w:szCs w:val="20"/>
+            <w:shd w:val="clear" w:color="auto" w:fill="E5E5E5"/>
+          </w:rPr>
+          <w:t>SELECT</w:t>
+        </w:r>
+      </w:hyperlink>
+      <w:r>
+        <w:rPr>
+          <w:rFonts w:ascii="Courier New" w:hAnsi="Courier New" w:cs="Courier New"/>
+          <w:color w:val="444444"/>
+          <w:sz w:val="20"/>
+          <w:szCs w:val="20"/>
+          <w:shd w:val="clear" w:color="auto" w:fill="E5E5E5"/>
+        </w:rPr>
         <w:t> title</w:t>
       </w:r>
       <w:r>
@@ -71,7 +905,7 @@
         </w:rPr>
         <w:t> </w:t>
       </w:r>
-      <w:hyperlink r:id="rId5" w:tgtFrame="mysql_doc" w:history="1">
+      <w:hyperlink r:id="rId15" w:tgtFrame="mysql_doc" w:history="1">
         <w:r>
           <w:rPr>
             <w:rStyle w:val="Hyperlink"/>
@@ -392,7 +1226,7 @@
                     </pic:cNvPicPr>
                   </pic:nvPicPr>
                   <pic:blipFill>
-                    <a:blip r:embed="rId6">
+                    <a:blip r:embed="rId16">
                       <a:extLst>
                         <a:ext uri="{28A0092B-C50C-407E-A947-70E740481C1C}">
                           <a14:useLocalDpi xmlns:a14="http://schemas.microsoft.com/office/drawing/2010/main" val="0"/>
@@ -448,6 +1282,7 @@
           <w:sz w:val="24"/>
           <w:szCs w:val="24"/>
         </w:rPr>
+        <w:lastRenderedPageBreak/>
         <w:t xml:space="preserve">#TOP </w:t>
       </w:r>
       <w:r>
@@ -479,7 +1314,7 @@
           <w:shd w:val="clear" w:color="auto" w:fill="E5E5E5"/>
         </w:rPr>
       </w:pPr>
-      <w:hyperlink r:id="rId7" w:tgtFrame="mysql_doc" w:history="1">
+      <w:hyperlink r:id="rId17" w:tgtFrame="mysql_doc" w:history="1">
         <w:r>
           <w:rPr>
             <w:rFonts w:ascii="Courier New" w:hAnsi="Courier New" w:cs="Courier New"/>
@@ -502,7 +1337,7 @@
         </w:rPr>
         <w:t> title, </w:t>
       </w:r>
-      <w:hyperlink r:id="rId8" w:tgtFrame="mysql_doc" w:history="1">
+      <w:hyperlink r:id="rId18" w:tgtFrame="mysql_doc" w:history="1">
         <w:r>
           <w:rPr>
             <w:rFonts w:ascii="Courier New" w:hAnsi="Courier New" w:cs="Courier New"/>
@@ -827,7 +1662,7 @@
                     </pic:cNvPicPr>
                   </pic:nvPicPr>
                   <pic:blipFill>
-                    <a:blip r:embed="rId9">
+                    <a:blip r:embed="rId19">
                       <a:extLst>
                         <a:ext uri="{28A0092B-C50C-407E-A947-70E740481C1C}">
                           <a14:useLocalDpi xmlns:a14="http://schemas.microsoft.com/office/drawing/2010/main" val="0"/>
@@ -945,7 +1780,6 @@
           <w:sz w:val="24"/>
           <w:szCs w:val="24"/>
         </w:rPr>
-        <w:lastRenderedPageBreak/>
         <w:t>#</w:t>
       </w:r>
       <w:r>
@@ -967,7 +1801,7 @@
           <w:szCs w:val="24"/>
         </w:rPr>
       </w:pPr>
-      <w:hyperlink r:id="rId10" w:tgtFrame="mysql_doc" w:history="1">
+      <w:hyperlink r:id="rId20" w:tgtFrame="mysql_doc" w:history="1">
         <w:r>
           <w:rPr>
             <w:rStyle w:val="Hyperlink"/>
@@ -1158,7 +1992,7 @@
         </w:rPr>
         <w:t> </w:t>
       </w:r>
-      <w:hyperlink r:id="rId11" w:tgtFrame="mysql_doc" w:history="1">
+      <w:hyperlink r:id="rId21" w:tgtFrame="mysql_doc" w:history="1">
         <w:r>
           <w:rPr>
             <w:rStyle w:val="Hyperlink"/>
@@ -1418,7 +2252,7 @@
                     </pic:cNvPicPr>
                   </pic:nvPicPr>
                   <pic:blipFill>
-                    <a:blip r:embed="rId12">
+                    <a:blip r:embed="rId22">
                       <a:extLst>
                         <a:ext uri="{28A0092B-C50C-407E-A947-70E740481C1C}">
                           <a14:useLocalDpi xmlns:a14="http://schemas.microsoft.com/office/drawing/2010/main" val="0"/>
@@ -1521,7 +2355,7 @@
         </w:rPr>
         <w:t> </w:t>
       </w:r>
-      <w:hyperlink r:id="rId13" w:tgtFrame="mysql_doc" w:history="1">
+      <w:hyperlink r:id="rId23" w:tgtFrame="mysql_doc" w:history="1">
         <w:r>
           <w:rPr>
             <w:rStyle w:val="Hyperlink"/>
@@ -1564,7 +2398,7 @@
         </w:rPr>
         <w:t> </w:t>
       </w:r>
-      <w:hyperlink r:id="rId14" w:tgtFrame="mysql_doc" w:history="1">
+      <w:hyperlink r:id="rId24" w:tgtFrame="mysql_doc" w:history="1">
         <w:r>
           <w:rPr>
             <w:rStyle w:val="Hyperlink"/>
@@ -1893,7 +2727,7 @@
                     </pic:cNvPicPr>
                   </pic:nvPicPr>
                   <pic:blipFill>
-                    <a:blip r:embed="rId15">
+                    <a:blip r:embed="rId25">
                       <a:extLst>
                         <a:ext uri="{28A0092B-C50C-407E-A947-70E740481C1C}">
                           <a14:useLocalDpi xmlns:a14="http://schemas.microsoft.com/office/drawing/2010/main" val="0"/>
@@ -1981,7 +2815,6 @@
           <w:sz w:val="24"/>
           <w:szCs w:val="24"/>
         </w:rPr>
-        <w:lastRenderedPageBreak/>
         <w:t>#TOP 10 MOVIES BY THEIR RUNTIME IN MINUTES</w:t>
       </w:r>
     </w:p>
@@ -1996,7 +2829,7 @@
           <w:shd w:val="clear" w:color="auto" w:fill="E5E5E5"/>
         </w:rPr>
       </w:pPr>
-      <w:hyperlink r:id="rId16" w:tgtFrame="mysql_doc" w:history="1">
+      <w:hyperlink r:id="rId26" w:tgtFrame="mysql_doc" w:history="1">
         <w:r>
           <w:rPr>
             <w:rStyle w:val="Hyperlink"/>
@@ -2039,7 +2872,7 @@
         </w:rPr>
         <w:t> </w:t>
       </w:r>
-      <w:hyperlink r:id="rId17" w:tgtFrame="mysql_doc" w:history="1">
+      <w:hyperlink r:id="rId27" w:tgtFrame="mysql_doc" w:history="1">
         <w:r>
           <w:rPr>
             <w:rStyle w:val="Hyperlink"/>
@@ -2368,7 +3201,7 @@
                     </pic:cNvPicPr>
                   </pic:nvPicPr>
                   <pic:blipFill>
-                    <a:blip r:embed="rId18">
+                    <a:blip r:embed="rId28">
                       <a:extLst>
                         <a:ext uri="{28A0092B-C50C-407E-A947-70E740481C1C}">
                           <a14:useLocalDpi xmlns:a14="http://schemas.microsoft.com/office/drawing/2010/main" val="0"/>
@@ -2457,7 +3290,7 @@
           <w:shd w:val="clear" w:color="auto" w:fill="E5E5E5"/>
         </w:rPr>
       </w:pPr>
-      <w:hyperlink r:id="rId19" w:tgtFrame="mysql_doc" w:history="1">
+      <w:hyperlink r:id="rId29" w:tgtFrame="mysql_doc" w:history="1">
         <w:r>
           <w:rPr>
             <w:rStyle w:val="Hyperlink"/>
@@ -2648,7 +3481,7 @@
         </w:rPr>
         <w:t> </w:t>
       </w:r>
-      <w:hyperlink r:id="rId20" w:tgtFrame="mysql_doc" w:history="1">
+      <w:hyperlink r:id="rId30" w:tgtFrame="mysql_doc" w:history="1">
         <w:r>
           <w:rPr>
             <w:rStyle w:val="Hyperlink"/>
@@ -2978,7 +3811,7 @@
                     </pic:cNvPicPr>
                   </pic:nvPicPr>
                   <pic:blipFill>
-                    <a:blip r:embed="rId21">
+                    <a:blip r:embed="rId31">
                       <a:extLst>
                         <a:ext uri="{28A0092B-C50C-407E-A947-70E740481C1C}">
                           <a14:useLocalDpi xmlns:a14="http://schemas.microsoft.com/office/drawing/2010/main" val="0"/>
@@ -3086,7 +3919,6 @@
           <w:sz w:val="24"/>
           <w:szCs w:val="24"/>
         </w:rPr>
-        <w:lastRenderedPageBreak/>
         <w:t>#TOP 10 MOVIES WHO GOT MAX VOTES</w:t>
       </w:r>
     </w:p>
@@ -3101,7 +3933,7 @@
           <w:shd w:val="clear" w:color="auto" w:fill="E5E5E5"/>
         </w:rPr>
       </w:pPr>
-      <w:hyperlink r:id="rId22" w:tgtFrame="mysql_doc" w:history="1">
+      <w:hyperlink r:id="rId32" w:tgtFrame="mysql_doc" w:history="1">
         <w:r>
           <w:rPr>
             <w:rStyle w:val="Hyperlink"/>
@@ -3144,7 +3976,7 @@
         </w:rPr>
         <w:t> </w:t>
       </w:r>
-      <w:hyperlink r:id="rId23" w:tgtFrame="mysql_doc" w:history="1">
+      <w:hyperlink r:id="rId33" w:tgtFrame="mysql_doc" w:history="1">
         <w:r>
           <w:rPr>
             <w:rStyle w:val="Hyperlink"/>
@@ -3399,7 +4231,7 @@
                     </pic:cNvPicPr>
                   </pic:nvPicPr>
                   <pic:blipFill>
-                    <a:blip r:embed="rId24">
+                    <a:blip r:embed="rId34">
                       <a:extLst>
                         <a:ext uri="{28A0092B-C50C-407E-A947-70E740481C1C}">
                           <a14:useLocalDpi xmlns:a14="http://schemas.microsoft.com/office/drawing/2010/main" val="0"/>
@@ -4420,6 +5252,11 @@
     <w:basedOn w:val="DefaultParagraphFont"/>
     <w:rsid w:val="00644D04"/>
   </w:style>
+  <w:style w:type="character" w:customStyle="1" w:styleId="cm-atom">
+    <w:name w:val="cm-atom"/>
+    <w:basedOn w:val="DefaultParagraphFont"/>
+    <w:rsid w:val="00AD71EC"/>
+  </w:style>
 </w:styles>
 </file>
 

</xml_diff>

<commit_message>
IMDB SQL TABLE ANALYSIS DOCS
IMDB SQL TABLE ANALYSIS DOCS
</commit_message>
<xml_diff>
--- a/IMDB SQL TABLE ANALYSIS.docx
+++ b/IMDB SQL TABLE ANALYSIS.docx
@@ -420,25 +420,7 @@
           <w:sz w:val="24"/>
           <w:szCs w:val="24"/>
         </w:rPr>
-        <w:t xml:space="preserve">#CHECKING </w:t>
-      </w:r>
-      <w:r>
-        <w:rPr>
-          <w:b/>
-          <w:bCs/>
-          <w:sz w:val="24"/>
-          <w:szCs w:val="24"/>
-        </w:rPr>
-        <w:t>METASCORE</w:t>
-      </w:r>
-      <w:r>
-        <w:rPr>
-          <w:b/>
-          <w:bCs/>
-          <w:sz w:val="24"/>
-          <w:szCs w:val="24"/>
-        </w:rPr>
-        <w:t xml:space="preserve"> COLUMNS HAVING NULL OR EMPTY VALUES</w:t>
+        <w:t>#CHECKING METASCORE COLUMNS HAVING NULL OR EMPTY VALUES</w:t>
       </w:r>
     </w:p>
     <w:p>
@@ -1645,10 +1627,10 @@
           <w:szCs w:val="24"/>
         </w:rPr>
         <w:drawing>
-          <wp:inline distT="0" distB="0" distL="0" distR="0" wp14:anchorId="0666496F" wp14:editId="617498FC">
-            <wp:extent cx="5731510" cy="2237105"/>
-            <wp:effectExtent l="0" t="0" r="2540" b="0"/>
-            <wp:docPr id="1149280852" name="Picture 3"/>
+          <wp:inline distT="0" distB="0" distL="0" distR="0" wp14:anchorId="3BDB231C" wp14:editId="17E8077B">
+            <wp:extent cx="5724525" cy="2000250"/>
+            <wp:effectExtent l="0" t="0" r="9525" b="0"/>
+            <wp:docPr id="335091489" name="Picture 2"/>
             <wp:cNvGraphicFramePr>
               <a:graphicFrameLocks xmlns:a="http://schemas.openxmlformats.org/drawingml/2006/main" noChangeAspect="1"/>
             </wp:cNvGraphicFramePr>
@@ -1656,7 +1638,7 @@
               <a:graphicData uri="http://schemas.openxmlformats.org/drawingml/2006/picture">
                 <pic:pic xmlns:pic="http://schemas.openxmlformats.org/drawingml/2006/picture">
                   <pic:nvPicPr>
-                    <pic:cNvPr id="0" name="Picture 3"/>
+                    <pic:cNvPr id="0" name="Picture 2"/>
                     <pic:cNvPicPr>
                       <a:picLocks noChangeAspect="1" noChangeArrowheads="1"/>
                     </pic:cNvPicPr>
@@ -1677,7 +1659,7 @@
                   <pic:spPr bwMode="auto">
                     <a:xfrm>
                       <a:off x="0" y="0"/>
-                      <a:ext cx="5731510" cy="2237105"/>
+                      <a:ext cx="5724525" cy="2000250"/>
                     </a:xfrm>
                     <a:prstGeom prst="rect">
                       <a:avLst/>
@@ -1693,66 +1675,6 @@
           </wp:inline>
         </w:drawing>
       </w:r>
-    </w:p>
-    <w:p>
-      <w:pPr>
-        <w:rPr>
-          <w:b/>
-          <w:bCs/>
-          <w:sz w:val="24"/>
-          <w:szCs w:val="24"/>
-        </w:rPr>
-      </w:pPr>
-    </w:p>
-    <w:p>
-      <w:pPr>
-        <w:rPr>
-          <w:b/>
-          <w:bCs/>
-          <w:sz w:val="24"/>
-          <w:szCs w:val="24"/>
-        </w:rPr>
-      </w:pPr>
-    </w:p>
-    <w:p>
-      <w:pPr>
-        <w:rPr>
-          <w:b/>
-          <w:bCs/>
-          <w:sz w:val="24"/>
-          <w:szCs w:val="24"/>
-        </w:rPr>
-      </w:pPr>
-    </w:p>
-    <w:p>
-      <w:pPr>
-        <w:rPr>
-          <w:b/>
-          <w:bCs/>
-          <w:sz w:val="24"/>
-          <w:szCs w:val="24"/>
-        </w:rPr>
-      </w:pPr>
-    </w:p>
-    <w:p>
-      <w:pPr>
-        <w:rPr>
-          <w:b/>
-          <w:bCs/>
-          <w:sz w:val="24"/>
-          <w:szCs w:val="24"/>
-        </w:rPr>
-      </w:pPr>
-    </w:p>
-    <w:p>
-      <w:pPr>
-        <w:rPr>
-          <w:b/>
-          <w:bCs/>
-          <w:sz w:val="24"/>
-          <w:szCs w:val="24"/>
-        </w:rPr>
-      </w:pPr>
     </w:p>
     <w:p>
       <w:pPr>
@@ -2313,19 +2235,60 @@
           <w:szCs w:val="24"/>
         </w:rPr>
       </w:pPr>
-      <w:r>
-        <w:rPr>
-          <w:b/>
-          <w:bCs/>
-          <w:sz w:val="24"/>
-          <w:szCs w:val="24"/>
-        </w:rPr>
-        <w:t>#DIRECTOR NAME WHO RELEASES MOST</w:t>
-      </w:r>
     </w:p>
     <w:p>
       <w:pPr>
         <w:rPr>
+          <w:b/>
+          <w:bCs/>
+          <w:sz w:val="24"/>
+          <w:szCs w:val="24"/>
+        </w:rPr>
+      </w:pPr>
+    </w:p>
+    <w:p>
+      <w:pPr>
+        <w:rPr>
+          <w:b/>
+          <w:bCs/>
+          <w:sz w:val="24"/>
+          <w:szCs w:val="24"/>
+        </w:rPr>
+      </w:pPr>
+    </w:p>
+    <w:p>
+      <w:pPr>
+        <w:rPr>
+          <w:b/>
+          <w:bCs/>
+          <w:sz w:val="24"/>
+          <w:szCs w:val="24"/>
+        </w:rPr>
+      </w:pPr>
+    </w:p>
+    <w:p>
+      <w:pPr>
+        <w:rPr>
+          <w:b/>
+          <w:bCs/>
+          <w:sz w:val="24"/>
+          <w:szCs w:val="24"/>
+        </w:rPr>
+      </w:pPr>
+      <w:r>
+        <w:rPr>
+          <w:b/>
+          <w:bCs/>
+          <w:sz w:val="24"/>
+          <w:szCs w:val="24"/>
+        </w:rPr>
+        <w:lastRenderedPageBreak/>
+        <w:t>#DIRECTOR NAME WHO RELEASES MOST</w:t>
+      </w:r>
+    </w:p>
+    <w:p>
+      <w:pPr>
+        <w:rPr>
           <w:rStyle w:val="cm-punctuation"/>
           <w:rFonts w:ascii="Courier New" w:hAnsi="Courier New" w:cs="Courier New"/>
           <w:color w:val="444444"/>
@@ -2334,27 +2297,6 @@
           <w:shd w:val="clear" w:color="auto" w:fill="E5E5E5"/>
         </w:rPr>
       </w:pPr>
-      <w:r>
-        <w:rPr>
-          <w:rStyle w:val="cm-comment"/>
-          <w:rFonts w:ascii="Courier New" w:hAnsi="Courier New" w:cs="Courier New"/>
-          <w:color w:val="AA5500"/>
-          <w:sz w:val="20"/>
-          <w:szCs w:val="20"/>
-          <w:shd w:val="clear" w:color="auto" w:fill="E5E5E5"/>
-        </w:rPr>
-        <w:t>MOVIES</w:t>
-      </w:r>
-      <w:r>
-        <w:rPr>
-          <w:rFonts w:ascii="Courier New" w:hAnsi="Courier New" w:cs="Courier New"/>
-          <w:color w:val="444444"/>
-          <w:sz w:val="20"/>
-          <w:szCs w:val="20"/>
-          <w:shd w:val="clear" w:color="auto" w:fill="E5E5E5"/>
-        </w:rPr>
-        <w:t> </w:t>
-      </w:r>
       <w:hyperlink r:id="rId23" w:tgtFrame="mysql_doc" w:history="1">
         <w:r>
           <w:rPr>
@@ -2778,36 +2720,6 @@
           <w:szCs w:val="24"/>
         </w:rPr>
       </w:pPr>
-    </w:p>
-    <w:p>
-      <w:pPr>
-        <w:rPr>
-          <w:b/>
-          <w:bCs/>
-          <w:sz w:val="24"/>
-          <w:szCs w:val="24"/>
-        </w:rPr>
-      </w:pPr>
-    </w:p>
-    <w:p>
-      <w:pPr>
-        <w:rPr>
-          <w:b/>
-          <w:bCs/>
-          <w:sz w:val="24"/>
-          <w:szCs w:val="24"/>
-        </w:rPr>
-      </w:pPr>
-    </w:p>
-    <w:p>
-      <w:pPr>
-        <w:rPr>
-          <w:b/>
-          <w:bCs/>
-          <w:sz w:val="24"/>
-          <w:szCs w:val="24"/>
-        </w:rPr>
-      </w:pPr>
       <w:r>
         <w:rPr>
           <w:b/>
@@ -3242,13 +3154,74 @@
           <w:szCs w:val="24"/>
         </w:rPr>
       </w:pPr>
-      <w:r>
+    </w:p>
+    <w:p>
+      <w:pPr>
         <w:rPr>
           <w:b/>
           <w:bCs/>
           <w:sz w:val="24"/>
           <w:szCs w:val="24"/>
         </w:rPr>
+      </w:pPr>
+    </w:p>
+    <w:p>
+      <w:pPr>
+        <w:rPr>
+          <w:b/>
+          <w:bCs/>
+          <w:sz w:val="24"/>
+          <w:szCs w:val="24"/>
+        </w:rPr>
+      </w:pPr>
+    </w:p>
+    <w:p>
+      <w:pPr>
+        <w:rPr>
+          <w:b/>
+          <w:bCs/>
+          <w:sz w:val="24"/>
+          <w:szCs w:val="24"/>
+        </w:rPr>
+      </w:pPr>
+    </w:p>
+    <w:p>
+      <w:pPr>
+        <w:rPr>
+          <w:b/>
+          <w:bCs/>
+          <w:sz w:val="24"/>
+          <w:szCs w:val="24"/>
+        </w:rPr>
+      </w:pPr>
+    </w:p>
+    <w:p>
+      <w:pPr>
+        <w:rPr>
+          <w:b/>
+          <w:bCs/>
+          <w:sz w:val="24"/>
+          <w:szCs w:val="24"/>
+        </w:rPr>
+      </w:pPr>
+    </w:p>
+    <w:p>
+      <w:pPr>
+        <w:rPr>
+          <w:b/>
+          <w:bCs/>
+          <w:sz w:val="24"/>
+          <w:szCs w:val="24"/>
+        </w:rPr>
+      </w:pPr>
+      <w:r>
+        <w:rPr>
+          <w:b/>
+          <w:bCs/>
+          <w:sz w:val="24"/>
+          <w:szCs w:val="24"/>
+        </w:rPr>
+        <w:lastRenderedPageBreak/>
         <w:t xml:space="preserve">#TOP 10 </w:t>
       </w:r>
       <w:r>
@@ -3862,56 +3835,6 @@
           <w:szCs w:val="24"/>
         </w:rPr>
       </w:pPr>
-    </w:p>
-    <w:p>
-      <w:pPr>
-        <w:rPr>
-          <w:b/>
-          <w:bCs/>
-          <w:sz w:val="24"/>
-          <w:szCs w:val="24"/>
-        </w:rPr>
-      </w:pPr>
-    </w:p>
-    <w:p>
-      <w:pPr>
-        <w:rPr>
-          <w:b/>
-          <w:bCs/>
-          <w:sz w:val="24"/>
-          <w:szCs w:val="24"/>
-        </w:rPr>
-      </w:pPr>
-    </w:p>
-    <w:p>
-      <w:pPr>
-        <w:rPr>
-          <w:b/>
-          <w:bCs/>
-          <w:sz w:val="24"/>
-          <w:szCs w:val="24"/>
-        </w:rPr>
-      </w:pPr>
-    </w:p>
-    <w:p>
-      <w:pPr>
-        <w:rPr>
-          <w:b/>
-          <w:bCs/>
-          <w:sz w:val="24"/>
-          <w:szCs w:val="24"/>
-        </w:rPr>
-      </w:pPr>
-    </w:p>
-    <w:p>
-      <w:pPr>
-        <w:rPr>
-          <w:b/>
-          <w:bCs/>
-          <w:sz w:val="24"/>
-          <w:szCs w:val="24"/>
-        </w:rPr>
-      </w:pPr>
       <w:r>
         <w:rPr>
           <w:b/>
@@ -4247,6 +4170,844 @@
                     <a:xfrm>
                       <a:off x="0" y="0"/>
                       <a:ext cx="5724525" cy="2686050"/>
+                    </a:xfrm>
+                    <a:prstGeom prst="rect">
+                      <a:avLst/>
+                    </a:prstGeom>
+                    <a:noFill/>
+                    <a:ln>
+                      <a:noFill/>
+                    </a:ln>
+                  </pic:spPr>
+                </pic:pic>
+              </a:graphicData>
+            </a:graphic>
+          </wp:inline>
+        </w:drawing>
+      </w:r>
+    </w:p>
+    <w:p>
+      <w:pPr>
+        <w:rPr>
+          <w:sz w:val="24"/>
+          <w:szCs w:val="24"/>
+        </w:rPr>
+      </w:pPr>
+    </w:p>
+    <w:p>
+      <w:pPr>
+        <w:rPr>
+          <w:sz w:val="24"/>
+          <w:szCs w:val="24"/>
+        </w:rPr>
+      </w:pPr>
+    </w:p>
+    <w:p>
+      <w:pPr>
+        <w:rPr>
+          <w:sz w:val="24"/>
+          <w:szCs w:val="24"/>
+        </w:rPr>
+      </w:pPr>
+    </w:p>
+    <w:p>
+      <w:pPr>
+        <w:rPr>
+          <w:sz w:val="24"/>
+          <w:szCs w:val="24"/>
+        </w:rPr>
+      </w:pPr>
+    </w:p>
+    <w:p>
+      <w:pPr>
+        <w:rPr>
+          <w:sz w:val="24"/>
+          <w:szCs w:val="24"/>
+        </w:rPr>
+      </w:pPr>
+    </w:p>
+    <w:p>
+      <w:pPr>
+        <w:rPr>
+          <w:b/>
+          <w:bCs/>
+          <w:sz w:val="24"/>
+          <w:szCs w:val="24"/>
+        </w:rPr>
+      </w:pPr>
+      <w:r>
+        <w:rPr>
+          <w:b/>
+          <w:bCs/>
+          <w:sz w:val="24"/>
+          <w:szCs w:val="24"/>
+        </w:rPr>
+        <w:lastRenderedPageBreak/>
+        <w:t>#A</w:t>
+      </w:r>
+      <w:r>
+        <w:rPr>
+          <w:b/>
+          <w:bCs/>
+          <w:sz w:val="24"/>
+          <w:szCs w:val="24"/>
+        </w:rPr>
+        <w:t>CTOR</w:t>
+      </w:r>
+      <w:r>
+        <w:rPr>
+          <w:b/>
+          <w:bCs/>
+          <w:sz w:val="24"/>
+          <w:szCs w:val="24"/>
+        </w:rPr>
+        <w:t xml:space="preserve"> R</w:t>
+      </w:r>
+      <w:r>
+        <w:rPr>
+          <w:b/>
+          <w:bCs/>
+          <w:sz w:val="24"/>
+          <w:szCs w:val="24"/>
+        </w:rPr>
+        <w:t>ANKIN</w:t>
+      </w:r>
+      <w:r>
+        <w:rPr>
+          <w:b/>
+          <w:bCs/>
+          <w:sz w:val="24"/>
+          <w:szCs w:val="24"/>
+        </w:rPr>
+        <w:t>G</w:t>
+      </w:r>
+      <w:r>
+        <w:rPr>
+          <w:b/>
+          <w:bCs/>
+          <w:sz w:val="24"/>
+          <w:szCs w:val="24"/>
+        </w:rPr>
+        <w:t xml:space="preserve"> B</w:t>
+      </w:r>
+      <w:r>
+        <w:rPr>
+          <w:b/>
+          <w:bCs/>
+          <w:sz w:val="24"/>
+          <w:szCs w:val="24"/>
+        </w:rPr>
+        <w:t>ASED</w:t>
+      </w:r>
+      <w:r>
+        <w:rPr>
+          <w:b/>
+          <w:bCs/>
+          <w:sz w:val="24"/>
+          <w:szCs w:val="24"/>
+        </w:rPr>
+        <w:t xml:space="preserve"> O</w:t>
+      </w:r>
+      <w:r>
+        <w:rPr>
+          <w:b/>
+          <w:bCs/>
+          <w:sz w:val="24"/>
+          <w:szCs w:val="24"/>
+        </w:rPr>
+        <w:t>N</w:t>
+      </w:r>
+      <w:r>
+        <w:rPr>
+          <w:b/>
+          <w:bCs/>
+          <w:sz w:val="24"/>
+          <w:szCs w:val="24"/>
+        </w:rPr>
+        <w:t xml:space="preserve"> M</w:t>
+      </w:r>
+      <w:r>
+        <w:rPr>
+          <w:b/>
+          <w:bCs/>
+          <w:sz w:val="24"/>
+          <w:szCs w:val="24"/>
+        </w:rPr>
+        <w:t>OVIE</w:t>
+      </w:r>
+      <w:r>
+        <w:rPr>
+          <w:b/>
+          <w:bCs/>
+          <w:sz w:val="24"/>
+          <w:szCs w:val="24"/>
+        </w:rPr>
+        <w:t xml:space="preserve"> C</w:t>
+      </w:r>
+      <w:r>
+        <w:rPr>
+          <w:b/>
+          <w:bCs/>
+          <w:sz w:val="24"/>
+          <w:szCs w:val="24"/>
+        </w:rPr>
+        <w:t>OUNT</w:t>
+      </w:r>
+    </w:p>
+    <w:p>
+      <w:pPr>
+        <w:rPr>
+          <w:rStyle w:val="cm-punctuation"/>
+          <w:rFonts w:ascii="Courier New" w:hAnsi="Courier New" w:cs="Courier New"/>
+          <w:color w:val="444444"/>
+          <w:sz w:val="20"/>
+          <w:szCs w:val="20"/>
+          <w:shd w:val="clear" w:color="auto" w:fill="E5E5E5"/>
+        </w:rPr>
+      </w:pPr>
+      <w:hyperlink r:id="rId35" w:tgtFrame="mysql_doc" w:history="1">
+        <w:r>
+          <w:rPr>
+            <w:rStyle w:val="Hyperlink"/>
+            <w:rFonts w:ascii="Courier New" w:hAnsi="Courier New" w:cs="Courier New"/>
+            <w:sz w:val="20"/>
+            <w:szCs w:val="20"/>
+            <w:shd w:val="clear" w:color="auto" w:fill="E5E5E5"/>
+          </w:rPr>
+          <w:t>SELECT</w:t>
+        </w:r>
+      </w:hyperlink>
+      <w:r>
+        <w:rPr>
+          <w:rFonts w:ascii="Courier New" w:hAnsi="Courier New" w:cs="Courier New"/>
+          <w:color w:val="444444"/>
+          <w:sz w:val="20"/>
+          <w:szCs w:val="20"/>
+          <w:shd w:val="clear" w:color="auto" w:fill="E5E5E5"/>
+        </w:rPr>
+        <w:t> main_actor</w:t>
+      </w:r>
+      <w:r>
+        <w:rPr>
+          <w:rStyle w:val="cm-punctuation"/>
+          <w:rFonts w:ascii="Courier New" w:hAnsi="Courier New" w:cs="Courier New"/>
+          <w:color w:val="444444"/>
+          <w:sz w:val="20"/>
+          <w:szCs w:val="20"/>
+          <w:shd w:val="clear" w:color="auto" w:fill="E5E5E5"/>
+        </w:rPr>
+        <w:t>,</w:t>
+      </w:r>
+      <w:r>
+        <w:rPr>
+          <w:rFonts w:ascii="Courier New" w:hAnsi="Courier New" w:cs="Courier New"/>
+          <w:color w:val="444444"/>
+          <w:sz w:val="20"/>
+          <w:szCs w:val="20"/>
+          <w:shd w:val="clear" w:color="auto" w:fill="E5E5E5"/>
+        </w:rPr>
+        <w:t> movie_count</w:t>
+      </w:r>
+      <w:r>
+        <w:rPr>
+          <w:rStyle w:val="cm-punctuation"/>
+          <w:rFonts w:ascii="Courier New" w:hAnsi="Courier New" w:cs="Courier New"/>
+          <w:color w:val="444444"/>
+          <w:sz w:val="20"/>
+          <w:szCs w:val="20"/>
+          <w:shd w:val="clear" w:color="auto" w:fill="E5E5E5"/>
+        </w:rPr>
+        <w:t>,</w:t>
+      </w:r>
+      <w:r>
+        <w:rPr>
+          <w:rFonts w:ascii="Courier New" w:hAnsi="Courier New" w:cs="Courier New"/>
+          <w:color w:val="444444"/>
+          <w:sz w:val="20"/>
+          <w:szCs w:val="20"/>
+          <w:shd w:val="clear" w:color="auto" w:fill="E5E5E5"/>
+        </w:rPr>
+        <w:t> DENSE_RANK</w:t>
+      </w:r>
+      <w:r>
+        <w:rPr>
+          <w:rStyle w:val="cm-bracket"/>
+          <w:rFonts w:ascii="Courier New" w:hAnsi="Courier New" w:cs="Courier New"/>
+          <w:color w:val="999977"/>
+          <w:sz w:val="20"/>
+          <w:szCs w:val="20"/>
+          <w:shd w:val="clear" w:color="auto" w:fill="E5E5E5"/>
+        </w:rPr>
+        <w:t>()</w:t>
+      </w:r>
+      <w:r>
+        <w:rPr>
+          <w:rFonts w:ascii="Courier New" w:hAnsi="Courier New" w:cs="Courier New"/>
+          <w:color w:val="444444"/>
+          <w:sz w:val="20"/>
+          <w:szCs w:val="20"/>
+          <w:shd w:val="clear" w:color="auto" w:fill="E5E5E5"/>
+        </w:rPr>
+        <w:t> OVER </w:t>
+      </w:r>
+      <w:r>
+        <w:rPr>
+          <w:rStyle w:val="cm-bracket"/>
+          <w:rFonts w:ascii="Courier New" w:hAnsi="Courier New" w:cs="Courier New"/>
+          <w:color w:val="999977"/>
+          <w:sz w:val="20"/>
+          <w:szCs w:val="20"/>
+          <w:shd w:val="clear" w:color="auto" w:fill="E5E5E5"/>
+        </w:rPr>
+        <w:t>(</w:t>
+      </w:r>
+      <w:r>
+        <w:rPr>
+          <w:rStyle w:val="cm-keyword"/>
+          <w:rFonts w:ascii="Courier New" w:hAnsi="Courier New" w:cs="Courier New"/>
+          <w:color w:val="770088"/>
+          <w:sz w:val="20"/>
+          <w:szCs w:val="20"/>
+          <w:shd w:val="clear" w:color="auto" w:fill="E5E5E5"/>
+        </w:rPr>
+        <w:t>ORDER</w:t>
+      </w:r>
+      <w:r>
+        <w:rPr>
+          <w:rFonts w:ascii="Courier New" w:hAnsi="Courier New" w:cs="Courier New"/>
+          <w:color w:val="444444"/>
+          <w:sz w:val="20"/>
+          <w:szCs w:val="20"/>
+          <w:shd w:val="clear" w:color="auto" w:fill="E5E5E5"/>
+        </w:rPr>
+        <w:t> </w:t>
+      </w:r>
+      <w:r>
+        <w:rPr>
+          <w:rStyle w:val="cm-keyword"/>
+          <w:rFonts w:ascii="Courier New" w:hAnsi="Courier New" w:cs="Courier New"/>
+          <w:color w:val="770088"/>
+          <w:sz w:val="20"/>
+          <w:szCs w:val="20"/>
+          <w:shd w:val="clear" w:color="auto" w:fill="E5E5E5"/>
+        </w:rPr>
+        <w:t>BY</w:t>
+      </w:r>
+      <w:r>
+        <w:rPr>
+          <w:rFonts w:ascii="Courier New" w:hAnsi="Courier New" w:cs="Courier New"/>
+          <w:color w:val="444444"/>
+          <w:sz w:val="20"/>
+          <w:szCs w:val="20"/>
+          <w:shd w:val="clear" w:color="auto" w:fill="E5E5E5"/>
+        </w:rPr>
+        <w:t> movie_count </w:t>
+      </w:r>
+      <w:r>
+        <w:rPr>
+          <w:rStyle w:val="cm-keyword"/>
+          <w:rFonts w:ascii="Courier New" w:hAnsi="Courier New" w:cs="Courier New"/>
+          <w:color w:val="770088"/>
+          <w:sz w:val="20"/>
+          <w:szCs w:val="20"/>
+          <w:shd w:val="clear" w:color="auto" w:fill="E5E5E5"/>
+        </w:rPr>
+        <w:t>DESC</w:t>
+      </w:r>
+      <w:r>
+        <w:rPr>
+          <w:rStyle w:val="cm-bracket"/>
+          <w:rFonts w:ascii="Courier New" w:hAnsi="Courier New" w:cs="Courier New"/>
+          <w:color w:val="999977"/>
+          <w:sz w:val="20"/>
+          <w:szCs w:val="20"/>
+          <w:shd w:val="clear" w:color="auto" w:fill="E5E5E5"/>
+        </w:rPr>
+        <w:t>)</w:t>
+      </w:r>
+      <w:r>
+        <w:rPr>
+          <w:rFonts w:ascii="Courier New" w:hAnsi="Courier New" w:cs="Courier New"/>
+          <w:color w:val="444444"/>
+          <w:sz w:val="20"/>
+          <w:szCs w:val="20"/>
+          <w:shd w:val="clear" w:color="auto" w:fill="E5E5E5"/>
+        </w:rPr>
+        <w:t> </w:t>
+      </w:r>
+      <w:r>
+        <w:rPr>
+          <w:rStyle w:val="cm-keyword"/>
+          <w:rFonts w:ascii="Courier New" w:hAnsi="Courier New" w:cs="Courier New"/>
+          <w:color w:val="770088"/>
+          <w:sz w:val="20"/>
+          <w:szCs w:val="20"/>
+          <w:shd w:val="clear" w:color="auto" w:fill="E5E5E5"/>
+        </w:rPr>
+        <w:t>AS</w:t>
+      </w:r>
+      <w:r>
+        <w:rPr>
+          <w:rFonts w:ascii="Courier New" w:hAnsi="Courier New" w:cs="Courier New"/>
+          <w:color w:val="444444"/>
+          <w:sz w:val="20"/>
+          <w:szCs w:val="20"/>
+          <w:shd w:val="clear" w:color="auto" w:fill="E5E5E5"/>
+        </w:rPr>
+        <w:t> actor_rank </w:t>
+      </w:r>
+      <w:r>
+        <w:rPr>
+          <w:rStyle w:val="cm-keyword"/>
+          <w:rFonts w:ascii="Courier New" w:hAnsi="Courier New" w:cs="Courier New"/>
+          <w:color w:val="770088"/>
+          <w:sz w:val="20"/>
+          <w:szCs w:val="20"/>
+          <w:shd w:val="clear" w:color="auto" w:fill="E5E5E5"/>
+        </w:rPr>
+        <w:t>FROM</w:t>
+      </w:r>
+      <w:r>
+        <w:rPr>
+          <w:rFonts w:ascii="Courier New" w:hAnsi="Courier New" w:cs="Courier New"/>
+          <w:color w:val="444444"/>
+          <w:sz w:val="20"/>
+          <w:szCs w:val="20"/>
+          <w:shd w:val="clear" w:color="auto" w:fill="E5E5E5"/>
+        </w:rPr>
+        <w:t> </w:t>
+      </w:r>
+      <w:r>
+        <w:rPr>
+          <w:rStyle w:val="cm-bracket"/>
+          <w:rFonts w:ascii="Courier New" w:hAnsi="Courier New" w:cs="Courier New"/>
+          <w:color w:val="999977"/>
+          <w:sz w:val="20"/>
+          <w:szCs w:val="20"/>
+          <w:shd w:val="clear" w:color="auto" w:fill="E5E5E5"/>
+        </w:rPr>
+        <w:t>(</w:t>
+      </w:r>
+      <w:r>
+        <w:rPr>
+          <w:rFonts w:ascii="Courier New" w:hAnsi="Courier New" w:cs="Courier New"/>
+          <w:color w:val="444444"/>
+          <w:sz w:val="20"/>
+          <w:szCs w:val="20"/>
+          <w:shd w:val="clear" w:color="auto" w:fill="E5E5E5"/>
+        </w:rPr>
+        <w:t> </w:t>
+      </w:r>
+      <w:hyperlink r:id="rId36" w:tgtFrame="mysql_doc" w:history="1">
+        <w:r>
+          <w:rPr>
+            <w:rStyle w:val="Hyperlink"/>
+            <w:rFonts w:ascii="Courier New" w:hAnsi="Courier New" w:cs="Courier New"/>
+            <w:sz w:val="20"/>
+            <w:szCs w:val="20"/>
+            <w:shd w:val="clear" w:color="auto" w:fill="E5E5E5"/>
+          </w:rPr>
+          <w:t>SELECT</w:t>
+        </w:r>
+      </w:hyperlink>
+      <w:r>
+        <w:rPr>
+          <w:rFonts w:ascii="Courier New" w:hAnsi="Courier New" w:cs="Courier New"/>
+          <w:color w:val="444444"/>
+          <w:sz w:val="20"/>
+          <w:szCs w:val="20"/>
+          <w:shd w:val="clear" w:color="auto" w:fill="E5E5E5"/>
+        </w:rPr>
+        <w:t> TRIM</w:t>
+      </w:r>
+      <w:r>
+        <w:rPr>
+          <w:rStyle w:val="cm-bracket"/>
+          <w:rFonts w:ascii="Courier New" w:hAnsi="Courier New" w:cs="Courier New"/>
+          <w:color w:val="999977"/>
+          <w:sz w:val="20"/>
+          <w:szCs w:val="20"/>
+          <w:shd w:val="clear" w:color="auto" w:fill="E5E5E5"/>
+        </w:rPr>
+        <w:t>(</w:t>
+      </w:r>
+      <w:r>
+        <w:rPr>
+          <w:rFonts w:ascii="Courier New" w:hAnsi="Courier New" w:cs="Courier New"/>
+          <w:color w:val="444444"/>
+          <w:sz w:val="20"/>
+          <w:szCs w:val="20"/>
+          <w:shd w:val="clear" w:color="auto" w:fill="E5E5E5"/>
+        </w:rPr>
+        <w:t>SUBSTRING_INDEX</w:t>
+      </w:r>
+      <w:r>
+        <w:rPr>
+          <w:rStyle w:val="cm-bracket"/>
+          <w:rFonts w:ascii="Courier New" w:hAnsi="Courier New" w:cs="Courier New"/>
+          <w:color w:val="999977"/>
+          <w:sz w:val="20"/>
+          <w:szCs w:val="20"/>
+          <w:shd w:val="clear" w:color="auto" w:fill="E5E5E5"/>
+        </w:rPr>
+        <w:t>(</w:t>
+      </w:r>
+      <w:r>
+        <w:rPr>
+          <w:rFonts w:ascii="Courier New" w:hAnsi="Courier New" w:cs="Courier New"/>
+          <w:color w:val="444444"/>
+          <w:sz w:val="20"/>
+          <w:szCs w:val="20"/>
+          <w:shd w:val="clear" w:color="auto" w:fill="E5E5E5"/>
+        </w:rPr>
+        <w:t>actors</w:t>
+      </w:r>
+      <w:r>
+        <w:rPr>
+          <w:rStyle w:val="cm-punctuation"/>
+          <w:rFonts w:ascii="Courier New" w:hAnsi="Courier New" w:cs="Courier New"/>
+          <w:color w:val="444444"/>
+          <w:sz w:val="20"/>
+          <w:szCs w:val="20"/>
+          <w:shd w:val="clear" w:color="auto" w:fill="E5E5E5"/>
+        </w:rPr>
+        <w:t>,</w:t>
+      </w:r>
+      <w:r>
+        <w:rPr>
+          <w:rFonts w:ascii="Courier New" w:hAnsi="Courier New" w:cs="Courier New"/>
+          <w:color w:val="444444"/>
+          <w:sz w:val="20"/>
+          <w:szCs w:val="20"/>
+          <w:shd w:val="clear" w:color="auto" w:fill="E5E5E5"/>
+        </w:rPr>
+        <w:t> </w:t>
+      </w:r>
+      <w:r>
+        <w:rPr>
+          <w:rStyle w:val="cm-string"/>
+          <w:rFonts w:ascii="Courier New" w:hAnsi="Courier New" w:cs="Courier New"/>
+          <w:color w:val="AA1111"/>
+          <w:sz w:val="20"/>
+          <w:szCs w:val="20"/>
+          <w:shd w:val="clear" w:color="auto" w:fill="E5E5E5"/>
+        </w:rPr>
+        <w:t>','</w:t>
+      </w:r>
+      <w:r>
+        <w:rPr>
+          <w:rStyle w:val="cm-punctuation"/>
+          <w:rFonts w:ascii="Courier New" w:hAnsi="Courier New" w:cs="Courier New"/>
+          <w:color w:val="444444"/>
+          <w:sz w:val="20"/>
+          <w:szCs w:val="20"/>
+          <w:shd w:val="clear" w:color="auto" w:fill="E5E5E5"/>
+        </w:rPr>
+        <w:t>,</w:t>
+      </w:r>
+      <w:r>
+        <w:rPr>
+          <w:rFonts w:ascii="Courier New" w:hAnsi="Courier New" w:cs="Courier New"/>
+          <w:color w:val="444444"/>
+          <w:sz w:val="20"/>
+          <w:szCs w:val="20"/>
+          <w:shd w:val="clear" w:color="auto" w:fill="E5E5E5"/>
+        </w:rPr>
+        <w:t> </w:t>
+      </w:r>
+      <w:r>
+        <w:rPr>
+          <w:rStyle w:val="cm-number"/>
+          <w:rFonts w:ascii="Courier New" w:hAnsi="Courier New" w:cs="Courier New"/>
+          <w:color w:val="116644"/>
+          <w:sz w:val="20"/>
+          <w:szCs w:val="20"/>
+          <w:shd w:val="clear" w:color="auto" w:fill="E5E5E5"/>
+        </w:rPr>
+        <w:t>1</w:t>
+      </w:r>
+      <w:r>
+        <w:rPr>
+          <w:rStyle w:val="cm-bracket"/>
+          <w:rFonts w:ascii="Courier New" w:hAnsi="Courier New" w:cs="Courier New"/>
+          <w:color w:val="999977"/>
+          <w:sz w:val="20"/>
+          <w:szCs w:val="20"/>
+          <w:shd w:val="clear" w:color="auto" w:fill="E5E5E5"/>
+        </w:rPr>
+        <w:t>))</w:t>
+      </w:r>
+      <w:r>
+        <w:rPr>
+          <w:rFonts w:ascii="Courier New" w:hAnsi="Courier New" w:cs="Courier New"/>
+          <w:color w:val="444444"/>
+          <w:sz w:val="20"/>
+          <w:szCs w:val="20"/>
+          <w:shd w:val="clear" w:color="auto" w:fill="E5E5E5"/>
+        </w:rPr>
+        <w:t> </w:t>
+      </w:r>
+      <w:r>
+        <w:rPr>
+          <w:rStyle w:val="cm-keyword"/>
+          <w:rFonts w:ascii="Courier New" w:hAnsi="Courier New" w:cs="Courier New"/>
+          <w:color w:val="770088"/>
+          <w:sz w:val="20"/>
+          <w:szCs w:val="20"/>
+          <w:shd w:val="clear" w:color="auto" w:fill="E5E5E5"/>
+        </w:rPr>
+        <w:t>AS</w:t>
+      </w:r>
+      <w:r>
+        <w:rPr>
+          <w:rFonts w:ascii="Courier New" w:hAnsi="Courier New" w:cs="Courier New"/>
+          <w:color w:val="444444"/>
+          <w:sz w:val="20"/>
+          <w:szCs w:val="20"/>
+          <w:shd w:val="clear" w:color="auto" w:fill="E5E5E5"/>
+        </w:rPr>
+        <w:t> main_actor</w:t>
+      </w:r>
+      <w:r>
+        <w:rPr>
+          <w:rStyle w:val="cm-punctuation"/>
+          <w:rFonts w:ascii="Courier New" w:hAnsi="Courier New" w:cs="Courier New"/>
+          <w:color w:val="444444"/>
+          <w:sz w:val="20"/>
+          <w:szCs w:val="20"/>
+          <w:shd w:val="clear" w:color="auto" w:fill="E5E5E5"/>
+        </w:rPr>
+        <w:t>,</w:t>
+      </w:r>
+      <w:r>
+        <w:rPr>
+          <w:rFonts w:ascii="Courier New" w:hAnsi="Courier New" w:cs="Courier New"/>
+          <w:color w:val="444444"/>
+          <w:sz w:val="20"/>
+          <w:szCs w:val="20"/>
+          <w:shd w:val="clear" w:color="auto" w:fill="E5E5E5"/>
+        </w:rPr>
+        <w:t> </w:t>
+      </w:r>
+      <w:hyperlink r:id="rId37" w:tgtFrame="mysql_doc" w:history="1">
+        <w:r>
+          <w:rPr>
+            <w:rStyle w:val="Hyperlink"/>
+            <w:rFonts w:ascii="Courier New" w:hAnsi="Courier New" w:cs="Courier New"/>
+            <w:sz w:val="20"/>
+            <w:szCs w:val="20"/>
+            <w:shd w:val="clear" w:color="auto" w:fill="E5E5E5"/>
+          </w:rPr>
+          <w:t>COUNT</w:t>
+        </w:r>
+      </w:hyperlink>
+      <w:r>
+        <w:rPr>
+          <w:rStyle w:val="cm-bracket"/>
+          <w:rFonts w:ascii="Courier New" w:hAnsi="Courier New" w:cs="Courier New"/>
+          <w:color w:val="999977"/>
+          <w:sz w:val="20"/>
+          <w:szCs w:val="20"/>
+          <w:shd w:val="clear" w:color="auto" w:fill="E5E5E5"/>
+        </w:rPr>
+        <w:t>(</w:t>
+      </w:r>
+      <w:r>
+        <w:rPr>
+          <w:rStyle w:val="cm-operator"/>
+          <w:rFonts w:ascii="Courier New" w:hAnsi="Courier New" w:cs="Courier New"/>
+          <w:color w:val="FF00FF"/>
+          <w:sz w:val="20"/>
+          <w:szCs w:val="20"/>
+          <w:shd w:val="clear" w:color="auto" w:fill="E5E5E5"/>
+        </w:rPr>
+        <w:t>*</w:t>
+      </w:r>
+      <w:r>
+        <w:rPr>
+          <w:rStyle w:val="cm-bracket"/>
+          <w:rFonts w:ascii="Courier New" w:hAnsi="Courier New" w:cs="Courier New"/>
+          <w:color w:val="999977"/>
+          <w:sz w:val="20"/>
+          <w:szCs w:val="20"/>
+          <w:shd w:val="clear" w:color="auto" w:fill="E5E5E5"/>
+        </w:rPr>
+        <w:t>)</w:t>
+      </w:r>
+      <w:r>
+        <w:rPr>
+          <w:rFonts w:ascii="Courier New" w:hAnsi="Courier New" w:cs="Courier New"/>
+          <w:color w:val="444444"/>
+          <w:sz w:val="20"/>
+          <w:szCs w:val="20"/>
+          <w:shd w:val="clear" w:color="auto" w:fill="E5E5E5"/>
+        </w:rPr>
+        <w:t> </w:t>
+      </w:r>
+      <w:r>
+        <w:rPr>
+          <w:rStyle w:val="cm-keyword"/>
+          <w:rFonts w:ascii="Courier New" w:hAnsi="Courier New" w:cs="Courier New"/>
+          <w:color w:val="770088"/>
+          <w:sz w:val="20"/>
+          <w:szCs w:val="20"/>
+          <w:shd w:val="clear" w:color="auto" w:fill="E5E5E5"/>
+        </w:rPr>
+        <w:t>AS</w:t>
+      </w:r>
+      <w:r>
+        <w:rPr>
+          <w:rFonts w:ascii="Courier New" w:hAnsi="Courier New" w:cs="Courier New"/>
+          <w:color w:val="444444"/>
+          <w:sz w:val="20"/>
+          <w:szCs w:val="20"/>
+          <w:shd w:val="clear" w:color="auto" w:fill="E5E5E5"/>
+        </w:rPr>
+        <w:t> movie_count </w:t>
+      </w:r>
+      <w:r>
+        <w:rPr>
+          <w:rStyle w:val="cm-keyword"/>
+          <w:rFonts w:ascii="Courier New" w:hAnsi="Courier New" w:cs="Courier New"/>
+          <w:color w:val="770088"/>
+          <w:sz w:val="20"/>
+          <w:szCs w:val="20"/>
+          <w:shd w:val="clear" w:color="auto" w:fill="E5E5E5"/>
+        </w:rPr>
+        <w:t>FROM</w:t>
+      </w:r>
+      <w:r>
+        <w:rPr>
+          <w:rFonts w:ascii="Courier New" w:hAnsi="Courier New" w:cs="Courier New"/>
+          <w:color w:val="444444"/>
+          <w:sz w:val="20"/>
+          <w:szCs w:val="20"/>
+          <w:shd w:val="clear" w:color="auto" w:fill="E5E5E5"/>
+        </w:rPr>
+        <w:t> imdb_movie_data </w:t>
+      </w:r>
+      <w:r>
+        <w:rPr>
+          <w:rStyle w:val="cm-keyword"/>
+          <w:rFonts w:ascii="Courier New" w:hAnsi="Courier New" w:cs="Courier New"/>
+          <w:color w:val="770088"/>
+          <w:sz w:val="20"/>
+          <w:szCs w:val="20"/>
+          <w:shd w:val="clear" w:color="auto" w:fill="E5E5E5"/>
+        </w:rPr>
+        <w:t>GROUP</w:t>
+      </w:r>
+      <w:r>
+        <w:rPr>
+          <w:rFonts w:ascii="Courier New" w:hAnsi="Courier New" w:cs="Courier New"/>
+          <w:color w:val="444444"/>
+          <w:sz w:val="20"/>
+          <w:szCs w:val="20"/>
+          <w:shd w:val="clear" w:color="auto" w:fill="E5E5E5"/>
+        </w:rPr>
+        <w:t> </w:t>
+      </w:r>
+      <w:r>
+        <w:rPr>
+          <w:rStyle w:val="cm-keyword"/>
+          <w:rFonts w:ascii="Courier New" w:hAnsi="Courier New" w:cs="Courier New"/>
+          <w:color w:val="770088"/>
+          <w:sz w:val="20"/>
+          <w:szCs w:val="20"/>
+          <w:shd w:val="clear" w:color="auto" w:fill="E5E5E5"/>
+        </w:rPr>
+        <w:t>BY</w:t>
+      </w:r>
+      <w:r>
+        <w:rPr>
+          <w:rFonts w:ascii="Courier New" w:hAnsi="Courier New" w:cs="Courier New"/>
+          <w:color w:val="444444"/>
+          <w:sz w:val="20"/>
+          <w:szCs w:val="20"/>
+          <w:shd w:val="clear" w:color="auto" w:fill="E5E5E5"/>
+        </w:rPr>
+        <w:t> main_actor </w:t>
+      </w:r>
+      <w:r>
+        <w:rPr>
+          <w:rStyle w:val="cm-bracket"/>
+          <w:rFonts w:ascii="Courier New" w:hAnsi="Courier New" w:cs="Courier New"/>
+          <w:color w:val="999977"/>
+          <w:sz w:val="20"/>
+          <w:szCs w:val="20"/>
+          <w:shd w:val="clear" w:color="auto" w:fill="E5E5E5"/>
+        </w:rPr>
+        <w:t>)</w:t>
+      </w:r>
+      <w:r>
+        <w:rPr>
+          <w:rFonts w:ascii="Courier New" w:hAnsi="Courier New" w:cs="Courier New"/>
+          <w:color w:val="444444"/>
+          <w:sz w:val="20"/>
+          <w:szCs w:val="20"/>
+          <w:shd w:val="clear" w:color="auto" w:fill="E5E5E5"/>
+        </w:rPr>
+        <w:t> t</w:t>
+      </w:r>
+      <w:r>
+        <w:rPr>
+          <w:rStyle w:val="cm-punctuation"/>
+          <w:rFonts w:ascii="Courier New" w:hAnsi="Courier New" w:cs="Courier New"/>
+          <w:color w:val="444444"/>
+          <w:sz w:val="20"/>
+          <w:szCs w:val="20"/>
+          <w:shd w:val="clear" w:color="auto" w:fill="E5E5E5"/>
+        </w:rPr>
+        <w:t>;</w:t>
+      </w:r>
+    </w:p>
+    <w:p>
+      <w:pPr>
+        <w:rPr>
+          <w:sz w:val="24"/>
+          <w:szCs w:val="24"/>
+        </w:rPr>
+      </w:pPr>
+      <w:r>
+        <w:rPr>
+          <w:noProof/>
+          <w:sz w:val="24"/>
+          <w:szCs w:val="24"/>
+        </w:rPr>
+        <w:drawing>
+          <wp:inline distT="0" distB="0" distL="0" distR="0" wp14:anchorId="51E9D6D1" wp14:editId="01D6C30D">
+            <wp:extent cx="5731510" cy="2456180"/>
+            <wp:effectExtent l="0" t="0" r="2540" b="1270"/>
+            <wp:docPr id="1213078126" name="Picture 1"/>
+            <wp:cNvGraphicFramePr>
+              <a:graphicFrameLocks xmlns:a="http://schemas.openxmlformats.org/drawingml/2006/main" noChangeAspect="1"/>
+            </wp:cNvGraphicFramePr>
+            <a:graphic xmlns:a="http://schemas.openxmlformats.org/drawingml/2006/main">
+              <a:graphicData uri="http://schemas.openxmlformats.org/drawingml/2006/picture">
+                <pic:pic xmlns:pic="http://schemas.openxmlformats.org/drawingml/2006/picture">
+                  <pic:nvPicPr>
+                    <pic:cNvPr id="0" name="Picture 1"/>
+                    <pic:cNvPicPr>
+                      <a:picLocks noChangeAspect="1" noChangeArrowheads="1"/>
+                    </pic:cNvPicPr>
+                  </pic:nvPicPr>
+                  <pic:blipFill>
+                    <a:blip r:embed="rId38">
+                      <a:extLst>
+                        <a:ext uri="{28A0092B-C50C-407E-A947-70E740481C1C}">
+                          <a14:useLocalDpi xmlns:a14="http://schemas.microsoft.com/office/drawing/2010/main" val="0"/>
+                        </a:ext>
+                      </a:extLst>
+                    </a:blip>
+                    <a:srcRect/>
+                    <a:stretch>
+                      <a:fillRect/>
+                    </a:stretch>
+                  </pic:blipFill>
+                  <pic:spPr bwMode="auto">
+                    <a:xfrm>
+                      <a:off x="0" y="0"/>
+                      <a:ext cx="5731510" cy="2456180"/>
                     </a:xfrm>
                     <a:prstGeom prst="rect">
                       <a:avLst/>

</xml_diff>

<commit_message>
IMDB SQL TABLE ANALYSIS 15-01-2026
IMDB SQL TABLE ANALYSIS 15-01-2026
</commit_message>
<xml_diff>
--- a/IMDB SQL TABLE ANALYSIS.docx
+++ b/IMDB SQL TABLE ANALYSIS.docx
@@ -257,6 +257,7 @@
         </w:rPr>
         <w:t>(</w:t>
       </w:r>
+      <w:proofErr w:type="spellStart"/>
       <w:r>
         <w:rPr>
           <w:rFonts w:ascii="Courier New" w:hAnsi="Courier New" w:cs="Courier New"/>
@@ -267,6 +268,7 @@
         </w:rPr>
         <w:t>revenue_millions</w:t>
       </w:r>
+      <w:proofErr w:type="spellEnd"/>
       <w:r>
         <w:rPr>
           <w:rStyle w:val="cm-bracket"/>
@@ -330,77 +332,6 @@
           <w:shd w:val="clear" w:color="auto" w:fill="E5E5E5"/>
         </w:rPr>
         <w:t>;</w:t>
-      </w:r>
-    </w:p>
-    <w:p>
-      <w:pPr>
-        <w:rPr>
-          <w:rStyle w:val="cm-punctuation"/>
-          <w:rFonts w:ascii="Courier New" w:hAnsi="Courier New" w:cs="Courier New"/>
-          <w:color w:val="444444"/>
-          <w:sz w:val="20"/>
-          <w:szCs w:val="20"/>
-          <w:shd w:val="clear" w:color="auto" w:fill="E5E5E5"/>
-        </w:rPr>
-      </w:pPr>
-      <w:r>
-        <w:rPr>
-          <w:rStyle w:val="cm-punctuation"/>
-          <w:rFonts w:ascii="Courier New" w:hAnsi="Courier New" w:cs="Courier New"/>
-          <w:noProof/>
-          <w:color w:val="444444"/>
-          <w:sz w:val="20"/>
-          <w:szCs w:val="20"/>
-          <w:shd w:val="clear" w:color="auto" w:fill="E5E5E5"/>
-        </w:rPr>
-        <w:drawing>
-          <wp:inline distT="0" distB="0" distL="0" distR="0" wp14:anchorId="7C476F79" wp14:editId="786EAB7A">
-            <wp:extent cx="5724525" cy="1409700"/>
-            <wp:effectExtent l="0" t="0" r="9525" b="0"/>
-            <wp:docPr id="236776108" name="Picture 6"/>
-            <wp:cNvGraphicFramePr>
-              <a:graphicFrameLocks xmlns:a="http://schemas.openxmlformats.org/drawingml/2006/main" noChangeAspect="1"/>
-            </wp:cNvGraphicFramePr>
-            <a:graphic xmlns:a="http://schemas.openxmlformats.org/drawingml/2006/main">
-              <a:graphicData uri="http://schemas.openxmlformats.org/drawingml/2006/picture">
-                <pic:pic xmlns:pic="http://schemas.openxmlformats.org/drawingml/2006/picture">
-                  <pic:nvPicPr>
-                    <pic:cNvPr id="0" name="Picture 6"/>
-                    <pic:cNvPicPr>
-                      <a:picLocks noChangeAspect="1" noChangeArrowheads="1"/>
-                    </pic:cNvPicPr>
-                  </pic:nvPicPr>
-                  <pic:blipFill>
-                    <a:blip r:embed="rId8">
-                      <a:extLst>
-                        <a:ext uri="{28A0092B-C50C-407E-A947-70E740481C1C}">
-                          <a14:useLocalDpi xmlns:a14="http://schemas.microsoft.com/office/drawing/2010/main" val="0"/>
-                        </a:ext>
-                      </a:extLst>
-                    </a:blip>
-                    <a:srcRect/>
-                    <a:stretch>
-                      <a:fillRect/>
-                    </a:stretch>
-                  </pic:blipFill>
-                  <pic:spPr bwMode="auto">
-                    <a:xfrm>
-                      <a:off x="0" y="0"/>
-                      <a:ext cx="5724525" cy="1409700"/>
-                    </a:xfrm>
-                    <a:prstGeom prst="rect">
-                      <a:avLst/>
-                    </a:prstGeom>
-                    <a:noFill/>
-                    <a:ln>
-                      <a:noFill/>
-                    </a:ln>
-                  </pic:spPr>
-                </pic:pic>
-              </a:graphicData>
-            </a:graphic>
-          </wp:inline>
-        </w:drawing>
       </w:r>
     </w:p>
     <w:p>
@@ -426,7 +357,6 @@
     <w:p>
       <w:pPr>
         <w:rPr>
-          <w:rStyle w:val="cm-punctuation"/>
           <w:rFonts w:ascii="Courier New" w:hAnsi="Courier New" w:cs="Courier New"/>
           <w:color w:val="444444"/>
           <w:sz w:val="20"/>
@@ -434,7 +364,7 @@
           <w:shd w:val="clear" w:color="auto" w:fill="E5E5E5"/>
         </w:rPr>
       </w:pPr>
-      <w:hyperlink r:id="rId9" w:tgtFrame="mysql_doc" w:history="1">
+      <w:hyperlink r:id="rId8" w:tgtFrame="mysql_doc" w:history="1">
         <w:r>
           <w:rPr>
             <w:rStyle w:val="Hyperlink"/>
@@ -456,7 +386,7 @@
         </w:rPr>
         <w:t> </w:t>
       </w:r>
-      <w:hyperlink r:id="rId10" w:tgtFrame="mysql_doc" w:history="1">
+      <w:hyperlink r:id="rId9" w:tgtFrame="mysql_doc" w:history="1">
         <w:r>
           <w:rPr>
             <w:rStyle w:val="Hyperlink"/>
@@ -574,7 +504,7 @@
         </w:rPr>
         <w:t> metascore </w:t>
       </w:r>
-      <w:hyperlink r:id="rId11" w:tgtFrame="mysql_doc" w:history="1">
+      <w:hyperlink r:id="rId10" w:tgtFrame="mysql_doc" w:history="1">
         <w:r>
           <w:rPr>
             <w:rStyle w:val="Hyperlink"/>
@@ -617,7 +547,7 @@
         </w:rPr>
         <w:t> </w:t>
       </w:r>
-      <w:hyperlink r:id="rId12" w:tgtFrame="mysql_doc" w:history="1">
+      <w:hyperlink r:id="rId11" w:tgtFrame="mysql_doc" w:history="1">
         <w:r>
           <w:rPr>
             <w:rStyle w:val="Hyperlink"/>
@@ -650,6 +580,7 @@
         </w:rPr>
         <w:t>(</w:t>
       </w:r>
+      <w:proofErr w:type="spellStart"/>
       <w:r>
         <w:rPr>
           <w:rFonts w:ascii="Courier New" w:hAnsi="Courier New" w:cs="Courier New"/>
@@ -660,6 +591,7 @@
         </w:rPr>
         <w:t>metascore</w:t>
       </w:r>
+      <w:proofErr w:type="spellEnd"/>
       <w:r>
         <w:rPr>
           <w:rStyle w:val="cm-bracket"/>
@@ -723,89 +655,6 @@
           <w:shd w:val="clear" w:color="auto" w:fill="E5E5E5"/>
         </w:rPr>
         <w:t>;</w:t>
-      </w:r>
-    </w:p>
-    <w:p>
-      <w:pPr>
-        <w:rPr>
-          <w:rStyle w:val="cm-punctuation"/>
-          <w:rFonts w:ascii="Courier New" w:hAnsi="Courier New" w:cs="Courier New"/>
-          <w:color w:val="444444"/>
-          <w:sz w:val="20"/>
-          <w:szCs w:val="20"/>
-          <w:shd w:val="clear" w:color="auto" w:fill="E5E5E5"/>
-        </w:rPr>
-      </w:pPr>
-    </w:p>
-    <w:p>
-      <w:pPr>
-        <w:rPr>
-          <w:rStyle w:val="cm-punctuation"/>
-          <w:rFonts w:ascii="Courier New" w:hAnsi="Courier New" w:cs="Courier New"/>
-          <w:color w:val="444444"/>
-          <w:sz w:val="20"/>
-          <w:szCs w:val="20"/>
-          <w:shd w:val="clear" w:color="auto" w:fill="E5E5E5"/>
-        </w:rPr>
-      </w:pPr>
-      <w:r>
-        <w:rPr>
-          <w:rStyle w:val="cm-punctuation"/>
-          <w:rFonts w:ascii="Courier New" w:hAnsi="Courier New" w:cs="Courier New"/>
-          <w:noProof/>
-          <w:color w:val="444444"/>
-          <w:sz w:val="20"/>
-          <w:szCs w:val="20"/>
-          <w:shd w:val="clear" w:color="auto" w:fill="E5E5E5"/>
-        </w:rPr>
-        <w:drawing>
-          <wp:inline distT="0" distB="0" distL="0" distR="0" wp14:anchorId="331F4F61" wp14:editId="0F690A5D">
-            <wp:extent cx="5724525" cy="1543050"/>
-            <wp:effectExtent l="0" t="0" r="9525" b="0"/>
-            <wp:docPr id="529284799" name="Picture 7"/>
-            <wp:cNvGraphicFramePr>
-              <a:graphicFrameLocks xmlns:a="http://schemas.openxmlformats.org/drawingml/2006/main" noChangeAspect="1"/>
-            </wp:cNvGraphicFramePr>
-            <a:graphic xmlns:a="http://schemas.openxmlformats.org/drawingml/2006/main">
-              <a:graphicData uri="http://schemas.openxmlformats.org/drawingml/2006/picture">
-                <pic:pic xmlns:pic="http://schemas.openxmlformats.org/drawingml/2006/picture">
-                  <pic:nvPicPr>
-                    <pic:cNvPr id="0" name="Picture 7"/>
-                    <pic:cNvPicPr>
-                      <a:picLocks noChangeAspect="1" noChangeArrowheads="1"/>
-                    </pic:cNvPicPr>
-                  </pic:nvPicPr>
-                  <pic:blipFill>
-                    <a:blip r:embed="rId13">
-                      <a:extLst>
-                        <a:ext uri="{28A0092B-C50C-407E-A947-70E740481C1C}">
-                          <a14:useLocalDpi xmlns:a14="http://schemas.microsoft.com/office/drawing/2010/main" val="0"/>
-                        </a:ext>
-                      </a:extLst>
-                    </a:blip>
-                    <a:srcRect/>
-                    <a:stretch>
-                      <a:fillRect/>
-                    </a:stretch>
-                  </pic:blipFill>
-                  <pic:spPr bwMode="auto">
-                    <a:xfrm>
-                      <a:off x="0" y="0"/>
-                      <a:ext cx="5724525" cy="1543050"/>
-                    </a:xfrm>
-                    <a:prstGeom prst="rect">
-                      <a:avLst/>
-                    </a:prstGeom>
-                    <a:noFill/>
-                    <a:ln>
-                      <a:noFill/>
-                    </a:ln>
-                  </pic:spPr>
-                </pic:pic>
-              </a:graphicData>
-            </a:graphic>
-          </wp:inline>
-        </w:drawing>
       </w:r>
     </w:p>
     <w:p>
@@ -817,23 +666,13 @@
           <w:szCs w:val="24"/>
         </w:rPr>
       </w:pPr>
-    </w:p>
-    <w:p>
-      <w:pPr>
+      <w:r>
         <w:rPr>
           <w:b/>
           <w:bCs/>
           <w:sz w:val="24"/>
           <w:szCs w:val="24"/>
         </w:rPr>
-      </w:pPr>
-      <w:r>
-        <w:rPr>
-          <w:b/>
-          <w:bCs/>
-          <w:sz w:val="24"/>
-          <w:szCs w:val="24"/>
-        </w:rPr>
         <w:t>#TOP 10 MOVIES BY THEIR RATINGS</w:t>
       </w:r>
     </w:p>
@@ -844,7 +683,7 @@
           <w:szCs w:val="24"/>
         </w:rPr>
       </w:pPr>
-      <w:hyperlink r:id="rId14" w:tgtFrame="mysql_doc" w:history="1">
+      <w:hyperlink r:id="rId12" w:tgtFrame="mysql_doc" w:history="1">
         <w:r>
           <w:rPr>
             <w:rStyle w:val="Hyperlink"/>
@@ -887,7 +726,7 @@
         </w:rPr>
         <w:t> </w:t>
       </w:r>
-      <w:hyperlink r:id="rId15" w:tgtFrame="mysql_doc" w:history="1">
+      <w:hyperlink r:id="rId13" w:tgtFrame="mysql_doc" w:history="1">
         <w:r>
           <w:rPr>
             <w:rStyle w:val="Hyperlink"/>
@@ -1184,69 +1023,6 @@
         </w:rPr>
         <w:t>;</w:t>
       </w:r>
-      <w:r>
-        <w:rPr>
-          <w:noProof/>
-          <w:sz w:val="24"/>
-          <w:szCs w:val="24"/>
-        </w:rPr>
-        <w:drawing>
-          <wp:inline distT="0" distB="0" distL="0" distR="0" wp14:anchorId="2EE136C3" wp14:editId="364D408E">
-            <wp:extent cx="5724525" cy="2590800"/>
-            <wp:effectExtent l="0" t="0" r="9525" b="0"/>
-            <wp:docPr id="1497319817" name="Picture 2"/>
-            <wp:cNvGraphicFramePr>
-              <a:graphicFrameLocks xmlns:a="http://schemas.openxmlformats.org/drawingml/2006/main" noChangeAspect="1"/>
-            </wp:cNvGraphicFramePr>
-            <a:graphic xmlns:a="http://schemas.openxmlformats.org/drawingml/2006/main">
-              <a:graphicData uri="http://schemas.openxmlformats.org/drawingml/2006/picture">
-                <pic:pic xmlns:pic="http://schemas.openxmlformats.org/drawingml/2006/picture">
-                  <pic:nvPicPr>
-                    <pic:cNvPr id="0" name="Picture 2"/>
-                    <pic:cNvPicPr>
-                      <a:picLocks noChangeAspect="1" noChangeArrowheads="1"/>
-                    </pic:cNvPicPr>
-                  </pic:nvPicPr>
-                  <pic:blipFill>
-                    <a:blip r:embed="rId16">
-                      <a:extLst>
-                        <a:ext uri="{28A0092B-C50C-407E-A947-70E740481C1C}">
-                          <a14:useLocalDpi xmlns:a14="http://schemas.microsoft.com/office/drawing/2010/main" val="0"/>
-                        </a:ext>
-                      </a:extLst>
-                    </a:blip>
-                    <a:srcRect/>
-                    <a:stretch>
-                      <a:fillRect/>
-                    </a:stretch>
-                  </pic:blipFill>
-                  <pic:spPr bwMode="auto">
-                    <a:xfrm>
-                      <a:off x="0" y="0"/>
-                      <a:ext cx="5724525" cy="2590800"/>
-                    </a:xfrm>
-                    <a:prstGeom prst="rect">
-                      <a:avLst/>
-                    </a:prstGeom>
-                    <a:noFill/>
-                    <a:ln>
-                      <a:noFill/>
-                    </a:ln>
-                  </pic:spPr>
-                </pic:pic>
-              </a:graphicData>
-            </a:graphic>
-          </wp:inline>
-        </w:drawing>
-      </w:r>
-    </w:p>
-    <w:p>
-      <w:pPr>
-        <w:rPr>
-          <w:sz w:val="24"/>
-          <w:szCs w:val="24"/>
-        </w:rPr>
-      </w:pPr>
     </w:p>
     <w:p>
       <w:pPr>
@@ -1264,7 +1040,6 @@
           <w:sz w:val="24"/>
           <w:szCs w:val="24"/>
         </w:rPr>
-        <w:lastRenderedPageBreak/>
         <w:t xml:space="preserve">#TOP </w:t>
       </w:r>
       <w:r>
@@ -1296,7 +1071,7 @@
           <w:shd w:val="clear" w:color="auto" w:fill="E5E5E5"/>
         </w:rPr>
       </w:pPr>
-      <w:hyperlink r:id="rId17" w:tgtFrame="mysql_doc" w:history="1">
+      <w:hyperlink r:id="rId14" w:tgtFrame="mysql_doc" w:history="1">
         <w:r>
           <w:rPr>
             <w:rFonts w:ascii="Courier New" w:hAnsi="Courier New" w:cs="Courier New"/>
@@ -1319,7 +1094,7 @@
         </w:rPr>
         <w:t> title, </w:t>
       </w:r>
-      <w:hyperlink r:id="rId18" w:tgtFrame="mysql_doc" w:history="1">
+      <w:hyperlink r:id="rId15" w:tgtFrame="mysql_doc" w:history="1">
         <w:r>
           <w:rPr>
             <w:rFonts w:ascii="Courier New" w:hAnsi="Courier New" w:cs="Courier New"/>
@@ -1616,85 +1391,21 @@
     <w:p>
       <w:pPr>
         <w:rPr>
-          <w:sz w:val="24"/>
-          <w:szCs w:val="24"/>
-        </w:rPr>
-      </w:pPr>
-      <w:r>
-        <w:rPr>
-          <w:noProof/>
-          <w:sz w:val="24"/>
-          <w:szCs w:val="24"/>
-        </w:rPr>
-        <w:drawing>
-          <wp:inline distT="0" distB="0" distL="0" distR="0" wp14:anchorId="3BDB231C" wp14:editId="17E8077B">
-            <wp:extent cx="5724525" cy="2000250"/>
-            <wp:effectExtent l="0" t="0" r="9525" b="0"/>
-            <wp:docPr id="335091489" name="Picture 2"/>
-            <wp:cNvGraphicFramePr>
-              <a:graphicFrameLocks xmlns:a="http://schemas.openxmlformats.org/drawingml/2006/main" noChangeAspect="1"/>
-            </wp:cNvGraphicFramePr>
-            <a:graphic xmlns:a="http://schemas.openxmlformats.org/drawingml/2006/main">
-              <a:graphicData uri="http://schemas.openxmlformats.org/drawingml/2006/picture">
-                <pic:pic xmlns:pic="http://schemas.openxmlformats.org/drawingml/2006/picture">
-                  <pic:nvPicPr>
-                    <pic:cNvPr id="0" name="Picture 2"/>
-                    <pic:cNvPicPr>
-                      <a:picLocks noChangeAspect="1" noChangeArrowheads="1"/>
-                    </pic:cNvPicPr>
-                  </pic:nvPicPr>
-                  <pic:blipFill>
-                    <a:blip r:embed="rId19">
-                      <a:extLst>
-                        <a:ext uri="{28A0092B-C50C-407E-A947-70E740481C1C}">
-                          <a14:useLocalDpi xmlns:a14="http://schemas.microsoft.com/office/drawing/2010/main" val="0"/>
-                        </a:ext>
-                      </a:extLst>
-                    </a:blip>
-                    <a:srcRect/>
-                    <a:stretch>
-                      <a:fillRect/>
-                    </a:stretch>
-                  </pic:blipFill>
-                  <pic:spPr bwMode="auto">
-                    <a:xfrm>
-                      <a:off x="0" y="0"/>
-                      <a:ext cx="5724525" cy="2000250"/>
-                    </a:xfrm>
-                    <a:prstGeom prst="rect">
-                      <a:avLst/>
-                    </a:prstGeom>
-                    <a:noFill/>
-                    <a:ln>
-                      <a:noFill/>
-                    </a:ln>
-                  </pic:spPr>
-                </pic:pic>
-              </a:graphicData>
-            </a:graphic>
-          </wp:inline>
-        </w:drawing>
-      </w:r>
-    </w:p>
-    <w:p>
-      <w:pPr>
-        <w:rPr>
           <w:b/>
           <w:bCs/>
           <w:sz w:val="24"/>
           <w:szCs w:val="24"/>
         </w:rPr>
       </w:pPr>
-    </w:p>
-    <w:p>
-      <w:pPr>
+      <w:r>
         <w:rPr>
           <w:b/>
           <w:bCs/>
           <w:sz w:val="24"/>
           <w:szCs w:val="24"/>
         </w:rPr>
-      </w:pPr>
+        <w:t>#</w:t>
+      </w:r>
       <w:r>
         <w:rPr>
           <w:b/>
@@ -1702,16 +1413,454 @@
           <w:sz w:val="24"/>
           <w:szCs w:val="24"/>
         </w:rPr>
-        <w:t>#</w:t>
-      </w:r>
-      <w:r>
+        <w:t>GENRE WISE MOVIES COUNT</w:t>
+      </w:r>
+    </w:p>
+    <w:p>
+      <w:pPr>
         <w:rPr>
           <w:b/>
           <w:bCs/>
           <w:sz w:val="24"/>
           <w:szCs w:val="24"/>
         </w:rPr>
-        <w:t>GENRE WISE MOVIES COUNT</w:t>
+      </w:pPr>
+      <w:hyperlink r:id="rId16" w:tgtFrame="mysql_doc" w:history="1">
+        <w:r>
+          <w:rPr>
+            <w:rStyle w:val="Hyperlink"/>
+            <w:rFonts w:ascii="Courier New" w:hAnsi="Courier New" w:cs="Courier New"/>
+            <w:sz w:val="20"/>
+            <w:szCs w:val="20"/>
+            <w:shd w:val="clear" w:color="auto" w:fill="E5E5E5"/>
+          </w:rPr>
+          <w:t>SELECT</w:t>
+        </w:r>
+      </w:hyperlink>
+      <w:r>
+        <w:rPr>
+          <w:rFonts w:ascii="Courier New" w:hAnsi="Courier New" w:cs="Courier New"/>
+          <w:color w:val="444444"/>
+          <w:sz w:val="20"/>
+          <w:szCs w:val="20"/>
+          <w:shd w:val="clear" w:color="auto" w:fill="E5E5E5"/>
+        </w:rPr>
+        <w:t> TRIM</w:t>
+      </w:r>
+      <w:r>
+        <w:rPr>
+          <w:rStyle w:val="cm-bracket"/>
+          <w:rFonts w:ascii="Courier New" w:hAnsi="Courier New" w:cs="Courier New"/>
+          <w:color w:val="999977"/>
+          <w:sz w:val="20"/>
+          <w:szCs w:val="20"/>
+          <w:shd w:val="clear" w:color="auto" w:fill="E5E5E5"/>
+        </w:rPr>
+        <w:t>(</w:t>
+      </w:r>
+      <w:r>
+        <w:rPr>
+          <w:rFonts w:ascii="Courier New" w:hAnsi="Courier New" w:cs="Courier New"/>
+          <w:color w:val="444444"/>
+          <w:sz w:val="20"/>
+          <w:szCs w:val="20"/>
+          <w:shd w:val="clear" w:color="auto" w:fill="E5E5E5"/>
+        </w:rPr>
+        <w:t>SUBSTRING_INDEX</w:t>
+      </w:r>
+      <w:r>
+        <w:rPr>
+          <w:rStyle w:val="cm-bracket"/>
+          <w:rFonts w:ascii="Courier New" w:hAnsi="Courier New" w:cs="Courier New"/>
+          <w:color w:val="999977"/>
+          <w:sz w:val="20"/>
+          <w:szCs w:val="20"/>
+          <w:shd w:val="clear" w:color="auto" w:fill="E5E5E5"/>
+        </w:rPr>
+        <w:t>(</w:t>
+      </w:r>
+      <w:r>
+        <w:rPr>
+          <w:rFonts w:ascii="Courier New" w:hAnsi="Courier New" w:cs="Courier New"/>
+          <w:color w:val="444444"/>
+          <w:sz w:val="20"/>
+          <w:szCs w:val="20"/>
+          <w:shd w:val="clear" w:color="auto" w:fill="E5E5E5"/>
+        </w:rPr>
+        <w:t>genre</w:t>
+      </w:r>
+      <w:r>
+        <w:rPr>
+          <w:rStyle w:val="cm-punctuation"/>
+          <w:rFonts w:ascii="Courier New" w:hAnsi="Courier New" w:cs="Courier New"/>
+          <w:color w:val="444444"/>
+          <w:sz w:val="20"/>
+          <w:szCs w:val="20"/>
+          <w:shd w:val="clear" w:color="auto" w:fill="E5E5E5"/>
+        </w:rPr>
+        <w:t>,</w:t>
+      </w:r>
+      <w:r>
+        <w:rPr>
+          <w:rFonts w:ascii="Courier New" w:hAnsi="Courier New" w:cs="Courier New"/>
+          <w:color w:val="444444"/>
+          <w:sz w:val="20"/>
+          <w:szCs w:val="20"/>
+          <w:shd w:val="clear" w:color="auto" w:fill="E5E5E5"/>
+        </w:rPr>
+        <w:t> </w:t>
+      </w:r>
+      <w:r>
+        <w:rPr>
+          <w:rStyle w:val="cm-string"/>
+          <w:rFonts w:ascii="Courier New" w:hAnsi="Courier New" w:cs="Courier New"/>
+          <w:color w:val="AA1111"/>
+          <w:sz w:val="20"/>
+          <w:szCs w:val="20"/>
+          <w:shd w:val="clear" w:color="auto" w:fill="E5E5E5"/>
+        </w:rPr>
+        <w:t>','</w:t>
+      </w:r>
+      <w:r>
+        <w:rPr>
+          <w:rStyle w:val="cm-punctuation"/>
+          <w:rFonts w:ascii="Courier New" w:hAnsi="Courier New" w:cs="Courier New"/>
+          <w:color w:val="444444"/>
+          <w:sz w:val="20"/>
+          <w:szCs w:val="20"/>
+          <w:shd w:val="clear" w:color="auto" w:fill="E5E5E5"/>
+        </w:rPr>
+        <w:t>,</w:t>
+      </w:r>
+      <w:r>
+        <w:rPr>
+          <w:rFonts w:ascii="Courier New" w:hAnsi="Courier New" w:cs="Courier New"/>
+          <w:color w:val="444444"/>
+          <w:sz w:val="20"/>
+          <w:szCs w:val="20"/>
+          <w:shd w:val="clear" w:color="auto" w:fill="E5E5E5"/>
+        </w:rPr>
+        <w:t> </w:t>
+      </w:r>
+      <w:r>
+        <w:rPr>
+          <w:rStyle w:val="cm-number"/>
+          <w:rFonts w:ascii="Courier New" w:hAnsi="Courier New" w:cs="Courier New"/>
+          <w:color w:val="116644"/>
+          <w:sz w:val="20"/>
+          <w:szCs w:val="20"/>
+          <w:shd w:val="clear" w:color="auto" w:fill="E5E5E5"/>
+        </w:rPr>
+        <w:t>1</w:t>
+      </w:r>
+      <w:r>
+        <w:rPr>
+          <w:rStyle w:val="cm-bracket"/>
+          <w:rFonts w:ascii="Courier New" w:hAnsi="Courier New" w:cs="Courier New"/>
+          <w:color w:val="999977"/>
+          <w:sz w:val="20"/>
+          <w:szCs w:val="20"/>
+          <w:shd w:val="clear" w:color="auto" w:fill="E5E5E5"/>
+        </w:rPr>
+        <w:t>))</w:t>
+      </w:r>
+      <w:r>
+        <w:rPr>
+          <w:rFonts w:ascii="Courier New" w:hAnsi="Courier New" w:cs="Courier New"/>
+          <w:color w:val="444444"/>
+          <w:sz w:val="20"/>
+          <w:szCs w:val="20"/>
+          <w:shd w:val="clear" w:color="auto" w:fill="E5E5E5"/>
+        </w:rPr>
+        <w:t> </w:t>
+      </w:r>
+      <w:r>
+        <w:rPr>
+          <w:rStyle w:val="cm-keyword"/>
+          <w:rFonts w:ascii="Courier New" w:hAnsi="Courier New" w:cs="Courier New"/>
+          <w:color w:val="770088"/>
+          <w:sz w:val="20"/>
+          <w:szCs w:val="20"/>
+          <w:shd w:val="clear" w:color="auto" w:fill="E5E5E5"/>
+        </w:rPr>
+        <w:t>AS</w:t>
+      </w:r>
+      <w:r>
+        <w:rPr>
+          <w:rFonts w:ascii="Courier New" w:hAnsi="Courier New" w:cs="Courier New"/>
+          <w:color w:val="444444"/>
+          <w:sz w:val="20"/>
+          <w:szCs w:val="20"/>
+          <w:shd w:val="clear" w:color="auto" w:fill="E5E5E5"/>
+        </w:rPr>
+        <w:t> main_genre</w:t>
+      </w:r>
+      <w:r>
+        <w:rPr>
+          <w:rStyle w:val="cm-punctuation"/>
+          <w:rFonts w:ascii="Courier New" w:hAnsi="Courier New" w:cs="Courier New"/>
+          <w:color w:val="444444"/>
+          <w:sz w:val="20"/>
+          <w:szCs w:val="20"/>
+          <w:shd w:val="clear" w:color="auto" w:fill="E5E5E5"/>
+        </w:rPr>
+        <w:t>,</w:t>
+      </w:r>
+      <w:r>
+        <w:rPr>
+          <w:rFonts w:ascii="Courier New" w:hAnsi="Courier New" w:cs="Courier New"/>
+          <w:color w:val="444444"/>
+          <w:sz w:val="20"/>
+          <w:szCs w:val="20"/>
+          <w:shd w:val="clear" w:color="auto" w:fill="E5E5E5"/>
+        </w:rPr>
+        <w:t> </w:t>
+      </w:r>
+      <w:hyperlink r:id="rId17" w:tgtFrame="mysql_doc" w:history="1">
+        <w:r>
+          <w:rPr>
+            <w:rStyle w:val="Hyperlink"/>
+            <w:rFonts w:ascii="Courier New" w:hAnsi="Courier New" w:cs="Courier New"/>
+            <w:sz w:val="20"/>
+            <w:szCs w:val="20"/>
+            <w:shd w:val="clear" w:color="auto" w:fill="E5E5E5"/>
+          </w:rPr>
+          <w:t>COUNT</w:t>
+        </w:r>
+      </w:hyperlink>
+      <w:r>
+        <w:rPr>
+          <w:rStyle w:val="cm-bracket"/>
+          <w:rFonts w:ascii="Courier New" w:hAnsi="Courier New" w:cs="Courier New"/>
+          <w:color w:val="999977"/>
+          <w:sz w:val="20"/>
+          <w:szCs w:val="20"/>
+          <w:shd w:val="clear" w:color="auto" w:fill="E5E5E5"/>
+        </w:rPr>
+        <w:t>(</w:t>
+      </w:r>
+      <w:r>
+        <w:rPr>
+          <w:rStyle w:val="cm-operator"/>
+          <w:rFonts w:ascii="Courier New" w:hAnsi="Courier New" w:cs="Courier New"/>
+          <w:color w:val="FF00FF"/>
+          <w:sz w:val="20"/>
+          <w:szCs w:val="20"/>
+          <w:shd w:val="clear" w:color="auto" w:fill="E5E5E5"/>
+        </w:rPr>
+        <w:t>*</w:t>
+      </w:r>
+      <w:r>
+        <w:rPr>
+          <w:rStyle w:val="cm-bracket"/>
+          <w:rFonts w:ascii="Courier New" w:hAnsi="Courier New" w:cs="Courier New"/>
+          <w:color w:val="999977"/>
+          <w:sz w:val="20"/>
+          <w:szCs w:val="20"/>
+          <w:shd w:val="clear" w:color="auto" w:fill="E5E5E5"/>
+        </w:rPr>
+        <w:t>)</w:t>
+      </w:r>
+      <w:r>
+        <w:rPr>
+          <w:rFonts w:ascii="Courier New" w:hAnsi="Courier New" w:cs="Courier New"/>
+          <w:color w:val="444444"/>
+          <w:sz w:val="20"/>
+          <w:szCs w:val="20"/>
+          <w:shd w:val="clear" w:color="auto" w:fill="E5E5E5"/>
+        </w:rPr>
+        <w:t> </w:t>
+      </w:r>
+      <w:r>
+        <w:rPr>
+          <w:rStyle w:val="cm-keyword"/>
+          <w:rFonts w:ascii="Courier New" w:hAnsi="Courier New" w:cs="Courier New"/>
+          <w:color w:val="770088"/>
+          <w:sz w:val="20"/>
+          <w:szCs w:val="20"/>
+          <w:shd w:val="clear" w:color="auto" w:fill="E5E5E5"/>
+        </w:rPr>
+        <w:t>AS</w:t>
+      </w:r>
+      <w:r>
+        <w:rPr>
+          <w:rFonts w:ascii="Courier New" w:hAnsi="Courier New" w:cs="Courier New"/>
+          <w:color w:val="444444"/>
+          <w:sz w:val="20"/>
+          <w:szCs w:val="20"/>
+          <w:shd w:val="clear" w:color="auto" w:fill="E5E5E5"/>
+        </w:rPr>
+        <w:t> total_movies </w:t>
+      </w:r>
+      <w:r>
+        <w:rPr>
+          <w:rStyle w:val="cm-keyword"/>
+          <w:rFonts w:ascii="Courier New" w:hAnsi="Courier New" w:cs="Courier New"/>
+          <w:color w:val="770088"/>
+          <w:sz w:val="20"/>
+          <w:szCs w:val="20"/>
+          <w:shd w:val="clear" w:color="auto" w:fill="E5E5E5"/>
+        </w:rPr>
+        <w:t>FROM</w:t>
+      </w:r>
+      <w:r>
+        <w:rPr>
+          <w:rFonts w:ascii="Courier New" w:hAnsi="Courier New" w:cs="Courier New"/>
+          <w:color w:val="444444"/>
+          <w:sz w:val="20"/>
+          <w:szCs w:val="20"/>
+          <w:shd w:val="clear" w:color="auto" w:fill="E5E5E5"/>
+        </w:rPr>
+        <w:t> </w:t>
+      </w:r>
+      <w:r>
+        <w:rPr>
+          <w:rStyle w:val="cm-variable-2"/>
+          <w:rFonts w:ascii="Courier New" w:hAnsi="Courier New" w:cs="Courier New"/>
+          <w:color w:val="0055AA"/>
+          <w:sz w:val="20"/>
+          <w:szCs w:val="20"/>
+          <w:shd w:val="clear" w:color="auto" w:fill="E5E5E5"/>
+        </w:rPr>
+        <w:t>`imdb_movie_data`</w:t>
+      </w:r>
+      <w:r>
+        <w:rPr>
+          <w:rFonts w:ascii="Courier New" w:hAnsi="Courier New" w:cs="Courier New"/>
+          <w:color w:val="444444"/>
+          <w:sz w:val="20"/>
+          <w:szCs w:val="20"/>
+          <w:shd w:val="clear" w:color="auto" w:fill="E5E5E5"/>
+        </w:rPr>
+        <w:t> </w:t>
+      </w:r>
+      <w:r>
+        <w:rPr>
+          <w:rStyle w:val="cm-keyword"/>
+          <w:rFonts w:ascii="Courier New" w:hAnsi="Courier New" w:cs="Courier New"/>
+          <w:color w:val="770088"/>
+          <w:sz w:val="20"/>
+          <w:szCs w:val="20"/>
+          <w:shd w:val="clear" w:color="auto" w:fill="E5E5E5"/>
+        </w:rPr>
+        <w:t>GROUP</w:t>
+      </w:r>
+      <w:r>
+        <w:rPr>
+          <w:rFonts w:ascii="Courier New" w:hAnsi="Courier New" w:cs="Courier New"/>
+          <w:color w:val="444444"/>
+          <w:sz w:val="20"/>
+          <w:szCs w:val="20"/>
+          <w:shd w:val="clear" w:color="auto" w:fill="E5E5E5"/>
+        </w:rPr>
+        <w:t> </w:t>
+      </w:r>
+      <w:r>
+        <w:rPr>
+          <w:rStyle w:val="cm-keyword"/>
+          <w:rFonts w:ascii="Courier New" w:hAnsi="Courier New" w:cs="Courier New"/>
+          <w:color w:val="770088"/>
+          <w:sz w:val="20"/>
+          <w:szCs w:val="20"/>
+          <w:shd w:val="clear" w:color="auto" w:fill="E5E5E5"/>
+        </w:rPr>
+        <w:t>BY</w:t>
+      </w:r>
+      <w:r>
+        <w:rPr>
+          <w:rFonts w:ascii="Courier New" w:hAnsi="Courier New" w:cs="Courier New"/>
+          <w:color w:val="444444"/>
+          <w:sz w:val="20"/>
+          <w:szCs w:val="20"/>
+          <w:shd w:val="clear" w:color="auto" w:fill="E5E5E5"/>
+        </w:rPr>
+        <w:t> main_genre </w:t>
+      </w:r>
+      <w:r>
+        <w:rPr>
+          <w:rStyle w:val="cm-keyword"/>
+          <w:rFonts w:ascii="Courier New" w:hAnsi="Courier New" w:cs="Courier New"/>
+          <w:color w:val="770088"/>
+          <w:sz w:val="20"/>
+          <w:szCs w:val="20"/>
+          <w:shd w:val="clear" w:color="auto" w:fill="E5E5E5"/>
+        </w:rPr>
+        <w:t>ORDER</w:t>
+      </w:r>
+      <w:r>
+        <w:rPr>
+          <w:rFonts w:ascii="Courier New" w:hAnsi="Courier New" w:cs="Courier New"/>
+          <w:color w:val="444444"/>
+          <w:sz w:val="20"/>
+          <w:szCs w:val="20"/>
+          <w:shd w:val="clear" w:color="auto" w:fill="E5E5E5"/>
+        </w:rPr>
+        <w:t> </w:t>
+      </w:r>
+      <w:r>
+        <w:rPr>
+          <w:rStyle w:val="cm-keyword"/>
+          <w:rFonts w:ascii="Courier New" w:hAnsi="Courier New" w:cs="Courier New"/>
+          <w:color w:val="770088"/>
+          <w:sz w:val="20"/>
+          <w:szCs w:val="20"/>
+          <w:shd w:val="clear" w:color="auto" w:fill="E5E5E5"/>
+        </w:rPr>
+        <w:t>BY</w:t>
+      </w:r>
+      <w:r>
+        <w:rPr>
+          <w:rFonts w:ascii="Courier New" w:hAnsi="Courier New" w:cs="Courier New"/>
+          <w:color w:val="444444"/>
+          <w:sz w:val="20"/>
+          <w:szCs w:val="20"/>
+          <w:shd w:val="clear" w:color="auto" w:fill="E5E5E5"/>
+        </w:rPr>
+        <w:t> </w:t>
+      </w:r>
+      <w:proofErr w:type="spellStart"/>
+      <w:r>
+        <w:rPr>
+          <w:rFonts w:ascii="Courier New" w:hAnsi="Courier New" w:cs="Courier New"/>
+          <w:color w:val="444444"/>
+          <w:sz w:val="20"/>
+          <w:szCs w:val="20"/>
+          <w:shd w:val="clear" w:color="auto" w:fill="E5E5E5"/>
+        </w:rPr>
+        <w:t>total_movies</w:t>
+      </w:r>
+      <w:proofErr w:type="spellEnd"/>
+      <w:r>
+        <w:rPr>
+          <w:rFonts w:ascii="Courier New" w:hAnsi="Courier New" w:cs="Courier New"/>
+          <w:color w:val="444444"/>
+          <w:sz w:val="20"/>
+          <w:szCs w:val="20"/>
+          <w:shd w:val="clear" w:color="auto" w:fill="E5E5E5"/>
+        </w:rPr>
+        <w:t> </w:t>
+      </w:r>
+      <w:r>
+        <w:rPr>
+          <w:rStyle w:val="cm-keyword"/>
+          <w:rFonts w:ascii="Courier New" w:hAnsi="Courier New" w:cs="Courier New"/>
+          <w:color w:val="770088"/>
+          <w:sz w:val="20"/>
+          <w:szCs w:val="20"/>
+          <w:shd w:val="clear" w:color="auto" w:fill="E5E5E5"/>
+        </w:rPr>
+        <w:t>DESC</w:t>
+      </w:r>
+      <w:r>
+        <w:rPr>
+          <w:rStyle w:val="cm-punctuation"/>
+          <w:rFonts w:ascii="Courier New" w:hAnsi="Courier New" w:cs="Courier New"/>
+          <w:color w:val="444444"/>
+          <w:sz w:val="20"/>
+          <w:szCs w:val="20"/>
+          <w:shd w:val="clear" w:color="auto" w:fill="E5E5E5"/>
+        </w:rPr>
+        <w:t>;</w:t>
       </w:r>
     </w:p>
     <w:p>
@@ -1721,6 +1870,396 @@
           <w:bCs/>
           <w:sz w:val="24"/>
           <w:szCs w:val="24"/>
+        </w:rPr>
+      </w:pPr>
+      <w:r>
+        <w:rPr>
+          <w:b/>
+          <w:bCs/>
+          <w:sz w:val="24"/>
+          <w:szCs w:val="24"/>
+        </w:rPr>
+        <w:t>#DIRECTOR NAME WHO RELEASES MOST</w:t>
+      </w:r>
+    </w:p>
+    <w:p>
+      <w:pPr>
+        <w:rPr>
+          <w:rFonts w:ascii="Courier New" w:hAnsi="Courier New" w:cs="Courier New"/>
+          <w:color w:val="444444"/>
+          <w:sz w:val="20"/>
+          <w:szCs w:val="20"/>
+          <w:shd w:val="clear" w:color="auto" w:fill="E5E5E5"/>
+        </w:rPr>
+      </w:pPr>
+      <w:hyperlink r:id="rId18" w:tgtFrame="mysql_doc" w:history="1">
+        <w:r>
+          <w:rPr>
+            <w:rStyle w:val="Hyperlink"/>
+            <w:rFonts w:ascii="Courier New" w:hAnsi="Courier New" w:cs="Courier New"/>
+            <w:sz w:val="20"/>
+            <w:szCs w:val="20"/>
+            <w:shd w:val="clear" w:color="auto" w:fill="E5E5E5"/>
+          </w:rPr>
+          <w:t>SELECT</w:t>
+        </w:r>
+      </w:hyperlink>
+      <w:r>
+        <w:rPr>
+          <w:rFonts w:ascii="Courier New" w:hAnsi="Courier New" w:cs="Courier New"/>
+          <w:color w:val="444444"/>
+          <w:sz w:val="20"/>
+          <w:szCs w:val="20"/>
+          <w:shd w:val="clear" w:color="auto" w:fill="E5E5E5"/>
+        </w:rPr>
+        <w:t> director</w:t>
+      </w:r>
+      <w:r>
+        <w:rPr>
+          <w:rStyle w:val="cm-punctuation"/>
+          <w:rFonts w:ascii="Courier New" w:hAnsi="Courier New" w:cs="Courier New"/>
+          <w:color w:val="444444"/>
+          <w:sz w:val="20"/>
+          <w:szCs w:val="20"/>
+          <w:shd w:val="clear" w:color="auto" w:fill="E5E5E5"/>
+        </w:rPr>
+        <w:t>,</w:t>
+      </w:r>
+      <w:r>
+        <w:rPr>
+          <w:rFonts w:ascii="Courier New" w:hAnsi="Courier New" w:cs="Courier New"/>
+          <w:color w:val="444444"/>
+          <w:sz w:val="20"/>
+          <w:szCs w:val="20"/>
+          <w:shd w:val="clear" w:color="auto" w:fill="E5E5E5"/>
+        </w:rPr>
+        <w:t> </w:t>
+      </w:r>
+      <w:hyperlink r:id="rId19" w:tgtFrame="mysql_doc" w:history="1">
+        <w:r>
+          <w:rPr>
+            <w:rStyle w:val="Hyperlink"/>
+            <w:rFonts w:ascii="Courier New" w:hAnsi="Courier New" w:cs="Courier New"/>
+            <w:sz w:val="20"/>
+            <w:szCs w:val="20"/>
+            <w:shd w:val="clear" w:color="auto" w:fill="E5E5E5"/>
+          </w:rPr>
+          <w:t>COUNT</w:t>
+        </w:r>
+      </w:hyperlink>
+      <w:r>
+        <w:rPr>
+          <w:rStyle w:val="cm-bracket"/>
+          <w:rFonts w:ascii="Courier New" w:hAnsi="Courier New" w:cs="Courier New"/>
+          <w:color w:val="999977"/>
+          <w:sz w:val="20"/>
+          <w:szCs w:val="20"/>
+          <w:shd w:val="clear" w:color="auto" w:fill="E5E5E5"/>
+        </w:rPr>
+        <w:t>(</w:t>
+      </w:r>
+      <w:r>
+        <w:rPr>
+          <w:rFonts w:ascii="Courier New" w:hAnsi="Courier New" w:cs="Courier New"/>
+          <w:color w:val="444444"/>
+          <w:sz w:val="20"/>
+          <w:szCs w:val="20"/>
+          <w:shd w:val="clear" w:color="auto" w:fill="E5E5E5"/>
+        </w:rPr>
+        <w:t>director</w:t>
+      </w:r>
+      <w:r>
+        <w:rPr>
+          <w:rStyle w:val="cm-bracket"/>
+          <w:rFonts w:ascii="Courier New" w:hAnsi="Courier New" w:cs="Courier New"/>
+          <w:color w:val="999977"/>
+          <w:sz w:val="20"/>
+          <w:szCs w:val="20"/>
+          <w:shd w:val="clear" w:color="auto" w:fill="E5E5E5"/>
+        </w:rPr>
+        <w:t>)</w:t>
+      </w:r>
+      <w:r>
+        <w:rPr>
+          <w:rFonts w:ascii="Courier New" w:hAnsi="Courier New" w:cs="Courier New"/>
+          <w:color w:val="444444"/>
+          <w:sz w:val="20"/>
+          <w:szCs w:val="20"/>
+          <w:shd w:val="clear" w:color="auto" w:fill="E5E5E5"/>
+        </w:rPr>
+        <w:t> </w:t>
+      </w:r>
+      <w:r>
+        <w:rPr>
+          <w:rStyle w:val="cm-keyword"/>
+          <w:rFonts w:ascii="Courier New" w:hAnsi="Courier New" w:cs="Courier New"/>
+          <w:color w:val="770088"/>
+          <w:sz w:val="20"/>
+          <w:szCs w:val="20"/>
+          <w:shd w:val="clear" w:color="auto" w:fill="E5E5E5"/>
+        </w:rPr>
+        <w:t>AS</w:t>
+      </w:r>
+      <w:r>
+        <w:rPr>
+          <w:rFonts w:ascii="Courier New" w:hAnsi="Courier New" w:cs="Courier New"/>
+          <w:color w:val="444444"/>
+          <w:sz w:val="20"/>
+          <w:szCs w:val="20"/>
+          <w:shd w:val="clear" w:color="auto" w:fill="E5E5E5"/>
+        </w:rPr>
+        <w:t> director_count </w:t>
+      </w:r>
+      <w:r>
+        <w:rPr>
+          <w:rStyle w:val="cm-keyword"/>
+          <w:rFonts w:ascii="Courier New" w:hAnsi="Courier New" w:cs="Courier New"/>
+          <w:color w:val="770088"/>
+          <w:sz w:val="20"/>
+          <w:szCs w:val="20"/>
+          <w:shd w:val="clear" w:color="auto" w:fill="E5E5E5"/>
+        </w:rPr>
+        <w:t>FROM</w:t>
+      </w:r>
+      <w:r>
+        <w:rPr>
+          <w:rFonts w:ascii="Courier New" w:hAnsi="Courier New" w:cs="Courier New"/>
+          <w:color w:val="444444"/>
+          <w:sz w:val="20"/>
+          <w:szCs w:val="20"/>
+          <w:shd w:val="clear" w:color="auto" w:fill="E5E5E5"/>
+        </w:rPr>
+        <w:t> </w:t>
+      </w:r>
+      <w:r>
+        <w:rPr>
+          <w:rStyle w:val="cm-variable-2"/>
+          <w:rFonts w:ascii="Courier New" w:hAnsi="Courier New" w:cs="Courier New"/>
+          <w:color w:val="0055AA"/>
+          <w:sz w:val="20"/>
+          <w:szCs w:val="20"/>
+          <w:shd w:val="clear" w:color="auto" w:fill="E5E5E5"/>
+        </w:rPr>
+        <w:t>`imdb_movie_data`</w:t>
+      </w:r>
+      <w:r>
+        <w:rPr>
+          <w:rFonts w:ascii="Courier New" w:hAnsi="Courier New" w:cs="Courier New"/>
+          <w:color w:val="444444"/>
+          <w:sz w:val="20"/>
+          <w:szCs w:val="20"/>
+          <w:shd w:val="clear" w:color="auto" w:fill="E5E5E5"/>
+        </w:rPr>
+        <w:t> </w:t>
+      </w:r>
+      <w:r>
+        <w:rPr>
+          <w:rStyle w:val="cm-keyword"/>
+          <w:rFonts w:ascii="Courier New" w:hAnsi="Courier New" w:cs="Courier New"/>
+          <w:color w:val="770088"/>
+          <w:sz w:val="20"/>
+          <w:szCs w:val="20"/>
+          <w:shd w:val="clear" w:color="auto" w:fill="E5E5E5"/>
+        </w:rPr>
+        <w:t>GROUP</w:t>
+      </w:r>
+      <w:r>
+        <w:rPr>
+          <w:rFonts w:ascii="Courier New" w:hAnsi="Courier New" w:cs="Courier New"/>
+          <w:color w:val="444444"/>
+          <w:sz w:val="20"/>
+          <w:szCs w:val="20"/>
+          <w:shd w:val="clear" w:color="auto" w:fill="E5E5E5"/>
+        </w:rPr>
+        <w:t> </w:t>
+      </w:r>
+      <w:r>
+        <w:rPr>
+          <w:rStyle w:val="cm-keyword"/>
+          <w:rFonts w:ascii="Courier New" w:hAnsi="Courier New" w:cs="Courier New"/>
+          <w:color w:val="770088"/>
+          <w:sz w:val="20"/>
+          <w:szCs w:val="20"/>
+          <w:shd w:val="clear" w:color="auto" w:fill="E5E5E5"/>
+        </w:rPr>
+        <w:t>BY</w:t>
+      </w:r>
+      <w:r>
+        <w:rPr>
+          <w:rFonts w:ascii="Courier New" w:hAnsi="Courier New" w:cs="Courier New"/>
+          <w:color w:val="444444"/>
+          <w:sz w:val="20"/>
+          <w:szCs w:val="20"/>
+          <w:shd w:val="clear" w:color="auto" w:fill="E5E5E5"/>
+        </w:rPr>
+        <w:t> director </w:t>
+      </w:r>
+      <w:r>
+        <w:rPr>
+          <w:rStyle w:val="cm-keyword"/>
+          <w:rFonts w:ascii="Courier New" w:hAnsi="Courier New" w:cs="Courier New"/>
+          <w:color w:val="770088"/>
+          <w:sz w:val="20"/>
+          <w:szCs w:val="20"/>
+          <w:shd w:val="clear" w:color="auto" w:fill="E5E5E5"/>
+        </w:rPr>
+        <w:t>ORDER</w:t>
+      </w:r>
+      <w:r>
+        <w:rPr>
+          <w:rFonts w:ascii="Courier New" w:hAnsi="Courier New" w:cs="Courier New"/>
+          <w:color w:val="444444"/>
+          <w:sz w:val="20"/>
+          <w:szCs w:val="20"/>
+          <w:shd w:val="clear" w:color="auto" w:fill="E5E5E5"/>
+        </w:rPr>
+        <w:t> </w:t>
+      </w:r>
+      <w:r>
+        <w:rPr>
+          <w:rStyle w:val="cm-keyword"/>
+          <w:rFonts w:ascii="Courier New" w:hAnsi="Courier New" w:cs="Courier New"/>
+          <w:color w:val="770088"/>
+          <w:sz w:val="20"/>
+          <w:szCs w:val="20"/>
+          <w:shd w:val="clear" w:color="auto" w:fill="E5E5E5"/>
+        </w:rPr>
+        <w:t>BY</w:t>
+      </w:r>
+      <w:r>
+        <w:rPr>
+          <w:rFonts w:ascii="Courier New" w:hAnsi="Courier New" w:cs="Courier New"/>
+          <w:color w:val="444444"/>
+          <w:sz w:val="20"/>
+          <w:szCs w:val="20"/>
+          <w:shd w:val="clear" w:color="auto" w:fill="E5E5E5"/>
+        </w:rPr>
+        <w:t> director_count </w:t>
+      </w:r>
+      <w:r>
+        <w:rPr>
+          <w:rStyle w:val="cm-keyword"/>
+          <w:rFonts w:ascii="Courier New" w:hAnsi="Courier New" w:cs="Courier New"/>
+          <w:color w:val="770088"/>
+          <w:sz w:val="20"/>
+          <w:szCs w:val="20"/>
+          <w:shd w:val="clear" w:color="auto" w:fill="E5E5E5"/>
+        </w:rPr>
+        <w:t>DESC</w:t>
+      </w:r>
+      <w:r>
+        <w:rPr>
+          <w:rFonts w:ascii="Courier New" w:hAnsi="Courier New" w:cs="Courier New"/>
+          <w:color w:val="444444"/>
+          <w:sz w:val="20"/>
+          <w:szCs w:val="20"/>
+          <w:shd w:val="clear" w:color="auto" w:fill="E5E5E5"/>
+        </w:rPr>
+        <w:t> </w:t>
+      </w:r>
+      <w:r>
+        <w:rPr>
+          <w:rStyle w:val="cm-keyword"/>
+          <w:rFonts w:ascii="Courier New" w:hAnsi="Courier New" w:cs="Courier New"/>
+          <w:color w:val="770088"/>
+          <w:sz w:val="20"/>
+          <w:szCs w:val="20"/>
+          <w:shd w:val="clear" w:color="auto" w:fill="E5E5E5"/>
+        </w:rPr>
+        <w:t>LIMIT</w:t>
+      </w:r>
+      <w:r>
+        <w:rPr>
+          <w:rFonts w:ascii="Courier New" w:hAnsi="Courier New" w:cs="Courier New"/>
+          <w:color w:val="444444"/>
+          <w:sz w:val="20"/>
+          <w:szCs w:val="20"/>
+          <w:shd w:val="clear" w:color="auto" w:fill="E5E5E5"/>
+        </w:rPr>
+        <w:t> </w:t>
+      </w:r>
+      <w:r>
+        <w:rPr>
+          <w:rStyle w:val="cm-number"/>
+          <w:rFonts w:ascii="Courier New" w:hAnsi="Courier New" w:cs="Courier New"/>
+          <w:color w:val="116644"/>
+          <w:sz w:val="20"/>
+          <w:szCs w:val="20"/>
+          <w:shd w:val="clear" w:color="auto" w:fill="E5E5E5"/>
+        </w:rPr>
+        <w:t>0</w:t>
+      </w:r>
+      <w:r>
+        <w:rPr>
+          <w:rStyle w:val="cm-punctuation"/>
+          <w:rFonts w:ascii="Courier New" w:hAnsi="Courier New" w:cs="Courier New"/>
+          <w:color w:val="444444"/>
+          <w:sz w:val="20"/>
+          <w:szCs w:val="20"/>
+          <w:shd w:val="clear" w:color="auto" w:fill="E5E5E5"/>
+        </w:rPr>
+        <w:t>,</w:t>
+      </w:r>
+      <w:r>
+        <w:rPr>
+          <w:rFonts w:ascii="Courier New" w:hAnsi="Courier New" w:cs="Courier New"/>
+          <w:color w:val="444444"/>
+          <w:sz w:val="20"/>
+          <w:szCs w:val="20"/>
+          <w:shd w:val="clear" w:color="auto" w:fill="E5E5E5"/>
+        </w:rPr>
+        <w:t> </w:t>
+      </w:r>
+      <w:r>
+        <w:rPr>
+          <w:rStyle w:val="cm-number"/>
+          <w:rFonts w:ascii="Courier New" w:hAnsi="Courier New" w:cs="Courier New"/>
+          <w:color w:val="116644"/>
+          <w:sz w:val="20"/>
+          <w:szCs w:val="20"/>
+          <w:shd w:val="clear" w:color="auto" w:fill="E5E5E5"/>
+        </w:rPr>
+        <w:t>10</w:t>
+      </w:r>
+      <w:r>
+        <w:rPr>
+          <w:rStyle w:val="cm-punctuation"/>
+          <w:rFonts w:ascii="Courier New" w:hAnsi="Courier New" w:cs="Courier New"/>
+          <w:color w:val="444444"/>
+          <w:sz w:val="20"/>
+          <w:szCs w:val="20"/>
+          <w:shd w:val="clear" w:color="auto" w:fill="E5E5E5"/>
+        </w:rPr>
+        <w:t>;</w:t>
+      </w:r>
+    </w:p>
+    <w:p>
+      <w:pPr>
+        <w:rPr>
+          <w:b/>
+          <w:bCs/>
+          <w:sz w:val="24"/>
+          <w:szCs w:val="24"/>
+        </w:rPr>
+      </w:pPr>
+      <w:r>
+        <w:rPr>
+          <w:b/>
+          <w:bCs/>
+          <w:sz w:val="24"/>
+          <w:szCs w:val="24"/>
+        </w:rPr>
+        <w:t>#TOP 10 MOVIES BY THEIR RUNTIME IN MINUTES</w:t>
+      </w:r>
+    </w:p>
+    <w:p>
+      <w:pPr>
+        <w:rPr>
+          <w:rFonts w:ascii="Courier New" w:hAnsi="Courier New" w:cs="Courier New"/>
+          <w:color w:val="444444"/>
+          <w:sz w:val="20"/>
+          <w:szCs w:val="20"/>
+          <w:shd w:val="clear" w:color="auto" w:fill="E5E5E5"/>
         </w:rPr>
       </w:pPr>
       <w:hyperlink r:id="rId20" w:tgtFrame="mysql_doc" w:history="1">
@@ -1743,6 +2282,403 @@
           <w:szCs w:val="20"/>
           <w:shd w:val="clear" w:color="auto" w:fill="E5E5E5"/>
         </w:rPr>
+        <w:t> title</w:t>
+      </w:r>
+      <w:r>
+        <w:rPr>
+          <w:rStyle w:val="cm-punctuation"/>
+          <w:rFonts w:ascii="Courier New" w:hAnsi="Courier New" w:cs="Courier New"/>
+          <w:color w:val="444444"/>
+          <w:sz w:val="20"/>
+          <w:szCs w:val="20"/>
+          <w:shd w:val="clear" w:color="auto" w:fill="E5E5E5"/>
+        </w:rPr>
+        <w:t>,</w:t>
+      </w:r>
+      <w:r>
+        <w:rPr>
+          <w:rFonts w:ascii="Courier New" w:hAnsi="Courier New" w:cs="Courier New"/>
+          <w:color w:val="444444"/>
+          <w:sz w:val="20"/>
+          <w:szCs w:val="20"/>
+          <w:shd w:val="clear" w:color="auto" w:fill="E5E5E5"/>
+        </w:rPr>
+        <w:t> </w:t>
+      </w:r>
+      <w:hyperlink r:id="rId21" w:tgtFrame="mysql_doc" w:history="1">
+        <w:r>
+          <w:rPr>
+            <w:rStyle w:val="Hyperlink"/>
+            <w:rFonts w:ascii="Courier New" w:hAnsi="Courier New" w:cs="Courier New"/>
+            <w:sz w:val="20"/>
+            <w:szCs w:val="20"/>
+            <w:shd w:val="clear" w:color="auto" w:fill="E5E5E5"/>
+          </w:rPr>
+          <w:t>MAX</w:t>
+        </w:r>
+      </w:hyperlink>
+      <w:r>
+        <w:rPr>
+          <w:rStyle w:val="cm-bracket"/>
+          <w:rFonts w:ascii="Courier New" w:hAnsi="Courier New" w:cs="Courier New"/>
+          <w:color w:val="999977"/>
+          <w:sz w:val="20"/>
+          <w:szCs w:val="20"/>
+          <w:shd w:val="clear" w:color="auto" w:fill="E5E5E5"/>
+        </w:rPr>
+        <w:t>(</w:t>
+      </w:r>
+      <w:r>
+        <w:rPr>
+          <w:rFonts w:ascii="Courier New" w:hAnsi="Courier New" w:cs="Courier New"/>
+          <w:color w:val="444444"/>
+          <w:sz w:val="20"/>
+          <w:szCs w:val="20"/>
+          <w:shd w:val="clear" w:color="auto" w:fill="E5E5E5"/>
+        </w:rPr>
+        <w:t>runtime_mi</w:t>
+      </w:r>
+      <w:r>
+        <w:rPr>
+          <w:rStyle w:val="cm-bracket"/>
+          <w:rFonts w:ascii="Courier New" w:hAnsi="Courier New" w:cs="Courier New"/>
+          <w:color w:val="999977"/>
+          <w:sz w:val="20"/>
+          <w:szCs w:val="20"/>
+          <w:shd w:val="clear" w:color="auto" w:fill="E5E5E5"/>
+        </w:rPr>
+        <w:t>)</w:t>
+      </w:r>
+      <w:r>
+        <w:rPr>
+          <w:rFonts w:ascii="Courier New" w:hAnsi="Courier New" w:cs="Courier New"/>
+          <w:color w:val="444444"/>
+          <w:sz w:val="20"/>
+          <w:szCs w:val="20"/>
+          <w:shd w:val="clear" w:color="auto" w:fill="E5E5E5"/>
+        </w:rPr>
+        <w:t> </w:t>
+      </w:r>
+      <w:r>
+        <w:rPr>
+          <w:rStyle w:val="cm-keyword"/>
+          <w:rFonts w:ascii="Courier New" w:hAnsi="Courier New" w:cs="Courier New"/>
+          <w:color w:val="770088"/>
+          <w:sz w:val="20"/>
+          <w:szCs w:val="20"/>
+          <w:shd w:val="clear" w:color="auto" w:fill="E5E5E5"/>
+        </w:rPr>
+        <w:t>AS</w:t>
+      </w:r>
+      <w:r>
+        <w:rPr>
+          <w:rFonts w:ascii="Courier New" w:hAnsi="Courier New" w:cs="Courier New"/>
+          <w:color w:val="444444"/>
+          <w:sz w:val="20"/>
+          <w:szCs w:val="20"/>
+          <w:shd w:val="clear" w:color="auto" w:fill="E5E5E5"/>
+        </w:rPr>
+        <w:t> max_runtime_mi </w:t>
+      </w:r>
+      <w:r>
+        <w:rPr>
+          <w:rStyle w:val="cm-keyword"/>
+          <w:rFonts w:ascii="Courier New" w:hAnsi="Courier New" w:cs="Courier New"/>
+          <w:color w:val="770088"/>
+          <w:sz w:val="20"/>
+          <w:szCs w:val="20"/>
+          <w:shd w:val="clear" w:color="auto" w:fill="E5E5E5"/>
+        </w:rPr>
+        <w:t>FROM</w:t>
+      </w:r>
+      <w:r>
+        <w:rPr>
+          <w:rFonts w:ascii="Courier New" w:hAnsi="Courier New" w:cs="Courier New"/>
+          <w:color w:val="444444"/>
+          <w:sz w:val="20"/>
+          <w:szCs w:val="20"/>
+          <w:shd w:val="clear" w:color="auto" w:fill="E5E5E5"/>
+        </w:rPr>
+        <w:t> </w:t>
+      </w:r>
+      <w:r>
+        <w:rPr>
+          <w:rStyle w:val="cm-variable-2"/>
+          <w:rFonts w:ascii="Courier New" w:hAnsi="Courier New" w:cs="Courier New"/>
+          <w:color w:val="0055AA"/>
+          <w:sz w:val="20"/>
+          <w:szCs w:val="20"/>
+          <w:shd w:val="clear" w:color="auto" w:fill="E5E5E5"/>
+        </w:rPr>
+        <w:t>`imdb_movie_data`</w:t>
+      </w:r>
+      <w:r>
+        <w:rPr>
+          <w:rFonts w:ascii="Courier New" w:hAnsi="Courier New" w:cs="Courier New"/>
+          <w:color w:val="444444"/>
+          <w:sz w:val="20"/>
+          <w:szCs w:val="20"/>
+          <w:shd w:val="clear" w:color="auto" w:fill="E5E5E5"/>
+        </w:rPr>
+        <w:t> </w:t>
+      </w:r>
+      <w:r>
+        <w:rPr>
+          <w:rStyle w:val="cm-keyword"/>
+          <w:rFonts w:ascii="Courier New" w:hAnsi="Courier New" w:cs="Courier New"/>
+          <w:color w:val="770088"/>
+          <w:sz w:val="20"/>
+          <w:szCs w:val="20"/>
+          <w:shd w:val="clear" w:color="auto" w:fill="E5E5E5"/>
+        </w:rPr>
+        <w:t>GROUP</w:t>
+      </w:r>
+      <w:r>
+        <w:rPr>
+          <w:rFonts w:ascii="Courier New" w:hAnsi="Courier New" w:cs="Courier New"/>
+          <w:color w:val="444444"/>
+          <w:sz w:val="20"/>
+          <w:szCs w:val="20"/>
+          <w:shd w:val="clear" w:color="auto" w:fill="E5E5E5"/>
+        </w:rPr>
+        <w:t> </w:t>
+      </w:r>
+      <w:r>
+        <w:rPr>
+          <w:rStyle w:val="cm-keyword"/>
+          <w:rFonts w:ascii="Courier New" w:hAnsi="Courier New" w:cs="Courier New"/>
+          <w:color w:val="770088"/>
+          <w:sz w:val="20"/>
+          <w:szCs w:val="20"/>
+          <w:shd w:val="clear" w:color="auto" w:fill="E5E5E5"/>
+        </w:rPr>
+        <w:t>BY</w:t>
+      </w:r>
+      <w:r>
+        <w:rPr>
+          <w:rFonts w:ascii="Courier New" w:hAnsi="Courier New" w:cs="Courier New"/>
+          <w:color w:val="444444"/>
+          <w:sz w:val="20"/>
+          <w:szCs w:val="20"/>
+          <w:shd w:val="clear" w:color="auto" w:fill="E5E5E5"/>
+        </w:rPr>
+        <w:t> title </w:t>
+      </w:r>
+      <w:r>
+        <w:rPr>
+          <w:rStyle w:val="cm-keyword"/>
+          <w:rFonts w:ascii="Courier New" w:hAnsi="Courier New" w:cs="Courier New"/>
+          <w:color w:val="770088"/>
+          <w:sz w:val="20"/>
+          <w:szCs w:val="20"/>
+          <w:shd w:val="clear" w:color="auto" w:fill="E5E5E5"/>
+        </w:rPr>
+        <w:t>ORDER</w:t>
+      </w:r>
+      <w:r>
+        <w:rPr>
+          <w:rFonts w:ascii="Courier New" w:hAnsi="Courier New" w:cs="Courier New"/>
+          <w:color w:val="444444"/>
+          <w:sz w:val="20"/>
+          <w:szCs w:val="20"/>
+          <w:shd w:val="clear" w:color="auto" w:fill="E5E5E5"/>
+        </w:rPr>
+        <w:t> </w:t>
+      </w:r>
+      <w:r>
+        <w:rPr>
+          <w:rStyle w:val="cm-keyword"/>
+          <w:rFonts w:ascii="Courier New" w:hAnsi="Courier New" w:cs="Courier New"/>
+          <w:color w:val="770088"/>
+          <w:sz w:val="20"/>
+          <w:szCs w:val="20"/>
+          <w:shd w:val="clear" w:color="auto" w:fill="E5E5E5"/>
+        </w:rPr>
+        <w:t>BY</w:t>
+      </w:r>
+      <w:r>
+        <w:rPr>
+          <w:rFonts w:ascii="Courier New" w:hAnsi="Courier New" w:cs="Courier New"/>
+          <w:color w:val="444444"/>
+          <w:sz w:val="20"/>
+          <w:szCs w:val="20"/>
+          <w:shd w:val="clear" w:color="auto" w:fill="E5E5E5"/>
+        </w:rPr>
+        <w:t> max_runtime_mi </w:t>
+      </w:r>
+      <w:r>
+        <w:rPr>
+          <w:rStyle w:val="cm-keyword"/>
+          <w:rFonts w:ascii="Courier New" w:hAnsi="Courier New" w:cs="Courier New"/>
+          <w:color w:val="770088"/>
+          <w:sz w:val="20"/>
+          <w:szCs w:val="20"/>
+          <w:shd w:val="clear" w:color="auto" w:fill="E5E5E5"/>
+        </w:rPr>
+        <w:t>DESC</w:t>
+      </w:r>
+      <w:r>
+        <w:rPr>
+          <w:rFonts w:ascii="Courier New" w:hAnsi="Courier New" w:cs="Courier New"/>
+          <w:color w:val="444444"/>
+          <w:sz w:val="20"/>
+          <w:szCs w:val="20"/>
+          <w:shd w:val="clear" w:color="auto" w:fill="E5E5E5"/>
+        </w:rPr>
+        <w:t> </w:t>
+      </w:r>
+      <w:r>
+        <w:rPr>
+          <w:rStyle w:val="cm-keyword"/>
+          <w:rFonts w:ascii="Courier New" w:hAnsi="Courier New" w:cs="Courier New"/>
+          <w:color w:val="770088"/>
+          <w:sz w:val="20"/>
+          <w:szCs w:val="20"/>
+          <w:shd w:val="clear" w:color="auto" w:fill="E5E5E5"/>
+        </w:rPr>
+        <w:t>LIMIT</w:t>
+      </w:r>
+      <w:r>
+        <w:rPr>
+          <w:rFonts w:ascii="Courier New" w:hAnsi="Courier New" w:cs="Courier New"/>
+          <w:color w:val="444444"/>
+          <w:sz w:val="20"/>
+          <w:szCs w:val="20"/>
+          <w:shd w:val="clear" w:color="auto" w:fill="E5E5E5"/>
+        </w:rPr>
+        <w:t> </w:t>
+      </w:r>
+      <w:r>
+        <w:rPr>
+          <w:rStyle w:val="cm-number"/>
+          <w:rFonts w:ascii="Courier New" w:hAnsi="Courier New" w:cs="Courier New"/>
+          <w:color w:val="116644"/>
+          <w:sz w:val="20"/>
+          <w:szCs w:val="20"/>
+          <w:shd w:val="clear" w:color="auto" w:fill="E5E5E5"/>
+        </w:rPr>
+        <w:t>0</w:t>
+      </w:r>
+      <w:r>
+        <w:rPr>
+          <w:rStyle w:val="cm-punctuation"/>
+          <w:rFonts w:ascii="Courier New" w:hAnsi="Courier New" w:cs="Courier New"/>
+          <w:color w:val="444444"/>
+          <w:sz w:val="20"/>
+          <w:szCs w:val="20"/>
+          <w:shd w:val="clear" w:color="auto" w:fill="E5E5E5"/>
+        </w:rPr>
+        <w:t>,</w:t>
+      </w:r>
+      <w:r>
+        <w:rPr>
+          <w:rFonts w:ascii="Courier New" w:hAnsi="Courier New" w:cs="Courier New"/>
+          <w:color w:val="444444"/>
+          <w:sz w:val="20"/>
+          <w:szCs w:val="20"/>
+          <w:shd w:val="clear" w:color="auto" w:fill="E5E5E5"/>
+        </w:rPr>
+        <w:t> </w:t>
+      </w:r>
+      <w:r>
+        <w:rPr>
+          <w:rStyle w:val="cm-number"/>
+          <w:rFonts w:ascii="Courier New" w:hAnsi="Courier New" w:cs="Courier New"/>
+          <w:color w:val="116644"/>
+          <w:sz w:val="20"/>
+          <w:szCs w:val="20"/>
+          <w:shd w:val="clear" w:color="auto" w:fill="E5E5E5"/>
+        </w:rPr>
+        <w:t>10</w:t>
+      </w:r>
+      <w:r>
+        <w:rPr>
+          <w:rStyle w:val="cm-punctuation"/>
+          <w:rFonts w:ascii="Courier New" w:hAnsi="Courier New" w:cs="Courier New"/>
+          <w:color w:val="444444"/>
+          <w:sz w:val="20"/>
+          <w:szCs w:val="20"/>
+          <w:shd w:val="clear" w:color="auto" w:fill="E5E5E5"/>
+        </w:rPr>
+        <w:t>;</w:t>
+      </w:r>
+    </w:p>
+    <w:p>
+      <w:pPr>
+        <w:rPr>
+          <w:b/>
+          <w:bCs/>
+          <w:sz w:val="24"/>
+          <w:szCs w:val="24"/>
+        </w:rPr>
+      </w:pPr>
+      <w:r>
+        <w:rPr>
+          <w:b/>
+          <w:bCs/>
+          <w:sz w:val="24"/>
+          <w:szCs w:val="24"/>
+        </w:rPr>
+        <w:t xml:space="preserve">#TOP 10 </w:t>
+      </w:r>
+      <w:r>
+        <w:rPr>
+          <w:b/>
+          <w:bCs/>
+          <w:sz w:val="24"/>
+          <w:szCs w:val="24"/>
+        </w:rPr>
+        <w:t>ACTORS</w:t>
+      </w:r>
+      <w:r>
+        <w:rPr>
+          <w:b/>
+          <w:bCs/>
+          <w:sz w:val="24"/>
+          <w:szCs w:val="24"/>
+        </w:rPr>
+        <w:t xml:space="preserve"> BY THEIR </w:t>
+      </w:r>
+      <w:r>
+        <w:rPr>
+          <w:b/>
+          <w:bCs/>
+          <w:sz w:val="24"/>
+          <w:szCs w:val="24"/>
+        </w:rPr>
+        <w:t>MOVIES COUNT</w:t>
+      </w:r>
+    </w:p>
+    <w:p>
+      <w:pPr>
+        <w:rPr>
+          <w:rFonts w:ascii="Courier New" w:hAnsi="Courier New" w:cs="Courier New"/>
+          <w:color w:val="444444"/>
+          <w:sz w:val="20"/>
+          <w:szCs w:val="20"/>
+          <w:shd w:val="clear" w:color="auto" w:fill="E5E5E5"/>
+        </w:rPr>
+      </w:pPr>
+      <w:hyperlink r:id="rId22" w:tgtFrame="mysql_doc" w:history="1">
+        <w:r>
+          <w:rPr>
+            <w:rStyle w:val="Hyperlink"/>
+            <w:rFonts w:ascii="Courier New" w:hAnsi="Courier New" w:cs="Courier New"/>
+            <w:sz w:val="20"/>
+            <w:szCs w:val="20"/>
+            <w:shd w:val="clear" w:color="auto" w:fill="E5E5E5"/>
+          </w:rPr>
+          <w:t>SELECT</w:t>
+        </w:r>
+      </w:hyperlink>
+      <w:r>
+        <w:rPr>
+          <w:rFonts w:ascii="Courier New" w:hAnsi="Courier New" w:cs="Courier New"/>
+          <w:color w:val="444444"/>
+          <w:sz w:val="20"/>
+          <w:szCs w:val="20"/>
+          <w:shd w:val="clear" w:color="auto" w:fill="E5E5E5"/>
+        </w:rPr>
         <w:t> TRIM</w:t>
       </w:r>
       <w:r>
@@ -1785,7 +2721,7 @@
           <w:szCs w:val="20"/>
           <w:shd w:val="clear" w:color="auto" w:fill="E5E5E5"/>
         </w:rPr>
-        <w:t>genre</w:t>
+        <w:t>actors</w:t>
       </w:r>
       <w:r>
         <w:rPr>
@@ -1891,7 +2827,7 @@
           <w:szCs w:val="20"/>
           <w:shd w:val="clear" w:color="auto" w:fill="E5E5E5"/>
         </w:rPr>
-        <w:t> main_genre</w:t>
+        <w:t> main_actors</w:t>
       </w:r>
       <w:r>
         <w:rPr>
@@ -1914,7 +2850,7 @@
         </w:rPr>
         <w:t> </w:t>
       </w:r>
-      <w:hyperlink r:id="rId21" w:tgtFrame="mysql_doc" w:history="1">
+      <w:hyperlink r:id="rId23" w:tgtFrame="mysql_doc" w:history="1">
         <w:r>
           <w:rPr>
             <w:rStyle w:val="Hyperlink"/>
@@ -2072,7 +3008,7 @@
           <w:szCs w:val="20"/>
           <w:shd w:val="clear" w:color="auto" w:fill="E5E5E5"/>
         </w:rPr>
-        <w:t> main_genre </w:t>
+        <w:t> main_actors </w:t>
       </w:r>
       <w:r>
         <w:rPr>
@@ -2126,6 +3062,80 @@
           <w:shd w:val="clear" w:color="auto" w:fill="E5E5E5"/>
         </w:rPr>
         <w:t>DESC</w:t>
+      </w:r>
+      <w:r>
+        <w:rPr>
+          <w:rFonts w:ascii="Courier New" w:hAnsi="Courier New" w:cs="Courier New"/>
+          <w:color w:val="444444"/>
+          <w:sz w:val="20"/>
+          <w:szCs w:val="20"/>
+          <w:shd w:val="clear" w:color="auto" w:fill="E5E5E5"/>
+        </w:rPr>
+        <w:t> </w:t>
+      </w:r>
+      <w:r>
+        <w:rPr>
+          <w:rStyle w:val="cm-keyword"/>
+          <w:rFonts w:ascii="Courier New" w:hAnsi="Courier New" w:cs="Courier New"/>
+          <w:color w:val="770088"/>
+          <w:sz w:val="20"/>
+          <w:szCs w:val="20"/>
+          <w:shd w:val="clear" w:color="auto" w:fill="E5E5E5"/>
+        </w:rPr>
+        <w:t>LIMIT</w:t>
+      </w:r>
+      <w:r>
+        <w:rPr>
+          <w:rFonts w:ascii="Courier New" w:hAnsi="Courier New" w:cs="Courier New"/>
+          <w:color w:val="444444"/>
+          <w:sz w:val="20"/>
+          <w:szCs w:val="20"/>
+          <w:shd w:val="clear" w:color="auto" w:fill="E5E5E5"/>
+        </w:rPr>
+        <w:t> </w:t>
+      </w:r>
+      <w:r>
+        <w:rPr>
+          <w:rStyle w:val="cm-number"/>
+          <w:rFonts w:ascii="Courier New" w:hAnsi="Courier New" w:cs="Courier New"/>
+          <w:color w:val="116644"/>
+          <w:sz w:val="20"/>
+          <w:szCs w:val="20"/>
+          <w:shd w:val="clear" w:color="auto" w:fill="E5E5E5"/>
+        </w:rPr>
+        <w:t>0</w:t>
+      </w:r>
+      <w:r>
+        <w:rPr>
+          <w:rFonts w:ascii="Courier New" w:hAnsi="Courier New" w:cs="Courier New"/>
+          <w:color w:val="444444"/>
+          <w:sz w:val="20"/>
+          <w:szCs w:val="20"/>
+          <w:shd w:val="clear" w:color="auto" w:fill="E5E5E5"/>
+        </w:rPr>
+        <w:t> </w:t>
+      </w:r>
+      <w:r>
+        <w:rPr>
+          <w:rStyle w:val="cm-punctuation"/>
+          <w:rFonts w:ascii="Courier New" w:hAnsi="Courier New" w:cs="Courier New"/>
+          <w:color w:val="444444"/>
+          <w:sz w:val="20"/>
+          <w:szCs w:val="20"/>
+          <w:shd w:val="clear" w:color="auto" w:fill="E5E5E5"/>
+        </w:rPr>
+        <w:t>,</w:t>
+      </w:r>
+      <w:r>
+        <w:rPr>
+          <w:rStyle w:val="cm-number"/>
+          <w:rFonts w:ascii="Courier New" w:hAnsi="Courier New" w:cs="Courier New"/>
+          <w:color w:val="116644"/>
+          <w:sz w:val="20"/>
+          <w:szCs w:val="20"/>
+          <w:shd w:val="clear" w:color="auto" w:fill="E5E5E5"/>
+        </w:rPr>
+        <w:t>10</w:t>
       </w:r>
       <w:r>
         <w:rPr>
@@ -2152,152 +3162,24 @@
         <w:rPr>
           <w:b/>
           <w:bCs/>
-          <w:noProof/>
           <w:sz w:val="24"/>
           <w:szCs w:val="24"/>
         </w:rPr>
-        <w:drawing>
-          <wp:inline distT="0" distB="0" distL="0" distR="0" wp14:anchorId="38A2FD25" wp14:editId="6AC6F659">
-            <wp:extent cx="5724525" cy="2752725"/>
-            <wp:effectExtent l="0" t="0" r="9525" b="9525"/>
-            <wp:docPr id="1314565846" name="Picture 3"/>
-            <wp:cNvGraphicFramePr>
-              <a:graphicFrameLocks xmlns:a="http://schemas.openxmlformats.org/drawingml/2006/main" noChangeAspect="1"/>
-            </wp:cNvGraphicFramePr>
-            <a:graphic xmlns:a="http://schemas.openxmlformats.org/drawingml/2006/main">
-              <a:graphicData uri="http://schemas.openxmlformats.org/drawingml/2006/picture">
-                <pic:pic xmlns:pic="http://schemas.openxmlformats.org/drawingml/2006/picture">
-                  <pic:nvPicPr>
-                    <pic:cNvPr id="0" name="Picture 3"/>
-                    <pic:cNvPicPr>
-                      <a:picLocks noChangeAspect="1" noChangeArrowheads="1"/>
-                    </pic:cNvPicPr>
-                  </pic:nvPicPr>
-                  <pic:blipFill>
-                    <a:blip r:embed="rId22">
-                      <a:extLst>
-                        <a:ext uri="{28A0092B-C50C-407E-A947-70E740481C1C}">
-                          <a14:useLocalDpi xmlns:a14="http://schemas.microsoft.com/office/drawing/2010/main" val="0"/>
-                        </a:ext>
-                      </a:extLst>
-                    </a:blip>
-                    <a:srcRect/>
-                    <a:stretch>
-                      <a:fillRect/>
-                    </a:stretch>
-                  </pic:blipFill>
-                  <pic:spPr bwMode="auto">
-                    <a:xfrm>
-                      <a:off x="0" y="0"/>
-                      <a:ext cx="5724525" cy="2752725"/>
-                    </a:xfrm>
-                    <a:prstGeom prst="rect">
-                      <a:avLst/>
-                    </a:prstGeom>
-                    <a:noFill/>
-                    <a:ln>
-                      <a:noFill/>
-                    </a:ln>
-                  </pic:spPr>
-                </pic:pic>
-              </a:graphicData>
-            </a:graphic>
-          </wp:inline>
-        </w:drawing>
+        <w:t>#TOP 10 MOVIES WHO GOT MAX VOTES</w:t>
       </w:r>
     </w:p>
     <w:p>
       <w:pPr>
         <w:rPr>
-          <w:b/>
-          <w:bCs/>
-          <w:sz w:val="24"/>
-          <w:szCs w:val="24"/>
+          <w:rStyle w:val="cm-punctuation"/>
+          <w:rFonts w:ascii="Courier New" w:hAnsi="Courier New" w:cs="Courier New"/>
+          <w:color w:val="444444"/>
+          <w:sz w:val="20"/>
+          <w:szCs w:val="20"/>
+          <w:shd w:val="clear" w:color="auto" w:fill="E5E5E5"/>
         </w:rPr>
       </w:pPr>
-    </w:p>
-    <w:p>
-      <w:pPr>
-        <w:rPr>
-          <w:b/>
-          <w:bCs/>
-          <w:sz w:val="24"/>
-          <w:szCs w:val="24"/>
-        </w:rPr>
-      </w:pPr>
-    </w:p>
-    <w:p>
-      <w:pPr>
-        <w:rPr>
-          <w:b/>
-          <w:bCs/>
-          <w:sz w:val="24"/>
-          <w:szCs w:val="24"/>
-        </w:rPr>
-      </w:pPr>
-    </w:p>
-    <w:p>
-      <w:pPr>
-        <w:rPr>
-          <w:b/>
-          <w:bCs/>
-          <w:sz w:val="24"/>
-          <w:szCs w:val="24"/>
-        </w:rPr>
-      </w:pPr>
-    </w:p>
-    <w:p>
-      <w:pPr>
-        <w:rPr>
-          <w:b/>
-          <w:bCs/>
-          <w:sz w:val="24"/>
-          <w:szCs w:val="24"/>
-        </w:rPr>
-      </w:pPr>
-    </w:p>
-    <w:p>
-      <w:pPr>
-        <w:rPr>
-          <w:b/>
-          <w:bCs/>
-          <w:sz w:val="24"/>
-          <w:szCs w:val="24"/>
-        </w:rPr>
-      </w:pPr>
-    </w:p>
-    <w:p>
-      <w:pPr>
-        <w:rPr>
-          <w:b/>
-          <w:bCs/>
-          <w:sz w:val="24"/>
-          <w:szCs w:val="24"/>
-        </w:rPr>
-      </w:pPr>
-      <w:r>
-        <w:rPr>
-          <w:b/>
-          <w:bCs/>
-          <w:sz w:val="24"/>
-          <w:szCs w:val="24"/>
-        </w:rPr>
-        <w:lastRenderedPageBreak/>
-        <w:t>#DIRECTOR NAME WHO RELEASES MOST</w:t>
-      </w:r>
-    </w:p>
-    <w:p>
-      <w:pPr>
-        <w:rPr>
-          <w:rStyle w:val="cm-punctuation"/>
-          <w:rFonts w:ascii="Courier New" w:hAnsi="Courier New" w:cs="Courier New"/>
-          <w:color w:val="444444"/>
-          <w:sz w:val="20"/>
-          <w:szCs w:val="20"/>
-          <w:shd w:val="clear" w:color="auto" w:fill="E5E5E5"/>
-        </w:rPr>
-      </w:pPr>
-      <w:hyperlink r:id="rId23" w:tgtFrame="mysql_doc" w:history="1">
+      <w:hyperlink r:id="rId24" w:tgtFrame="mysql_doc" w:history="1">
         <w:r>
           <w:rPr>
             <w:rStyle w:val="Hyperlink"/>
@@ -2317,7 +3199,7 @@
           <w:szCs w:val="20"/>
           <w:shd w:val="clear" w:color="auto" w:fill="E5E5E5"/>
         </w:rPr>
-        <w:t> director</w:t>
+        <w:t> title</w:t>
       </w:r>
       <w:r>
         <w:rPr>
@@ -2340,7 +3222,7 @@
         </w:rPr>
         <w:t> </w:t>
       </w:r>
-      <w:hyperlink r:id="rId24" w:tgtFrame="mysql_doc" w:history="1">
+      <w:hyperlink r:id="rId25" w:tgtFrame="mysql_doc" w:history="1">
         <w:r>
           <w:rPr>
             <w:rStyle w:val="Hyperlink"/>
@@ -2349,7 +3231,7 @@
             <w:szCs w:val="20"/>
             <w:shd w:val="clear" w:color="auto" w:fill="E5E5E5"/>
           </w:rPr>
-          <w:t>COUNT</w:t>
+          <w:t>MAX</w:t>
         </w:r>
       </w:hyperlink>
       <w:r>
@@ -2371,7 +3253,7 @@
           <w:szCs w:val="20"/>
           <w:shd w:val="clear" w:color="auto" w:fill="E5E5E5"/>
         </w:rPr>
-        <w:t>director</w:t>
+        <w:t>votes</w:t>
       </w:r>
       <w:r>
         <w:rPr>
@@ -2413,7 +3295,7 @@
           <w:szCs w:val="20"/>
           <w:shd w:val="clear" w:color="auto" w:fill="E5E5E5"/>
         </w:rPr>
-        <w:t> director_count </w:t>
+        <w:t> max_votes </w:t>
       </w:r>
       <w:r>
         <w:rPr>
@@ -2497,7 +3379,7 @@
           <w:szCs w:val="20"/>
           <w:shd w:val="clear" w:color="auto" w:fill="E5E5E5"/>
         </w:rPr>
-        <w:t> director </w:t>
+        <w:t> title </w:t>
       </w:r>
       <w:r>
         <w:rPr>
@@ -2539,7 +3421,7 @@
           <w:szCs w:val="20"/>
           <w:shd w:val="clear" w:color="auto" w:fill="E5E5E5"/>
         </w:rPr>
-        <w:t> director_count </w:t>
+        <w:t> max_votes </w:t>
       </w:r>
       <w:r>
         <w:rPr>
@@ -2554,48 +3436,6 @@
       </w:r>
       <w:r>
         <w:rPr>
-          <w:rFonts w:ascii="Courier New" w:hAnsi="Courier New" w:cs="Courier New"/>
-          <w:color w:val="444444"/>
-          <w:sz w:val="20"/>
-          <w:szCs w:val="20"/>
-          <w:shd w:val="clear" w:color="auto" w:fill="E5E5E5"/>
-        </w:rPr>
-        <w:t> </w:t>
-      </w:r>
-      <w:r>
-        <w:rPr>
-          <w:rStyle w:val="cm-keyword"/>
-          <w:rFonts w:ascii="Courier New" w:hAnsi="Courier New" w:cs="Courier New"/>
-          <w:color w:val="770088"/>
-          <w:sz w:val="20"/>
-          <w:szCs w:val="20"/>
-          <w:shd w:val="clear" w:color="auto" w:fill="E5E5E5"/>
-        </w:rPr>
-        <w:t>LIMIT</w:t>
-      </w:r>
-      <w:r>
-        <w:rPr>
-          <w:rFonts w:ascii="Courier New" w:hAnsi="Courier New" w:cs="Courier New"/>
-          <w:color w:val="444444"/>
-          <w:sz w:val="20"/>
-          <w:szCs w:val="20"/>
-          <w:shd w:val="clear" w:color="auto" w:fill="E5E5E5"/>
-        </w:rPr>
-        <w:t> </w:t>
-      </w:r>
-      <w:r>
-        <w:rPr>
-          <w:rStyle w:val="cm-number"/>
-          <w:rFonts w:ascii="Courier New" w:hAnsi="Courier New" w:cs="Courier New"/>
-          <w:color w:val="116644"/>
-          <w:sz w:val="20"/>
-          <w:szCs w:val="20"/>
-          <w:shd w:val="clear" w:color="auto" w:fill="E5E5E5"/>
-        </w:rPr>
-        <w:t>0</w:t>
-      </w:r>
-      <w:r>
-        <w:rPr>
           <w:rStyle w:val="cm-punctuation"/>
           <w:rFonts w:ascii="Courier New" w:hAnsi="Courier New" w:cs="Courier New"/>
           <w:color w:val="444444"/>
@@ -2603,102 +3443,7 @@
           <w:szCs w:val="20"/>
           <w:shd w:val="clear" w:color="auto" w:fill="E5E5E5"/>
         </w:rPr>
-        <w:t>,</w:t>
-      </w:r>
-      <w:r>
-        <w:rPr>
-          <w:rFonts w:ascii="Courier New" w:hAnsi="Courier New" w:cs="Courier New"/>
-          <w:color w:val="444444"/>
-          <w:sz w:val="20"/>
-          <w:szCs w:val="20"/>
-          <w:shd w:val="clear" w:color="auto" w:fill="E5E5E5"/>
-        </w:rPr>
-        <w:t> </w:t>
-      </w:r>
-      <w:r>
-        <w:rPr>
-          <w:rStyle w:val="cm-number"/>
-          <w:rFonts w:ascii="Courier New" w:hAnsi="Courier New" w:cs="Courier New"/>
-          <w:color w:val="116644"/>
-          <w:sz w:val="20"/>
-          <w:szCs w:val="20"/>
-          <w:shd w:val="clear" w:color="auto" w:fill="E5E5E5"/>
-        </w:rPr>
-        <w:t>10</w:t>
-      </w:r>
-      <w:r>
-        <w:rPr>
-          <w:rStyle w:val="cm-punctuation"/>
-          <w:rFonts w:ascii="Courier New" w:hAnsi="Courier New" w:cs="Courier New"/>
-          <w:color w:val="444444"/>
-          <w:sz w:val="20"/>
-          <w:szCs w:val="20"/>
-          <w:shd w:val="clear" w:color="auto" w:fill="E5E5E5"/>
-        </w:rPr>
         <w:t>;</w:t>
-      </w:r>
-    </w:p>
-    <w:p>
-      <w:pPr>
-        <w:rPr>
-          <w:sz w:val="24"/>
-          <w:szCs w:val="24"/>
-        </w:rPr>
-      </w:pPr>
-      <w:r>
-        <w:rPr>
-          <w:noProof/>
-          <w:sz w:val="24"/>
-          <w:szCs w:val="24"/>
-        </w:rPr>
-        <w:drawing>
-          <wp:inline distT="0" distB="0" distL="0" distR="0" wp14:anchorId="1CAF889C" wp14:editId="00DBA39D">
-            <wp:extent cx="5724525" cy="2362200"/>
-            <wp:effectExtent l="0" t="0" r="9525" b="0"/>
-            <wp:docPr id="1453605171" name="Picture 4"/>
-            <wp:cNvGraphicFramePr>
-              <a:graphicFrameLocks xmlns:a="http://schemas.openxmlformats.org/drawingml/2006/main" noChangeAspect="1"/>
-            </wp:cNvGraphicFramePr>
-            <a:graphic xmlns:a="http://schemas.openxmlformats.org/drawingml/2006/main">
-              <a:graphicData uri="http://schemas.openxmlformats.org/drawingml/2006/picture">
-                <pic:pic xmlns:pic="http://schemas.openxmlformats.org/drawingml/2006/picture">
-                  <pic:nvPicPr>
-                    <pic:cNvPr id="0" name="Picture 4"/>
-                    <pic:cNvPicPr>
-                      <a:picLocks noChangeAspect="1" noChangeArrowheads="1"/>
-                    </pic:cNvPicPr>
-                  </pic:nvPicPr>
-                  <pic:blipFill>
-                    <a:blip r:embed="rId25">
-                      <a:extLst>
-                        <a:ext uri="{28A0092B-C50C-407E-A947-70E740481C1C}">
-                          <a14:useLocalDpi xmlns:a14="http://schemas.microsoft.com/office/drawing/2010/main" val="0"/>
-                        </a:ext>
-                      </a:extLst>
-                    </a:blip>
-                    <a:srcRect/>
-                    <a:stretch>
-                      <a:fillRect/>
-                    </a:stretch>
-                  </pic:blipFill>
-                  <pic:spPr bwMode="auto">
-                    <a:xfrm>
-                      <a:off x="0" y="0"/>
-                      <a:ext cx="5724525" cy="2362200"/>
-                    </a:xfrm>
-                    <a:prstGeom prst="rect">
-                      <a:avLst/>
-                    </a:prstGeom>
-                    <a:noFill/>
-                    <a:ln>
-                      <a:noFill/>
-                    </a:ln>
-                  </pic:spPr>
-                </pic:pic>
-              </a:graphicData>
-            </a:graphic>
-          </wp:inline>
-        </w:drawing>
       </w:r>
     </w:p>
     <w:p>
@@ -2710,16 +3455,15 @@
           <w:szCs w:val="24"/>
         </w:rPr>
       </w:pPr>
-    </w:p>
-    <w:p>
-      <w:pPr>
+      <w:r>
         <w:rPr>
           <w:b/>
           <w:bCs/>
           <w:sz w:val="24"/>
           <w:szCs w:val="24"/>
         </w:rPr>
-      </w:pPr>
+        <w:t>#A</w:t>
+      </w:r>
       <w:r>
         <w:rPr>
           <w:b/>
@@ -2727,7 +3471,106 @@
           <w:sz w:val="24"/>
           <w:szCs w:val="24"/>
         </w:rPr>
-        <w:t>#TOP 10 MOVIES BY THEIR RUNTIME IN MINUTES</w:t>
+        <w:t>CTOR</w:t>
+      </w:r>
+      <w:r>
+        <w:rPr>
+          <w:b/>
+          <w:bCs/>
+          <w:sz w:val="24"/>
+          <w:szCs w:val="24"/>
+        </w:rPr>
+        <w:t xml:space="preserve"> R</w:t>
+      </w:r>
+      <w:r>
+        <w:rPr>
+          <w:b/>
+          <w:bCs/>
+          <w:sz w:val="24"/>
+          <w:szCs w:val="24"/>
+        </w:rPr>
+        <w:t>ANKIN</w:t>
+      </w:r>
+      <w:r>
+        <w:rPr>
+          <w:b/>
+          <w:bCs/>
+          <w:sz w:val="24"/>
+          <w:szCs w:val="24"/>
+        </w:rPr>
+        <w:t>G</w:t>
+      </w:r>
+      <w:r>
+        <w:rPr>
+          <w:b/>
+          <w:bCs/>
+          <w:sz w:val="24"/>
+          <w:szCs w:val="24"/>
+        </w:rPr>
+        <w:t xml:space="preserve"> B</w:t>
+      </w:r>
+      <w:r>
+        <w:rPr>
+          <w:b/>
+          <w:bCs/>
+          <w:sz w:val="24"/>
+          <w:szCs w:val="24"/>
+        </w:rPr>
+        <w:t>ASED</w:t>
+      </w:r>
+      <w:r>
+        <w:rPr>
+          <w:b/>
+          <w:bCs/>
+          <w:sz w:val="24"/>
+          <w:szCs w:val="24"/>
+        </w:rPr>
+        <w:t xml:space="preserve"> O</w:t>
+      </w:r>
+      <w:r>
+        <w:rPr>
+          <w:b/>
+          <w:bCs/>
+          <w:sz w:val="24"/>
+          <w:szCs w:val="24"/>
+        </w:rPr>
+        <w:t>N</w:t>
+      </w:r>
+      <w:r>
+        <w:rPr>
+          <w:b/>
+          <w:bCs/>
+          <w:sz w:val="24"/>
+          <w:szCs w:val="24"/>
+        </w:rPr>
+        <w:t xml:space="preserve"> M</w:t>
+      </w:r>
+      <w:r>
+        <w:rPr>
+          <w:b/>
+          <w:bCs/>
+          <w:sz w:val="24"/>
+          <w:szCs w:val="24"/>
+        </w:rPr>
+        <w:t>OVIE</w:t>
+      </w:r>
+      <w:r>
+        <w:rPr>
+          <w:b/>
+          <w:bCs/>
+          <w:sz w:val="24"/>
+          <w:szCs w:val="24"/>
+        </w:rPr>
+        <w:t xml:space="preserve"> C</w:t>
+      </w:r>
+      <w:r>
+        <w:rPr>
+          <w:b/>
+          <w:bCs/>
+          <w:sz w:val="24"/>
+          <w:szCs w:val="24"/>
+        </w:rPr>
+        <w:t>OUNT</w:t>
       </w:r>
     </w:p>
     <w:p>
@@ -2761,7 +3604,7 @@
           <w:szCs w:val="20"/>
           <w:shd w:val="clear" w:color="auto" w:fill="E5E5E5"/>
         </w:rPr>
-        <w:t> title</w:t>
+        <w:t> main_actor</w:t>
       </w:r>
       <w:r>
         <w:rPr>
@@ -2782,488 +3625,199 @@
           <w:szCs w:val="20"/>
           <w:shd w:val="clear" w:color="auto" w:fill="E5E5E5"/>
         </w:rPr>
+        <w:t> movie_count</w:t>
+      </w:r>
+      <w:r>
+        <w:rPr>
+          <w:rStyle w:val="cm-punctuation"/>
+          <w:rFonts w:ascii="Courier New" w:hAnsi="Courier New" w:cs="Courier New"/>
+          <w:color w:val="444444"/>
+          <w:sz w:val="20"/>
+          <w:szCs w:val="20"/>
+          <w:shd w:val="clear" w:color="auto" w:fill="E5E5E5"/>
+        </w:rPr>
+        <w:t>,</w:t>
+      </w:r>
+      <w:r>
+        <w:rPr>
+          <w:rFonts w:ascii="Courier New" w:hAnsi="Courier New" w:cs="Courier New"/>
+          <w:color w:val="444444"/>
+          <w:sz w:val="20"/>
+          <w:szCs w:val="20"/>
+          <w:shd w:val="clear" w:color="auto" w:fill="E5E5E5"/>
+        </w:rPr>
+        <w:t> DENSE_RANK</w:t>
+      </w:r>
+      <w:r>
+        <w:rPr>
+          <w:rStyle w:val="cm-bracket"/>
+          <w:rFonts w:ascii="Courier New" w:hAnsi="Courier New" w:cs="Courier New"/>
+          <w:color w:val="999977"/>
+          <w:sz w:val="20"/>
+          <w:szCs w:val="20"/>
+          <w:shd w:val="clear" w:color="auto" w:fill="E5E5E5"/>
+        </w:rPr>
+        <w:t>()</w:t>
+      </w:r>
+      <w:r>
+        <w:rPr>
+          <w:rFonts w:ascii="Courier New" w:hAnsi="Courier New" w:cs="Courier New"/>
+          <w:color w:val="444444"/>
+          <w:sz w:val="20"/>
+          <w:szCs w:val="20"/>
+          <w:shd w:val="clear" w:color="auto" w:fill="E5E5E5"/>
+        </w:rPr>
+        <w:t> OVER </w:t>
+      </w:r>
+      <w:r>
+        <w:rPr>
+          <w:rStyle w:val="cm-bracket"/>
+          <w:rFonts w:ascii="Courier New" w:hAnsi="Courier New" w:cs="Courier New"/>
+          <w:color w:val="999977"/>
+          <w:sz w:val="20"/>
+          <w:szCs w:val="20"/>
+          <w:shd w:val="clear" w:color="auto" w:fill="E5E5E5"/>
+        </w:rPr>
+        <w:t>(</w:t>
+      </w:r>
+      <w:r>
+        <w:rPr>
+          <w:rStyle w:val="cm-keyword"/>
+          <w:rFonts w:ascii="Courier New" w:hAnsi="Courier New" w:cs="Courier New"/>
+          <w:color w:val="770088"/>
+          <w:sz w:val="20"/>
+          <w:szCs w:val="20"/>
+          <w:shd w:val="clear" w:color="auto" w:fill="E5E5E5"/>
+        </w:rPr>
+        <w:t>ORDER</w:t>
+      </w:r>
+      <w:r>
+        <w:rPr>
+          <w:rFonts w:ascii="Courier New" w:hAnsi="Courier New" w:cs="Courier New"/>
+          <w:color w:val="444444"/>
+          <w:sz w:val="20"/>
+          <w:szCs w:val="20"/>
+          <w:shd w:val="clear" w:color="auto" w:fill="E5E5E5"/>
+        </w:rPr>
+        <w:t> </w:t>
+      </w:r>
+      <w:r>
+        <w:rPr>
+          <w:rStyle w:val="cm-keyword"/>
+          <w:rFonts w:ascii="Courier New" w:hAnsi="Courier New" w:cs="Courier New"/>
+          <w:color w:val="770088"/>
+          <w:sz w:val="20"/>
+          <w:szCs w:val="20"/>
+          <w:shd w:val="clear" w:color="auto" w:fill="E5E5E5"/>
+        </w:rPr>
+        <w:t>BY</w:t>
+      </w:r>
+      <w:r>
+        <w:rPr>
+          <w:rFonts w:ascii="Courier New" w:hAnsi="Courier New" w:cs="Courier New"/>
+          <w:color w:val="444444"/>
+          <w:sz w:val="20"/>
+          <w:szCs w:val="20"/>
+          <w:shd w:val="clear" w:color="auto" w:fill="E5E5E5"/>
+        </w:rPr>
+        <w:t> movie_count </w:t>
+      </w:r>
+      <w:r>
+        <w:rPr>
+          <w:rStyle w:val="cm-keyword"/>
+          <w:rFonts w:ascii="Courier New" w:hAnsi="Courier New" w:cs="Courier New"/>
+          <w:color w:val="770088"/>
+          <w:sz w:val="20"/>
+          <w:szCs w:val="20"/>
+          <w:shd w:val="clear" w:color="auto" w:fill="E5E5E5"/>
+        </w:rPr>
+        <w:t>DESC</w:t>
+      </w:r>
+      <w:r>
+        <w:rPr>
+          <w:rStyle w:val="cm-bracket"/>
+          <w:rFonts w:ascii="Courier New" w:hAnsi="Courier New" w:cs="Courier New"/>
+          <w:color w:val="999977"/>
+          <w:sz w:val="20"/>
+          <w:szCs w:val="20"/>
+          <w:shd w:val="clear" w:color="auto" w:fill="E5E5E5"/>
+        </w:rPr>
+        <w:t>)</w:t>
+      </w:r>
+      <w:r>
+        <w:rPr>
+          <w:rFonts w:ascii="Courier New" w:hAnsi="Courier New" w:cs="Courier New"/>
+          <w:color w:val="444444"/>
+          <w:sz w:val="20"/>
+          <w:szCs w:val="20"/>
+          <w:shd w:val="clear" w:color="auto" w:fill="E5E5E5"/>
+        </w:rPr>
+        <w:t> </w:t>
+      </w:r>
+      <w:r>
+        <w:rPr>
+          <w:rStyle w:val="cm-keyword"/>
+          <w:rFonts w:ascii="Courier New" w:hAnsi="Courier New" w:cs="Courier New"/>
+          <w:color w:val="770088"/>
+          <w:sz w:val="20"/>
+          <w:szCs w:val="20"/>
+          <w:shd w:val="clear" w:color="auto" w:fill="E5E5E5"/>
+        </w:rPr>
+        <w:t>AS</w:t>
+      </w:r>
+      <w:r>
+        <w:rPr>
+          <w:rFonts w:ascii="Courier New" w:hAnsi="Courier New" w:cs="Courier New"/>
+          <w:color w:val="444444"/>
+          <w:sz w:val="20"/>
+          <w:szCs w:val="20"/>
+          <w:shd w:val="clear" w:color="auto" w:fill="E5E5E5"/>
+        </w:rPr>
+        <w:t> actor_rank </w:t>
+      </w:r>
+      <w:r>
+        <w:rPr>
+          <w:rStyle w:val="cm-keyword"/>
+          <w:rFonts w:ascii="Courier New" w:hAnsi="Courier New" w:cs="Courier New"/>
+          <w:color w:val="770088"/>
+          <w:sz w:val="20"/>
+          <w:szCs w:val="20"/>
+          <w:shd w:val="clear" w:color="auto" w:fill="E5E5E5"/>
+        </w:rPr>
+        <w:t>FROM</w:t>
+      </w:r>
+      <w:r>
+        <w:rPr>
+          <w:rFonts w:ascii="Courier New" w:hAnsi="Courier New" w:cs="Courier New"/>
+          <w:color w:val="444444"/>
+          <w:sz w:val="20"/>
+          <w:szCs w:val="20"/>
+          <w:shd w:val="clear" w:color="auto" w:fill="E5E5E5"/>
+        </w:rPr>
+        <w:t> </w:t>
+      </w:r>
+      <w:r>
+        <w:rPr>
+          <w:rStyle w:val="cm-bracket"/>
+          <w:rFonts w:ascii="Courier New" w:hAnsi="Courier New" w:cs="Courier New"/>
+          <w:color w:val="999977"/>
+          <w:sz w:val="20"/>
+          <w:szCs w:val="20"/>
+          <w:shd w:val="clear" w:color="auto" w:fill="E5E5E5"/>
+        </w:rPr>
+        <w:t>(</w:t>
+      </w:r>
+      <w:r>
+        <w:rPr>
+          <w:rFonts w:ascii="Courier New" w:hAnsi="Courier New" w:cs="Courier New"/>
+          <w:color w:val="444444"/>
+          <w:sz w:val="20"/>
+          <w:szCs w:val="20"/>
+          <w:shd w:val="clear" w:color="auto" w:fill="E5E5E5"/>
+        </w:rPr>
         <w:t> </w:t>
       </w:r>
       <w:hyperlink r:id="rId27" w:tgtFrame="mysql_doc" w:history="1">
-        <w:r>
-          <w:rPr>
-            <w:rStyle w:val="Hyperlink"/>
-            <w:rFonts w:ascii="Courier New" w:hAnsi="Courier New" w:cs="Courier New"/>
-            <w:sz w:val="20"/>
-            <w:szCs w:val="20"/>
-            <w:shd w:val="clear" w:color="auto" w:fill="E5E5E5"/>
-          </w:rPr>
-          <w:t>MAX</w:t>
-        </w:r>
-      </w:hyperlink>
-      <w:r>
-        <w:rPr>
-          <w:rStyle w:val="cm-bracket"/>
-          <w:rFonts w:ascii="Courier New" w:hAnsi="Courier New" w:cs="Courier New"/>
-          <w:color w:val="999977"/>
-          <w:sz w:val="20"/>
-          <w:szCs w:val="20"/>
-          <w:shd w:val="clear" w:color="auto" w:fill="E5E5E5"/>
-        </w:rPr>
-        <w:t>(</w:t>
-      </w:r>
-      <w:r>
-        <w:rPr>
-          <w:rFonts w:ascii="Courier New" w:hAnsi="Courier New" w:cs="Courier New"/>
-          <w:color w:val="444444"/>
-          <w:sz w:val="20"/>
-          <w:szCs w:val="20"/>
-          <w:shd w:val="clear" w:color="auto" w:fill="E5E5E5"/>
-        </w:rPr>
-        <w:t>runtime_mi</w:t>
-      </w:r>
-      <w:r>
-        <w:rPr>
-          <w:rStyle w:val="cm-bracket"/>
-          <w:rFonts w:ascii="Courier New" w:hAnsi="Courier New" w:cs="Courier New"/>
-          <w:color w:val="999977"/>
-          <w:sz w:val="20"/>
-          <w:szCs w:val="20"/>
-          <w:shd w:val="clear" w:color="auto" w:fill="E5E5E5"/>
-        </w:rPr>
-        <w:t>)</w:t>
-      </w:r>
-      <w:r>
-        <w:rPr>
-          <w:rFonts w:ascii="Courier New" w:hAnsi="Courier New" w:cs="Courier New"/>
-          <w:color w:val="444444"/>
-          <w:sz w:val="20"/>
-          <w:szCs w:val="20"/>
-          <w:shd w:val="clear" w:color="auto" w:fill="E5E5E5"/>
-        </w:rPr>
-        <w:t> </w:t>
-      </w:r>
-      <w:r>
-        <w:rPr>
-          <w:rStyle w:val="cm-keyword"/>
-          <w:rFonts w:ascii="Courier New" w:hAnsi="Courier New" w:cs="Courier New"/>
-          <w:color w:val="770088"/>
-          <w:sz w:val="20"/>
-          <w:szCs w:val="20"/>
-          <w:shd w:val="clear" w:color="auto" w:fill="E5E5E5"/>
-        </w:rPr>
-        <w:t>AS</w:t>
-      </w:r>
-      <w:r>
-        <w:rPr>
-          <w:rFonts w:ascii="Courier New" w:hAnsi="Courier New" w:cs="Courier New"/>
-          <w:color w:val="444444"/>
-          <w:sz w:val="20"/>
-          <w:szCs w:val="20"/>
-          <w:shd w:val="clear" w:color="auto" w:fill="E5E5E5"/>
-        </w:rPr>
-        <w:t> max_runtime_mi </w:t>
-      </w:r>
-      <w:r>
-        <w:rPr>
-          <w:rStyle w:val="cm-keyword"/>
-          <w:rFonts w:ascii="Courier New" w:hAnsi="Courier New" w:cs="Courier New"/>
-          <w:color w:val="770088"/>
-          <w:sz w:val="20"/>
-          <w:szCs w:val="20"/>
-          <w:shd w:val="clear" w:color="auto" w:fill="E5E5E5"/>
-        </w:rPr>
-        <w:t>FROM</w:t>
-      </w:r>
-      <w:r>
-        <w:rPr>
-          <w:rFonts w:ascii="Courier New" w:hAnsi="Courier New" w:cs="Courier New"/>
-          <w:color w:val="444444"/>
-          <w:sz w:val="20"/>
-          <w:szCs w:val="20"/>
-          <w:shd w:val="clear" w:color="auto" w:fill="E5E5E5"/>
-        </w:rPr>
-        <w:t> </w:t>
-      </w:r>
-      <w:r>
-        <w:rPr>
-          <w:rStyle w:val="cm-variable-2"/>
-          <w:rFonts w:ascii="Courier New" w:hAnsi="Courier New" w:cs="Courier New"/>
-          <w:color w:val="0055AA"/>
-          <w:sz w:val="20"/>
-          <w:szCs w:val="20"/>
-          <w:shd w:val="clear" w:color="auto" w:fill="E5E5E5"/>
-        </w:rPr>
-        <w:t>`imdb_movie_data`</w:t>
-      </w:r>
-      <w:r>
-        <w:rPr>
-          <w:rFonts w:ascii="Courier New" w:hAnsi="Courier New" w:cs="Courier New"/>
-          <w:color w:val="444444"/>
-          <w:sz w:val="20"/>
-          <w:szCs w:val="20"/>
-          <w:shd w:val="clear" w:color="auto" w:fill="E5E5E5"/>
-        </w:rPr>
-        <w:t> </w:t>
-      </w:r>
-      <w:r>
-        <w:rPr>
-          <w:rStyle w:val="cm-keyword"/>
-          <w:rFonts w:ascii="Courier New" w:hAnsi="Courier New" w:cs="Courier New"/>
-          <w:color w:val="770088"/>
-          <w:sz w:val="20"/>
-          <w:szCs w:val="20"/>
-          <w:shd w:val="clear" w:color="auto" w:fill="E5E5E5"/>
-        </w:rPr>
-        <w:t>GROUP</w:t>
-      </w:r>
-      <w:r>
-        <w:rPr>
-          <w:rFonts w:ascii="Courier New" w:hAnsi="Courier New" w:cs="Courier New"/>
-          <w:color w:val="444444"/>
-          <w:sz w:val="20"/>
-          <w:szCs w:val="20"/>
-          <w:shd w:val="clear" w:color="auto" w:fill="E5E5E5"/>
-        </w:rPr>
-        <w:t> </w:t>
-      </w:r>
-      <w:r>
-        <w:rPr>
-          <w:rStyle w:val="cm-keyword"/>
-          <w:rFonts w:ascii="Courier New" w:hAnsi="Courier New" w:cs="Courier New"/>
-          <w:color w:val="770088"/>
-          <w:sz w:val="20"/>
-          <w:szCs w:val="20"/>
-          <w:shd w:val="clear" w:color="auto" w:fill="E5E5E5"/>
-        </w:rPr>
-        <w:t>BY</w:t>
-      </w:r>
-      <w:r>
-        <w:rPr>
-          <w:rFonts w:ascii="Courier New" w:hAnsi="Courier New" w:cs="Courier New"/>
-          <w:color w:val="444444"/>
-          <w:sz w:val="20"/>
-          <w:szCs w:val="20"/>
-          <w:shd w:val="clear" w:color="auto" w:fill="E5E5E5"/>
-        </w:rPr>
-        <w:t> title </w:t>
-      </w:r>
-      <w:r>
-        <w:rPr>
-          <w:rStyle w:val="cm-keyword"/>
-          <w:rFonts w:ascii="Courier New" w:hAnsi="Courier New" w:cs="Courier New"/>
-          <w:color w:val="770088"/>
-          <w:sz w:val="20"/>
-          <w:szCs w:val="20"/>
-          <w:shd w:val="clear" w:color="auto" w:fill="E5E5E5"/>
-        </w:rPr>
-        <w:t>ORDER</w:t>
-      </w:r>
-      <w:r>
-        <w:rPr>
-          <w:rFonts w:ascii="Courier New" w:hAnsi="Courier New" w:cs="Courier New"/>
-          <w:color w:val="444444"/>
-          <w:sz w:val="20"/>
-          <w:szCs w:val="20"/>
-          <w:shd w:val="clear" w:color="auto" w:fill="E5E5E5"/>
-        </w:rPr>
-        <w:t> </w:t>
-      </w:r>
-      <w:r>
-        <w:rPr>
-          <w:rStyle w:val="cm-keyword"/>
-          <w:rFonts w:ascii="Courier New" w:hAnsi="Courier New" w:cs="Courier New"/>
-          <w:color w:val="770088"/>
-          <w:sz w:val="20"/>
-          <w:szCs w:val="20"/>
-          <w:shd w:val="clear" w:color="auto" w:fill="E5E5E5"/>
-        </w:rPr>
-        <w:t>BY</w:t>
-      </w:r>
-      <w:r>
-        <w:rPr>
-          <w:rFonts w:ascii="Courier New" w:hAnsi="Courier New" w:cs="Courier New"/>
-          <w:color w:val="444444"/>
-          <w:sz w:val="20"/>
-          <w:szCs w:val="20"/>
-          <w:shd w:val="clear" w:color="auto" w:fill="E5E5E5"/>
-        </w:rPr>
-        <w:t> max_runtime_mi </w:t>
-      </w:r>
-      <w:r>
-        <w:rPr>
-          <w:rStyle w:val="cm-keyword"/>
-          <w:rFonts w:ascii="Courier New" w:hAnsi="Courier New" w:cs="Courier New"/>
-          <w:color w:val="770088"/>
-          <w:sz w:val="20"/>
-          <w:szCs w:val="20"/>
-          <w:shd w:val="clear" w:color="auto" w:fill="E5E5E5"/>
-        </w:rPr>
-        <w:t>DESC</w:t>
-      </w:r>
-      <w:r>
-        <w:rPr>
-          <w:rFonts w:ascii="Courier New" w:hAnsi="Courier New" w:cs="Courier New"/>
-          <w:color w:val="444444"/>
-          <w:sz w:val="20"/>
-          <w:szCs w:val="20"/>
-          <w:shd w:val="clear" w:color="auto" w:fill="E5E5E5"/>
-        </w:rPr>
-        <w:t> </w:t>
-      </w:r>
-      <w:r>
-        <w:rPr>
-          <w:rStyle w:val="cm-keyword"/>
-          <w:rFonts w:ascii="Courier New" w:hAnsi="Courier New" w:cs="Courier New"/>
-          <w:color w:val="770088"/>
-          <w:sz w:val="20"/>
-          <w:szCs w:val="20"/>
-          <w:shd w:val="clear" w:color="auto" w:fill="E5E5E5"/>
-        </w:rPr>
-        <w:t>LIMIT</w:t>
-      </w:r>
-      <w:r>
-        <w:rPr>
-          <w:rFonts w:ascii="Courier New" w:hAnsi="Courier New" w:cs="Courier New"/>
-          <w:color w:val="444444"/>
-          <w:sz w:val="20"/>
-          <w:szCs w:val="20"/>
-          <w:shd w:val="clear" w:color="auto" w:fill="E5E5E5"/>
-        </w:rPr>
-        <w:t> </w:t>
-      </w:r>
-      <w:r>
-        <w:rPr>
-          <w:rStyle w:val="cm-number"/>
-          <w:rFonts w:ascii="Courier New" w:hAnsi="Courier New" w:cs="Courier New"/>
-          <w:color w:val="116644"/>
-          <w:sz w:val="20"/>
-          <w:szCs w:val="20"/>
-          <w:shd w:val="clear" w:color="auto" w:fill="E5E5E5"/>
-        </w:rPr>
-        <w:t>0</w:t>
-      </w:r>
-      <w:r>
-        <w:rPr>
-          <w:rStyle w:val="cm-punctuation"/>
-          <w:rFonts w:ascii="Courier New" w:hAnsi="Courier New" w:cs="Courier New"/>
-          <w:color w:val="444444"/>
-          <w:sz w:val="20"/>
-          <w:szCs w:val="20"/>
-          <w:shd w:val="clear" w:color="auto" w:fill="E5E5E5"/>
-        </w:rPr>
-        <w:t>,</w:t>
-      </w:r>
-      <w:r>
-        <w:rPr>
-          <w:rFonts w:ascii="Courier New" w:hAnsi="Courier New" w:cs="Courier New"/>
-          <w:color w:val="444444"/>
-          <w:sz w:val="20"/>
-          <w:szCs w:val="20"/>
-          <w:shd w:val="clear" w:color="auto" w:fill="E5E5E5"/>
-        </w:rPr>
-        <w:t> </w:t>
-      </w:r>
-      <w:r>
-        <w:rPr>
-          <w:rStyle w:val="cm-number"/>
-          <w:rFonts w:ascii="Courier New" w:hAnsi="Courier New" w:cs="Courier New"/>
-          <w:color w:val="116644"/>
-          <w:sz w:val="20"/>
-          <w:szCs w:val="20"/>
-          <w:shd w:val="clear" w:color="auto" w:fill="E5E5E5"/>
-        </w:rPr>
-        <w:t>10</w:t>
-      </w:r>
-      <w:r>
-        <w:rPr>
-          <w:rStyle w:val="cm-punctuation"/>
-          <w:rFonts w:ascii="Courier New" w:hAnsi="Courier New" w:cs="Courier New"/>
-          <w:color w:val="444444"/>
-          <w:sz w:val="20"/>
-          <w:szCs w:val="20"/>
-          <w:shd w:val="clear" w:color="auto" w:fill="E5E5E5"/>
-        </w:rPr>
-        <w:t>;</w:t>
-      </w:r>
-    </w:p>
-    <w:p>
-      <w:pPr>
-        <w:rPr>
-          <w:sz w:val="24"/>
-          <w:szCs w:val="24"/>
-        </w:rPr>
-      </w:pPr>
-      <w:r>
-        <w:rPr>
-          <w:noProof/>
-          <w:sz w:val="24"/>
-          <w:szCs w:val="24"/>
-        </w:rPr>
-        <w:drawing>
-          <wp:inline distT="0" distB="0" distL="0" distR="0" wp14:anchorId="61729AE5" wp14:editId="7D54BF74">
-            <wp:extent cx="5724525" cy="2705100"/>
-            <wp:effectExtent l="0" t="0" r="9525" b="0"/>
-            <wp:docPr id="1167169981" name="Picture 2"/>
-            <wp:cNvGraphicFramePr>
-              <a:graphicFrameLocks xmlns:a="http://schemas.openxmlformats.org/drawingml/2006/main" noChangeAspect="1"/>
-            </wp:cNvGraphicFramePr>
-            <a:graphic xmlns:a="http://schemas.openxmlformats.org/drawingml/2006/main">
-              <a:graphicData uri="http://schemas.openxmlformats.org/drawingml/2006/picture">
-                <pic:pic xmlns:pic="http://schemas.openxmlformats.org/drawingml/2006/picture">
-                  <pic:nvPicPr>
-                    <pic:cNvPr id="0" name="Picture 2"/>
-                    <pic:cNvPicPr>
-                      <a:picLocks noChangeAspect="1" noChangeArrowheads="1"/>
-                    </pic:cNvPicPr>
-                  </pic:nvPicPr>
-                  <pic:blipFill>
-                    <a:blip r:embed="rId28">
-                      <a:extLst>
-                        <a:ext uri="{28A0092B-C50C-407E-A947-70E740481C1C}">
-                          <a14:useLocalDpi xmlns:a14="http://schemas.microsoft.com/office/drawing/2010/main" val="0"/>
-                        </a:ext>
-                      </a:extLst>
-                    </a:blip>
-                    <a:srcRect/>
-                    <a:stretch>
-                      <a:fillRect/>
-                    </a:stretch>
-                  </pic:blipFill>
-                  <pic:spPr bwMode="auto">
-                    <a:xfrm>
-                      <a:off x="0" y="0"/>
-                      <a:ext cx="5724525" cy="2705100"/>
-                    </a:xfrm>
-                    <a:prstGeom prst="rect">
-                      <a:avLst/>
-                    </a:prstGeom>
-                    <a:noFill/>
-                    <a:ln>
-                      <a:noFill/>
-                    </a:ln>
-                  </pic:spPr>
-                </pic:pic>
-              </a:graphicData>
-            </a:graphic>
-          </wp:inline>
-        </w:drawing>
-      </w:r>
-    </w:p>
-    <w:p>
-      <w:pPr>
-        <w:rPr>
-          <w:b/>
-          <w:bCs/>
-          <w:sz w:val="24"/>
-          <w:szCs w:val="24"/>
-        </w:rPr>
-      </w:pPr>
-    </w:p>
-    <w:p>
-      <w:pPr>
-        <w:rPr>
-          <w:b/>
-          <w:bCs/>
-          <w:sz w:val="24"/>
-          <w:szCs w:val="24"/>
-        </w:rPr>
-      </w:pPr>
-    </w:p>
-    <w:p>
-      <w:pPr>
-        <w:rPr>
-          <w:b/>
-          <w:bCs/>
-          <w:sz w:val="24"/>
-          <w:szCs w:val="24"/>
-        </w:rPr>
-      </w:pPr>
-    </w:p>
-    <w:p>
-      <w:pPr>
-        <w:rPr>
-          <w:b/>
-          <w:bCs/>
-          <w:sz w:val="24"/>
-          <w:szCs w:val="24"/>
-        </w:rPr>
-      </w:pPr>
-    </w:p>
-    <w:p>
-      <w:pPr>
-        <w:rPr>
-          <w:b/>
-          <w:bCs/>
-          <w:sz w:val="24"/>
-          <w:szCs w:val="24"/>
-        </w:rPr>
-      </w:pPr>
-    </w:p>
-    <w:p>
-      <w:pPr>
-        <w:rPr>
-          <w:b/>
-          <w:bCs/>
-          <w:sz w:val="24"/>
-          <w:szCs w:val="24"/>
-        </w:rPr>
-      </w:pPr>
-    </w:p>
-    <w:p>
-      <w:pPr>
-        <w:rPr>
-          <w:b/>
-          <w:bCs/>
-          <w:sz w:val="24"/>
-          <w:szCs w:val="24"/>
-        </w:rPr>
-      </w:pPr>
-      <w:r>
-        <w:rPr>
-          <w:b/>
-          <w:bCs/>
-          <w:sz w:val="24"/>
-          <w:szCs w:val="24"/>
-        </w:rPr>
-        <w:lastRenderedPageBreak/>
-        <w:t xml:space="preserve">#TOP 10 </w:t>
-      </w:r>
-      <w:r>
-        <w:rPr>
-          <w:b/>
-          <w:bCs/>
-          <w:sz w:val="24"/>
-          <w:szCs w:val="24"/>
-        </w:rPr>
-        <w:t>ACTORS</w:t>
-      </w:r>
-      <w:r>
-        <w:rPr>
-          <w:b/>
-          <w:bCs/>
-          <w:sz w:val="24"/>
-          <w:szCs w:val="24"/>
-        </w:rPr>
-        <w:t xml:space="preserve"> BY THEIR </w:t>
-      </w:r>
-      <w:r>
-        <w:rPr>
-          <w:b/>
-          <w:bCs/>
-          <w:sz w:val="24"/>
-          <w:szCs w:val="24"/>
-        </w:rPr>
-        <w:t>MOVIES COUNT</w:t>
-      </w:r>
-    </w:p>
-    <w:p>
-      <w:pPr>
-        <w:rPr>
-          <w:rStyle w:val="cm-punctuation"/>
-          <w:rFonts w:ascii="Courier New" w:hAnsi="Courier New" w:cs="Courier New"/>
-          <w:color w:val="444444"/>
-          <w:sz w:val="20"/>
-          <w:szCs w:val="20"/>
-          <w:shd w:val="clear" w:color="auto" w:fill="E5E5E5"/>
-        </w:rPr>
-      </w:pPr>
-      <w:hyperlink r:id="rId29" w:tgtFrame="mysql_doc" w:history="1">
         <w:r>
           <w:rPr>
             <w:rStyle w:val="Hyperlink"/>
@@ -3431,7 +3985,7 @@
           <w:szCs w:val="20"/>
           <w:shd w:val="clear" w:color="auto" w:fill="E5E5E5"/>
         </w:rPr>
-        <w:t> main_actors</w:t>
+        <w:t> main_actor</w:t>
       </w:r>
       <w:r>
         <w:rPr>
@@ -3454,7 +4008,7 @@
         </w:rPr>
         <w:t> </w:t>
       </w:r>
-      <w:hyperlink r:id="rId30" w:tgtFrame="mysql_doc" w:history="1">
+      <w:hyperlink r:id="rId28" w:tgtFrame="mysql_doc" w:history="1">
         <w:r>
           <w:rPr>
             <w:rStyle w:val="Hyperlink"/>
@@ -3528,7 +4082,7 @@
           <w:szCs w:val="20"/>
           <w:shd w:val="clear" w:color="auto" w:fill="E5E5E5"/>
         </w:rPr>
-        <w:t> total_movies </w:t>
+        <w:t> movie_count </w:t>
       </w:r>
       <w:r>
         <w:rPr>
@@ -3549,28 +4103,7 @@
           <w:szCs w:val="20"/>
           <w:shd w:val="clear" w:color="auto" w:fill="E5E5E5"/>
         </w:rPr>
-        <w:t> </w:t>
-      </w:r>
-      <w:r>
-        <w:rPr>
-          <w:rStyle w:val="cm-variable-2"/>
-          <w:rFonts w:ascii="Courier New" w:hAnsi="Courier New" w:cs="Courier New"/>
-          <w:color w:val="0055AA"/>
-          <w:sz w:val="20"/>
-          <w:szCs w:val="20"/>
-          <w:shd w:val="clear" w:color="auto" w:fill="E5E5E5"/>
-        </w:rPr>
-        <w:t>`imdb_movie_data`</w:t>
-      </w:r>
-      <w:r>
-        <w:rPr>
-          <w:rFonts w:ascii="Courier New" w:hAnsi="Courier New" w:cs="Courier New"/>
-          <w:color w:val="444444"/>
-          <w:sz w:val="20"/>
-          <w:szCs w:val="20"/>
-          <w:shd w:val="clear" w:color="auto" w:fill="E5E5E5"/>
-        </w:rPr>
-        <w:t> </w:t>
+        <w:t> imdb_movie_data </w:t>
       </w:r>
       <w:r>
         <w:rPr>
@@ -3612,134 +4145,28 @@
           <w:szCs w:val="20"/>
           <w:shd w:val="clear" w:color="auto" w:fill="E5E5E5"/>
         </w:rPr>
-        <w:t> main_actors </w:t>
-      </w:r>
-      <w:r>
-        <w:rPr>
-          <w:rStyle w:val="cm-keyword"/>
-          <w:rFonts w:ascii="Courier New" w:hAnsi="Courier New" w:cs="Courier New"/>
-          <w:color w:val="770088"/>
-          <w:sz w:val="20"/>
-          <w:szCs w:val="20"/>
-          <w:shd w:val="clear" w:color="auto" w:fill="E5E5E5"/>
-        </w:rPr>
-        <w:t>ORDER</w:t>
-      </w:r>
-      <w:r>
-        <w:rPr>
-          <w:rFonts w:ascii="Courier New" w:hAnsi="Courier New" w:cs="Courier New"/>
-          <w:color w:val="444444"/>
-          <w:sz w:val="20"/>
-          <w:szCs w:val="20"/>
-          <w:shd w:val="clear" w:color="auto" w:fill="E5E5E5"/>
-        </w:rPr>
-        <w:t> </w:t>
-      </w:r>
-      <w:r>
-        <w:rPr>
-          <w:rStyle w:val="cm-keyword"/>
-          <w:rFonts w:ascii="Courier New" w:hAnsi="Courier New" w:cs="Courier New"/>
-          <w:color w:val="770088"/>
-          <w:sz w:val="20"/>
-          <w:szCs w:val="20"/>
-          <w:shd w:val="clear" w:color="auto" w:fill="E5E5E5"/>
-        </w:rPr>
-        <w:t>BY</w:t>
-      </w:r>
-      <w:r>
-        <w:rPr>
-          <w:rFonts w:ascii="Courier New" w:hAnsi="Courier New" w:cs="Courier New"/>
-          <w:color w:val="444444"/>
-          <w:sz w:val="20"/>
-          <w:szCs w:val="20"/>
-          <w:shd w:val="clear" w:color="auto" w:fill="E5E5E5"/>
-        </w:rPr>
-        <w:t> total_movies </w:t>
-      </w:r>
-      <w:r>
-        <w:rPr>
-          <w:rStyle w:val="cm-keyword"/>
-          <w:rFonts w:ascii="Courier New" w:hAnsi="Courier New" w:cs="Courier New"/>
-          <w:color w:val="770088"/>
-          <w:sz w:val="20"/>
-          <w:szCs w:val="20"/>
-          <w:shd w:val="clear" w:color="auto" w:fill="E5E5E5"/>
-        </w:rPr>
-        <w:t>DESC</w:t>
-      </w:r>
-      <w:r>
-        <w:rPr>
-          <w:rFonts w:ascii="Courier New" w:hAnsi="Courier New" w:cs="Courier New"/>
-          <w:color w:val="444444"/>
-          <w:sz w:val="20"/>
-          <w:szCs w:val="20"/>
-          <w:shd w:val="clear" w:color="auto" w:fill="E5E5E5"/>
-        </w:rPr>
-        <w:t> </w:t>
-      </w:r>
-      <w:r>
-        <w:rPr>
-          <w:rStyle w:val="cm-keyword"/>
-          <w:rFonts w:ascii="Courier New" w:hAnsi="Courier New" w:cs="Courier New"/>
-          <w:color w:val="770088"/>
-          <w:sz w:val="20"/>
-          <w:szCs w:val="20"/>
-          <w:shd w:val="clear" w:color="auto" w:fill="E5E5E5"/>
-        </w:rPr>
-        <w:t>LIMIT</w:t>
-      </w:r>
-      <w:r>
-        <w:rPr>
-          <w:rFonts w:ascii="Courier New" w:hAnsi="Courier New" w:cs="Courier New"/>
-          <w:color w:val="444444"/>
-          <w:sz w:val="20"/>
-          <w:szCs w:val="20"/>
-          <w:shd w:val="clear" w:color="auto" w:fill="E5E5E5"/>
-        </w:rPr>
-        <w:t> </w:t>
-      </w:r>
-      <w:r>
-        <w:rPr>
-          <w:rStyle w:val="cm-number"/>
-          <w:rFonts w:ascii="Courier New" w:hAnsi="Courier New" w:cs="Courier New"/>
-          <w:color w:val="116644"/>
-          <w:sz w:val="20"/>
-          <w:szCs w:val="20"/>
-          <w:shd w:val="clear" w:color="auto" w:fill="E5E5E5"/>
-        </w:rPr>
-        <w:t>0</w:t>
-      </w:r>
-      <w:r>
-        <w:rPr>
-          <w:rFonts w:ascii="Courier New" w:hAnsi="Courier New" w:cs="Courier New"/>
-          <w:color w:val="444444"/>
-          <w:sz w:val="20"/>
-          <w:szCs w:val="20"/>
-          <w:shd w:val="clear" w:color="auto" w:fill="E5E5E5"/>
-        </w:rPr>
-        <w:t> </w:t>
-      </w:r>
-      <w:r>
-        <w:rPr>
-          <w:rStyle w:val="cm-punctuation"/>
-          <w:rFonts w:ascii="Courier New" w:hAnsi="Courier New" w:cs="Courier New"/>
-          <w:color w:val="444444"/>
-          <w:sz w:val="20"/>
-          <w:szCs w:val="20"/>
-          <w:shd w:val="clear" w:color="auto" w:fill="E5E5E5"/>
-        </w:rPr>
-        <w:t>,</w:t>
-      </w:r>
-      <w:r>
-        <w:rPr>
-          <w:rStyle w:val="cm-number"/>
-          <w:rFonts w:ascii="Courier New" w:hAnsi="Courier New" w:cs="Courier New"/>
-          <w:color w:val="116644"/>
-          <w:sz w:val="20"/>
-          <w:szCs w:val="20"/>
-          <w:shd w:val="clear" w:color="auto" w:fill="E5E5E5"/>
-        </w:rPr>
-        <w:t>10</w:t>
+        <w:t> main_actor </w:t>
+      </w:r>
+      <w:r>
+        <w:rPr>
+          <w:rStyle w:val="cm-bracket"/>
+          <w:rFonts w:ascii="Courier New" w:hAnsi="Courier New" w:cs="Courier New"/>
+          <w:color w:val="999977"/>
+          <w:sz w:val="20"/>
+          <w:szCs w:val="20"/>
+          <w:shd w:val="clear" w:color="auto" w:fill="E5E5E5"/>
+        </w:rPr>
+        <w:t>)</w:t>
+      </w:r>
+      <w:r>
+        <w:rPr>
+          <w:rFonts w:ascii="Courier New" w:hAnsi="Courier New" w:cs="Courier New"/>
+          <w:color w:val="444444"/>
+          <w:sz w:val="20"/>
+          <w:szCs w:val="20"/>
+          <w:shd w:val="clear" w:color="auto" w:fill="E5E5E5"/>
+        </w:rPr>
+        <w:t> t</w:t>
       </w:r>
       <w:r>
         <w:rPr>
@@ -3760,1269 +4187,6 @@
           <w:szCs w:val="24"/>
         </w:rPr>
       </w:pPr>
-      <w:r>
-        <w:rPr>
-          <w:noProof/>
-          <w:sz w:val="24"/>
-          <w:szCs w:val="24"/>
-        </w:rPr>
-        <w:drawing>
-          <wp:inline distT="0" distB="0" distL="0" distR="0" wp14:anchorId="0BA6753C" wp14:editId="0ABAD5EA">
-            <wp:extent cx="5724525" cy="2362200"/>
-            <wp:effectExtent l="0" t="0" r="9525" b="0"/>
-            <wp:docPr id="892946520" name="Picture 4"/>
-            <wp:cNvGraphicFramePr>
-              <a:graphicFrameLocks xmlns:a="http://schemas.openxmlformats.org/drawingml/2006/main" noChangeAspect="1"/>
-            </wp:cNvGraphicFramePr>
-            <a:graphic xmlns:a="http://schemas.openxmlformats.org/drawingml/2006/main">
-              <a:graphicData uri="http://schemas.openxmlformats.org/drawingml/2006/picture">
-                <pic:pic xmlns:pic="http://schemas.openxmlformats.org/drawingml/2006/picture">
-                  <pic:nvPicPr>
-                    <pic:cNvPr id="0" name="Picture 4"/>
-                    <pic:cNvPicPr>
-                      <a:picLocks noChangeAspect="1" noChangeArrowheads="1"/>
-                    </pic:cNvPicPr>
-                  </pic:nvPicPr>
-                  <pic:blipFill>
-                    <a:blip r:embed="rId31">
-                      <a:extLst>
-                        <a:ext uri="{28A0092B-C50C-407E-A947-70E740481C1C}">
-                          <a14:useLocalDpi xmlns:a14="http://schemas.microsoft.com/office/drawing/2010/main" val="0"/>
-                        </a:ext>
-                      </a:extLst>
-                    </a:blip>
-                    <a:srcRect/>
-                    <a:stretch>
-                      <a:fillRect/>
-                    </a:stretch>
-                  </pic:blipFill>
-                  <pic:spPr bwMode="auto">
-                    <a:xfrm>
-                      <a:off x="0" y="0"/>
-                      <a:ext cx="5724525" cy="2362200"/>
-                    </a:xfrm>
-                    <a:prstGeom prst="rect">
-                      <a:avLst/>
-                    </a:prstGeom>
-                    <a:noFill/>
-                    <a:ln>
-                      <a:noFill/>
-                    </a:ln>
-                  </pic:spPr>
-                </pic:pic>
-              </a:graphicData>
-            </a:graphic>
-          </wp:inline>
-        </w:drawing>
-      </w:r>
-    </w:p>
-    <w:p>
-      <w:pPr>
-        <w:rPr>
-          <w:b/>
-          <w:bCs/>
-          <w:sz w:val="24"/>
-          <w:szCs w:val="24"/>
-        </w:rPr>
-      </w:pPr>
-    </w:p>
-    <w:p>
-      <w:pPr>
-        <w:rPr>
-          <w:b/>
-          <w:bCs/>
-          <w:sz w:val="24"/>
-          <w:szCs w:val="24"/>
-        </w:rPr>
-      </w:pPr>
-      <w:r>
-        <w:rPr>
-          <w:b/>
-          <w:bCs/>
-          <w:sz w:val="24"/>
-          <w:szCs w:val="24"/>
-        </w:rPr>
-        <w:t>#TOP 10 MOVIES WHO GOT MAX VOTES</w:t>
-      </w:r>
-    </w:p>
-    <w:p>
-      <w:pPr>
-        <w:rPr>
-          <w:rStyle w:val="cm-punctuation"/>
-          <w:rFonts w:ascii="Courier New" w:hAnsi="Courier New" w:cs="Courier New"/>
-          <w:color w:val="444444"/>
-          <w:sz w:val="20"/>
-          <w:szCs w:val="20"/>
-          <w:shd w:val="clear" w:color="auto" w:fill="E5E5E5"/>
-        </w:rPr>
-      </w:pPr>
-      <w:hyperlink r:id="rId32" w:tgtFrame="mysql_doc" w:history="1">
-        <w:r>
-          <w:rPr>
-            <w:rStyle w:val="Hyperlink"/>
-            <w:rFonts w:ascii="Courier New" w:hAnsi="Courier New" w:cs="Courier New"/>
-            <w:sz w:val="20"/>
-            <w:szCs w:val="20"/>
-            <w:shd w:val="clear" w:color="auto" w:fill="E5E5E5"/>
-          </w:rPr>
-          <w:t>SELECT</w:t>
-        </w:r>
-      </w:hyperlink>
-      <w:r>
-        <w:rPr>
-          <w:rFonts w:ascii="Courier New" w:hAnsi="Courier New" w:cs="Courier New"/>
-          <w:color w:val="444444"/>
-          <w:sz w:val="20"/>
-          <w:szCs w:val="20"/>
-          <w:shd w:val="clear" w:color="auto" w:fill="E5E5E5"/>
-        </w:rPr>
-        <w:t> title</w:t>
-      </w:r>
-      <w:r>
-        <w:rPr>
-          <w:rStyle w:val="cm-punctuation"/>
-          <w:rFonts w:ascii="Courier New" w:hAnsi="Courier New" w:cs="Courier New"/>
-          <w:color w:val="444444"/>
-          <w:sz w:val="20"/>
-          <w:szCs w:val="20"/>
-          <w:shd w:val="clear" w:color="auto" w:fill="E5E5E5"/>
-        </w:rPr>
-        <w:t>,</w:t>
-      </w:r>
-      <w:r>
-        <w:rPr>
-          <w:rFonts w:ascii="Courier New" w:hAnsi="Courier New" w:cs="Courier New"/>
-          <w:color w:val="444444"/>
-          <w:sz w:val="20"/>
-          <w:szCs w:val="20"/>
-          <w:shd w:val="clear" w:color="auto" w:fill="E5E5E5"/>
-        </w:rPr>
-        <w:t> </w:t>
-      </w:r>
-      <w:hyperlink r:id="rId33" w:tgtFrame="mysql_doc" w:history="1">
-        <w:r>
-          <w:rPr>
-            <w:rStyle w:val="Hyperlink"/>
-            <w:rFonts w:ascii="Courier New" w:hAnsi="Courier New" w:cs="Courier New"/>
-            <w:sz w:val="20"/>
-            <w:szCs w:val="20"/>
-            <w:shd w:val="clear" w:color="auto" w:fill="E5E5E5"/>
-          </w:rPr>
-          <w:t>MAX</w:t>
-        </w:r>
-      </w:hyperlink>
-      <w:r>
-        <w:rPr>
-          <w:rStyle w:val="cm-bracket"/>
-          <w:rFonts w:ascii="Courier New" w:hAnsi="Courier New" w:cs="Courier New"/>
-          <w:color w:val="999977"/>
-          <w:sz w:val="20"/>
-          <w:szCs w:val="20"/>
-          <w:shd w:val="clear" w:color="auto" w:fill="E5E5E5"/>
-        </w:rPr>
-        <w:t>(</w:t>
-      </w:r>
-      <w:r>
-        <w:rPr>
-          <w:rFonts w:ascii="Courier New" w:hAnsi="Courier New" w:cs="Courier New"/>
-          <w:color w:val="444444"/>
-          <w:sz w:val="20"/>
-          <w:szCs w:val="20"/>
-          <w:shd w:val="clear" w:color="auto" w:fill="E5E5E5"/>
-        </w:rPr>
-        <w:t>votes</w:t>
-      </w:r>
-      <w:r>
-        <w:rPr>
-          <w:rStyle w:val="cm-bracket"/>
-          <w:rFonts w:ascii="Courier New" w:hAnsi="Courier New" w:cs="Courier New"/>
-          <w:color w:val="999977"/>
-          <w:sz w:val="20"/>
-          <w:szCs w:val="20"/>
-          <w:shd w:val="clear" w:color="auto" w:fill="E5E5E5"/>
-        </w:rPr>
-        <w:t>)</w:t>
-      </w:r>
-      <w:r>
-        <w:rPr>
-          <w:rFonts w:ascii="Courier New" w:hAnsi="Courier New" w:cs="Courier New"/>
-          <w:color w:val="444444"/>
-          <w:sz w:val="20"/>
-          <w:szCs w:val="20"/>
-          <w:shd w:val="clear" w:color="auto" w:fill="E5E5E5"/>
-        </w:rPr>
-        <w:t> </w:t>
-      </w:r>
-      <w:r>
-        <w:rPr>
-          <w:rStyle w:val="cm-keyword"/>
-          <w:rFonts w:ascii="Courier New" w:hAnsi="Courier New" w:cs="Courier New"/>
-          <w:color w:val="770088"/>
-          <w:sz w:val="20"/>
-          <w:szCs w:val="20"/>
-          <w:shd w:val="clear" w:color="auto" w:fill="E5E5E5"/>
-        </w:rPr>
-        <w:t>AS</w:t>
-      </w:r>
-      <w:r>
-        <w:rPr>
-          <w:rFonts w:ascii="Courier New" w:hAnsi="Courier New" w:cs="Courier New"/>
-          <w:color w:val="444444"/>
-          <w:sz w:val="20"/>
-          <w:szCs w:val="20"/>
-          <w:shd w:val="clear" w:color="auto" w:fill="E5E5E5"/>
-        </w:rPr>
-        <w:t> max_votes </w:t>
-      </w:r>
-      <w:r>
-        <w:rPr>
-          <w:rStyle w:val="cm-keyword"/>
-          <w:rFonts w:ascii="Courier New" w:hAnsi="Courier New" w:cs="Courier New"/>
-          <w:color w:val="770088"/>
-          <w:sz w:val="20"/>
-          <w:szCs w:val="20"/>
-          <w:shd w:val="clear" w:color="auto" w:fill="E5E5E5"/>
-        </w:rPr>
-        <w:t>FROM</w:t>
-      </w:r>
-      <w:r>
-        <w:rPr>
-          <w:rFonts w:ascii="Courier New" w:hAnsi="Courier New" w:cs="Courier New"/>
-          <w:color w:val="444444"/>
-          <w:sz w:val="20"/>
-          <w:szCs w:val="20"/>
-          <w:shd w:val="clear" w:color="auto" w:fill="E5E5E5"/>
-        </w:rPr>
-        <w:t> </w:t>
-      </w:r>
-      <w:r>
-        <w:rPr>
-          <w:rStyle w:val="cm-variable-2"/>
-          <w:rFonts w:ascii="Courier New" w:hAnsi="Courier New" w:cs="Courier New"/>
-          <w:color w:val="0055AA"/>
-          <w:sz w:val="20"/>
-          <w:szCs w:val="20"/>
-          <w:shd w:val="clear" w:color="auto" w:fill="E5E5E5"/>
-        </w:rPr>
-        <w:t>`imdb_movie_data`</w:t>
-      </w:r>
-      <w:r>
-        <w:rPr>
-          <w:rFonts w:ascii="Courier New" w:hAnsi="Courier New" w:cs="Courier New"/>
-          <w:color w:val="444444"/>
-          <w:sz w:val="20"/>
-          <w:szCs w:val="20"/>
-          <w:shd w:val="clear" w:color="auto" w:fill="E5E5E5"/>
-        </w:rPr>
-        <w:t> </w:t>
-      </w:r>
-      <w:r>
-        <w:rPr>
-          <w:rStyle w:val="cm-keyword"/>
-          <w:rFonts w:ascii="Courier New" w:hAnsi="Courier New" w:cs="Courier New"/>
-          <w:color w:val="770088"/>
-          <w:sz w:val="20"/>
-          <w:szCs w:val="20"/>
-          <w:shd w:val="clear" w:color="auto" w:fill="E5E5E5"/>
-        </w:rPr>
-        <w:t>GROUP</w:t>
-      </w:r>
-      <w:r>
-        <w:rPr>
-          <w:rFonts w:ascii="Courier New" w:hAnsi="Courier New" w:cs="Courier New"/>
-          <w:color w:val="444444"/>
-          <w:sz w:val="20"/>
-          <w:szCs w:val="20"/>
-          <w:shd w:val="clear" w:color="auto" w:fill="E5E5E5"/>
-        </w:rPr>
-        <w:t> </w:t>
-      </w:r>
-      <w:r>
-        <w:rPr>
-          <w:rStyle w:val="cm-keyword"/>
-          <w:rFonts w:ascii="Courier New" w:hAnsi="Courier New" w:cs="Courier New"/>
-          <w:color w:val="770088"/>
-          <w:sz w:val="20"/>
-          <w:szCs w:val="20"/>
-          <w:shd w:val="clear" w:color="auto" w:fill="E5E5E5"/>
-        </w:rPr>
-        <w:t>BY</w:t>
-      </w:r>
-      <w:r>
-        <w:rPr>
-          <w:rFonts w:ascii="Courier New" w:hAnsi="Courier New" w:cs="Courier New"/>
-          <w:color w:val="444444"/>
-          <w:sz w:val="20"/>
-          <w:szCs w:val="20"/>
-          <w:shd w:val="clear" w:color="auto" w:fill="E5E5E5"/>
-        </w:rPr>
-        <w:t> title </w:t>
-      </w:r>
-      <w:r>
-        <w:rPr>
-          <w:rStyle w:val="cm-keyword"/>
-          <w:rFonts w:ascii="Courier New" w:hAnsi="Courier New" w:cs="Courier New"/>
-          <w:color w:val="770088"/>
-          <w:sz w:val="20"/>
-          <w:szCs w:val="20"/>
-          <w:shd w:val="clear" w:color="auto" w:fill="E5E5E5"/>
-        </w:rPr>
-        <w:t>ORDER</w:t>
-      </w:r>
-      <w:r>
-        <w:rPr>
-          <w:rFonts w:ascii="Courier New" w:hAnsi="Courier New" w:cs="Courier New"/>
-          <w:color w:val="444444"/>
-          <w:sz w:val="20"/>
-          <w:szCs w:val="20"/>
-          <w:shd w:val="clear" w:color="auto" w:fill="E5E5E5"/>
-        </w:rPr>
-        <w:t> </w:t>
-      </w:r>
-      <w:r>
-        <w:rPr>
-          <w:rStyle w:val="cm-keyword"/>
-          <w:rFonts w:ascii="Courier New" w:hAnsi="Courier New" w:cs="Courier New"/>
-          <w:color w:val="770088"/>
-          <w:sz w:val="20"/>
-          <w:szCs w:val="20"/>
-          <w:shd w:val="clear" w:color="auto" w:fill="E5E5E5"/>
-        </w:rPr>
-        <w:t>BY</w:t>
-      </w:r>
-      <w:r>
-        <w:rPr>
-          <w:rFonts w:ascii="Courier New" w:hAnsi="Courier New" w:cs="Courier New"/>
-          <w:color w:val="444444"/>
-          <w:sz w:val="20"/>
-          <w:szCs w:val="20"/>
-          <w:shd w:val="clear" w:color="auto" w:fill="E5E5E5"/>
-        </w:rPr>
-        <w:t> max_votes </w:t>
-      </w:r>
-      <w:r>
-        <w:rPr>
-          <w:rStyle w:val="cm-keyword"/>
-          <w:rFonts w:ascii="Courier New" w:hAnsi="Courier New" w:cs="Courier New"/>
-          <w:color w:val="770088"/>
-          <w:sz w:val="20"/>
-          <w:szCs w:val="20"/>
-          <w:shd w:val="clear" w:color="auto" w:fill="E5E5E5"/>
-        </w:rPr>
-        <w:t>DESC</w:t>
-      </w:r>
-      <w:r>
-        <w:rPr>
-          <w:rStyle w:val="cm-punctuation"/>
-          <w:rFonts w:ascii="Courier New" w:hAnsi="Courier New" w:cs="Courier New"/>
-          <w:color w:val="444444"/>
-          <w:sz w:val="20"/>
-          <w:szCs w:val="20"/>
-          <w:shd w:val="clear" w:color="auto" w:fill="E5E5E5"/>
-        </w:rPr>
-        <w:t>;</w:t>
-      </w:r>
-    </w:p>
-    <w:p>
-      <w:pPr>
-        <w:rPr>
-          <w:sz w:val="24"/>
-          <w:szCs w:val="24"/>
-        </w:rPr>
-      </w:pPr>
-      <w:r>
-        <w:rPr>
-          <w:noProof/>
-          <w:sz w:val="24"/>
-          <w:szCs w:val="24"/>
-        </w:rPr>
-        <w:drawing>
-          <wp:inline distT="0" distB="0" distL="0" distR="0" wp14:anchorId="28BE176E" wp14:editId="5E228D09">
-            <wp:extent cx="5724525" cy="2686050"/>
-            <wp:effectExtent l="0" t="0" r="9525" b="0"/>
-            <wp:docPr id="1689269051" name="Picture 5"/>
-            <wp:cNvGraphicFramePr>
-              <a:graphicFrameLocks xmlns:a="http://schemas.openxmlformats.org/drawingml/2006/main" noChangeAspect="1"/>
-            </wp:cNvGraphicFramePr>
-            <a:graphic xmlns:a="http://schemas.openxmlformats.org/drawingml/2006/main">
-              <a:graphicData uri="http://schemas.openxmlformats.org/drawingml/2006/picture">
-                <pic:pic xmlns:pic="http://schemas.openxmlformats.org/drawingml/2006/picture">
-                  <pic:nvPicPr>
-                    <pic:cNvPr id="0" name="Picture 5"/>
-                    <pic:cNvPicPr>
-                      <a:picLocks noChangeAspect="1" noChangeArrowheads="1"/>
-                    </pic:cNvPicPr>
-                  </pic:nvPicPr>
-                  <pic:blipFill>
-                    <a:blip r:embed="rId34">
-                      <a:extLst>
-                        <a:ext uri="{28A0092B-C50C-407E-A947-70E740481C1C}">
-                          <a14:useLocalDpi xmlns:a14="http://schemas.microsoft.com/office/drawing/2010/main" val="0"/>
-                        </a:ext>
-                      </a:extLst>
-                    </a:blip>
-                    <a:srcRect/>
-                    <a:stretch>
-                      <a:fillRect/>
-                    </a:stretch>
-                  </pic:blipFill>
-                  <pic:spPr bwMode="auto">
-                    <a:xfrm>
-                      <a:off x="0" y="0"/>
-                      <a:ext cx="5724525" cy="2686050"/>
-                    </a:xfrm>
-                    <a:prstGeom prst="rect">
-                      <a:avLst/>
-                    </a:prstGeom>
-                    <a:noFill/>
-                    <a:ln>
-                      <a:noFill/>
-                    </a:ln>
-                  </pic:spPr>
-                </pic:pic>
-              </a:graphicData>
-            </a:graphic>
-          </wp:inline>
-        </w:drawing>
-      </w:r>
-    </w:p>
-    <w:p>
-      <w:pPr>
-        <w:rPr>
-          <w:sz w:val="24"/>
-          <w:szCs w:val="24"/>
-        </w:rPr>
-      </w:pPr>
-    </w:p>
-    <w:p>
-      <w:pPr>
-        <w:rPr>
-          <w:sz w:val="24"/>
-          <w:szCs w:val="24"/>
-        </w:rPr>
-      </w:pPr>
-    </w:p>
-    <w:p>
-      <w:pPr>
-        <w:rPr>
-          <w:sz w:val="24"/>
-          <w:szCs w:val="24"/>
-        </w:rPr>
-      </w:pPr>
-    </w:p>
-    <w:p>
-      <w:pPr>
-        <w:rPr>
-          <w:sz w:val="24"/>
-          <w:szCs w:val="24"/>
-        </w:rPr>
-      </w:pPr>
-    </w:p>
-    <w:p>
-      <w:pPr>
-        <w:rPr>
-          <w:sz w:val="24"/>
-          <w:szCs w:val="24"/>
-        </w:rPr>
-      </w:pPr>
-    </w:p>
-    <w:p>
-      <w:pPr>
-        <w:rPr>
-          <w:b/>
-          <w:bCs/>
-          <w:sz w:val="24"/>
-          <w:szCs w:val="24"/>
-        </w:rPr>
-      </w:pPr>
-      <w:r>
-        <w:rPr>
-          <w:b/>
-          <w:bCs/>
-          <w:sz w:val="24"/>
-          <w:szCs w:val="24"/>
-        </w:rPr>
-        <w:lastRenderedPageBreak/>
-        <w:t>#A</w:t>
-      </w:r>
-      <w:r>
-        <w:rPr>
-          <w:b/>
-          <w:bCs/>
-          <w:sz w:val="24"/>
-          <w:szCs w:val="24"/>
-        </w:rPr>
-        <w:t>CTOR</w:t>
-      </w:r>
-      <w:r>
-        <w:rPr>
-          <w:b/>
-          <w:bCs/>
-          <w:sz w:val="24"/>
-          <w:szCs w:val="24"/>
-        </w:rPr>
-        <w:t xml:space="preserve"> R</w:t>
-      </w:r>
-      <w:r>
-        <w:rPr>
-          <w:b/>
-          <w:bCs/>
-          <w:sz w:val="24"/>
-          <w:szCs w:val="24"/>
-        </w:rPr>
-        <w:t>ANKIN</w:t>
-      </w:r>
-      <w:r>
-        <w:rPr>
-          <w:b/>
-          <w:bCs/>
-          <w:sz w:val="24"/>
-          <w:szCs w:val="24"/>
-        </w:rPr>
-        <w:t>G</w:t>
-      </w:r>
-      <w:r>
-        <w:rPr>
-          <w:b/>
-          <w:bCs/>
-          <w:sz w:val="24"/>
-          <w:szCs w:val="24"/>
-        </w:rPr>
-        <w:t xml:space="preserve"> B</w:t>
-      </w:r>
-      <w:r>
-        <w:rPr>
-          <w:b/>
-          <w:bCs/>
-          <w:sz w:val="24"/>
-          <w:szCs w:val="24"/>
-        </w:rPr>
-        <w:t>ASED</w:t>
-      </w:r>
-      <w:r>
-        <w:rPr>
-          <w:b/>
-          <w:bCs/>
-          <w:sz w:val="24"/>
-          <w:szCs w:val="24"/>
-        </w:rPr>
-        <w:t xml:space="preserve"> O</w:t>
-      </w:r>
-      <w:r>
-        <w:rPr>
-          <w:b/>
-          <w:bCs/>
-          <w:sz w:val="24"/>
-          <w:szCs w:val="24"/>
-        </w:rPr>
-        <w:t>N</w:t>
-      </w:r>
-      <w:r>
-        <w:rPr>
-          <w:b/>
-          <w:bCs/>
-          <w:sz w:val="24"/>
-          <w:szCs w:val="24"/>
-        </w:rPr>
-        <w:t xml:space="preserve"> M</w:t>
-      </w:r>
-      <w:r>
-        <w:rPr>
-          <w:b/>
-          <w:bCs/>
-          <w:sz w:val="24"/>
-          <w:szCs w:val="24"/>
-        </w:rPr>
-        <w:t>OVIE</w:t>
-      </w:r>
-      <w:r>
-        <w:rPr>
-          <w:b/>
-          <w:bCs/>
-          <w:sz w:val="24"/>
-          <w:szCs w:val="24"/>
-        </w:rPr>
-        <w:t xml:space="preserve"> C</w:t>
-      </w:r>
-      <w:r>
-        <w:rPr>
-          <w:b/>
-          <w:bCs/>
-          <w:sz w:val="24"/>
-          <w:szCs w:val="24"/>
-        </w:rPr>
-        <w:t>OUNT</w:t>
-      </w:r>
-    </w:p>
-    <w:p>
-      <w:pPr>
-        <w:rPr>
-          <w:rStyle w:val="cm-punctuation"/>
-          <w:rFonts w:ascii="Courier New" w:hAnsi="Courier New" w:cs="Courier New"/>
-          <w:color w:val="444444"/>
-          <w:sz w:val="20"/>
-          <w:szCs w:val="20"/>
-          <w:shd w:val="clear" w:color="auto" w:fill="E5E5E5"/>
-        </w:rPr>
-      </w:pPr>
-      <w:hyperlink r:id="rId35" w:tgtFrame="mysql_doc" w:history="1">
-        <w:r>
-          <w:rPr>
-            <w:rStyle w:val="Hyperlink"/>
-            <w:rFonts w:ascii="Courier New" w:hAnsi="Courier New" w:cs="Courier New"/>
-            <w:sz w:val="20"/>
-            <w:szCs w:val="20"/>
-            <w:shd w:val="clear" w:color="auto" w:fill="E5E5E5"/>
-          </w:rPr>
-          <w:t>SELECT</w:t>
-        </w:r>
-      </w:hyperlink>
-      <w:r>
-        <w:rPr>
-          <w:rFonts w:ascii="Courier New" w:hAnsi="Courier New" w:cs="Courier New"/>
-          <w:color w:val="444444"/>
-          <w:sz w:val="20"/>
-          <w:szCs w:val="20"/>
-          <w:shd w:val="clear" w:color="auto" w:fill="E5E5E5"/>
-        </w:rPr>
-        <w:t> main_actor</w:t>
-      </w:r>
-      <w:r>
-        <w:rPr>
-          <w:rStyle w:val="cm-punctuation"/>
-          <w:rFonts w:ascii="Courier New" w:hAnsi="Courier New" w:cs="Courier New"/>
-          <w:color w:val="444444"/>
-          <w:sz w:val="20"/>
-          <w:szCs w:val="20"/>
-          <w:shd w:val="clear" w:color="auto" w:fill="E5E5E5"/>
-        </w:rPr>
-        <w:t>,</w:t>
-      </w:r>
-      <w:r>
-        <w:rPr>
-          <w:rFonts w:ascii="Courier New" w:hAnsi="Courier New" w:cs="Courier New"/>
-          <w:color w:val="444444"/>
-          <w:sz w:val="20"/>
-          <w:szCs w:val="20"/>
-          <w:shd w:val="clear" w:color="auto" w:fill="E5E5E5"/>
-        </w:rPr>
-        <w:t> movie_count</w:t>
-      </w:r>
-      <w:r>
-        <w:rPr>
-          <w:rStyle w:val="cm-punctuation"/>
-          <w:rFonts w:ascii="Courier New" w:hAnsi="Courier New" w:cs="Courier New"/>
-          <w:color w:val="444444"/>
-          <w:sz w:val="20"/>
-          <w:szCs w:val="20"/>
-          <w:shd w:val="clear" w:color="auto" w:fill="E5E5E5"/>
-        </w:rPr>
-        <w:t>,</w:t>
-      </w:r>
-      <w:r>
-        <w:rPr>
-          <w:rFonts w:ascii="Courier New" w:hAnsi="Courier New" w:cs="Courier New"/>
-          <w:color w:val="444444"/>
-          <w:sz w:val="20"/>
-          <w:szCs w:val="20"/>
-          <w:shd w:val="clear" w:color="auto" w:fill="E5E5E5"/>
-        </w:rPr>
-        <w:t> DENSE_RANK</w:t>
-      </w:r>
-      <w:r>
-        <w:rPr>
-          <w:rStyle w:val="cm-bracket"/>
-          <w:rFonts w:ascii="Courier New" w:hAnsi="Courier New" w:cs="Courier New"/>
-          <w:color w:val="999977"/>
-          <w:sz w:val="20"/>
-          <w:szCs w:val="20"/>
-          <w:shd w:val="clear" w:color="auto" w:fill="E5E5E5"/>
-        </w:rPr>
-        <w:t>()</w:t>
-      </w:r>
-      <w:r>
-        <w:rPr>
-          <w:rFonts w:ascii="Courier New" w:hAnsi="Courier New" w:cs="Courier New"/>
-          <w:color w:val="444444"/>
-          <w:sz w:val="20"/>
-          <w:szCs w:val="20"/>
-          <w:shd w:val="clear" w:color="auto" w:fill="E5E5E5"/>
-        </w:rPr>
-        <w:t> OVER </w:t>
-      </w:r>
-      <w:r>
-        <w:rPr>
-          <w:rStyle w:val="cm-bracket"/>
-          <w:rFonts w:ascii="Courier New" w:hAnsi="Courier New" w:cs="Courier New"/>
-          <w:color w:val="999977"/>
-          <w:sz w:val="20"/>
-          <w:szCs w:val="20"/>
-          <w:shd w:val="clear" w:color="auto" w:fill="E5E5E5"/>
-        </w:rPr>
-        <w:t>(</w:t>
-      </w:r>
-      <w:r>
-        <w:rPr>
-          <w:rStyle w:val="cm-keyword"/>
-          <w:rFonts w:ascii="Courier New" w:hAnsi="Courier New" w:cs="Courier New"/>
-          <w:color w:val="770088"/>
-          <w:sz w:val="20"/>
-          <w:szCs w:val="20"/>
-          <w:shd w:val="clear" w:color="auto" w:fill="E5E5E5"/>
-        </w:rPr>
-        <w:t>ORDER</w:t>
-      </w:r>
-      <w:r>
-        <w:rPr>
-          <w:rFonts w:ascii="Courier New" w:hAnsi="Courier New" w:cs="Courier New"/>
-          <w:color w:val="444444"/>
-          <w:sz w:val="20"/>
-          <w:szCs w:val="20"/>
-          <w:shd w:val="clear" w:color="auto" w:fill="E5E5E5"/>
-        </w:rPr>
-        <w:t> </w:t>
-      </w:r>
-      <w:r>
-        <w:rPr>
-          <w:rStyle w:val="cm-keyword"/>
-          <w:rFonts w:ascii="Courier New" w:hAnsi="Courier New" w:cs="Courier New"/>
-          <w:color w:val="770088"/>
-          <w:sz w:val="20"/>
-          <w:szCs w:val="20"/>
-          <w:shd w:val="clear" w:color="auto" w:fill="E5E5E5"/>
-        </w:rPr>
-        <w:t>BY</w:t>
-      </w:r>
-      <w:r>
-        <w:rPr>
-          <w:rFonts w:ascii="Courier New" w:hAnsi="Courier New" w:cs="Courier New"/>
-          <w:color w:val="444444"/>
-          <w:sz w:val="20"/>
-          <w:szCs w:val="20"/>
-          <w:shd w:val="clear" w:color="auto" w:fill="E5E5E5"/>
-        </w:rPr>
-        <w:t> movie_count </w:t>
-      </w:r>
-      <w:r>
-        <w:rPr>
-          <w:rStyle w:val="cm-keyword"/>
-          <w:rFonts w:ascii="Courier New" w:hAnsi="Courier New" w:cs="Courier New"/>
-          <w:color w:val="770088"/>
-          <w:sz w:val="20"/>
-          <w:szCs w:val="20"/>
-          <w:shd w:val="clear" w:color="auto" w:fill="E5E5E5"/>
-        </w:rPr>
-        <w:t>DESC</w:t>
-      </w:r>
-      <w:r>
-        <w:rPr>
-          <w:rStyle w:val="cm-bracket"/>
-          <w:rFonts w:ascii="Courier New" w:hAnsi="Courier New" w:cs="Courier New"/>
-          <w:color w:val="999977"/>
-          <w:sz w:val="20"/>
-          <w:szCs w:val="20"/>
-          <w:shd w:val="clear" w:color="auto" w:fill="E5E5E5"/>
-        </w:rPr>
-        <w:t>)</w:t>
-      </w:r>
-      <w:r>
-        <w:rPr>
-          <w:rFonts w:ascii="Courier New" w:hAnsi="Courier New" w:cs="Courier New"/>
-          <w:color w:val="444444"/>
-          <w:sz w:val="20"/>
-          <w:szCs w:val="20"/>
-          <w:shd w:val="clear" w:color="auto" w:fill="E5E5E5"/>
-        </w:rPr>
-        <w:t> </w:t>
-      </w:r>
-      <w:r>
-        <w:rPr>
-          <w:rStyle w:val="cm-keyword"/>
-          <w:rFonts w:ascii="Courier New" w:hAnsi="Courier New" w:cs="Courier New"/>
-          <w:color w:val="770088"/>
-          <w:sz w:val="20"/>
-          <w:szCs w:val="20"/>
-          <w:shd w:val="clear" w:color="auto" w:fill="E5E5E5"/>
-        </w:rPr>
-        <w:t>AS</w:t>
-      </w:r>
-      <w:r>
-        <w:rPr>
-          <w:rFonts w:ascii="Courier New" w:hAnsi="Courier New" w:cs="Courier New"/>
-          <w:color w:val="444444"/>
-          <w:sz w:val="20"/>
-          <w:szCs w:val="20"/>
-          <w:shd w:val="clear" w:color="auto" w:fill="E5E5E5"/>
-        </w:rPr>
-        <w:t> actor_rank </w:t>
-      </w:r>
-      <w:r>
-        <w:rPr>
-          <w:rStyle w:val="cm-keyword"/>
-          <w:rFonts w:ascii="Courier New" w:hAnsi="Courier New" w:cs="Courier New"/>
-          <w:color w:val="770088"/>
-          <w:sz w:val="20"/>
-          <w:szCs w:val="20"/>
-          <w:shd w:val="clear" w:color="auto" w:fill="E5E5E5"/>
-        </w:rPr>
-        <w:t>FROM</w:t>
-      </w:r>
-      <w:r>
-        <w:rPr>
-          <w:rFonts w:ascii="Courier New" w:hAnsi="Courier New" w:cs="Courier New"/>
-          <w:color w:val="444444"/>
-          <w:sz w:val="20"/>
-          <w:szCs w:val="20"/>
-          <w:shd w:val="clear" w:color="auto" w:fill="E5E5E5"/>
-        </w:rPr>
-        <w:t> </w:t>
-      </w:r>
-      <w:r>
-        <w:rPr>
-          <w:rStyle w:val="cm-bracket"/>
-          <w:rFonts w:ascii="Courier New" w:hAnsi="Courier New" w:cs="Courier New"/>
-          <w:color w:val="999977"/>
-          <w:sz w:val="20"/>
-          <w:szCs w:val="20"/>
-          <w:shd w:val="clear" w:color="auto" w:fill="E5E5E5"/>
-        </w:rPr>
-        <w:t>(</w:t>
-      </w:r>
-      <w:r>
-        <w:rPr>
-          <w:rFonts w:ascii="Courier New" w:hAnsi="Courier New" w:cs="Courier New"/>
-          <w:color w:val="444444"/>
-          <w:sz w:val="20"/>
-          <w:szCs w:val="20"/>
-          <w:shd w:val="clear" w:color="auto" w:fill="E5E5E5"/>
-        </w:rPr>
-        <w:t> </w:t>
-      </w:r>
-      <w:hyperlink r:id="rId36" w:tgtFrame="mysql_doc" w:history="1">
-        <w:r>
-          <w:rPr>
-            <w:rStyle w:val="Hyperlink"/>
-            <w:rFonts w:ascii="Courier New" w:hAnsi="Courier New" w:cs="Courier New"/>
-            <w:sz w:val="20"/>
-            <w:szCs w:val="20"/>
-            <w:shd w:val="clear" w:color="auto" w:fill="E5E5E5"/>
-          </w:rPr>
-          <w:t>SELECT</w:t>
-        </w:r>
-      </w:hyperlink>
-      <w:r>
-        <w:rPr>
-          <w:rFonts w:ascii="Courier New" w:hAnsi="Courier New" w:cs="Courier New"/>
-          <w:color w:val="444444"/>
-          <w:sz w:val="20"/>
-          <w:szCs w:val="20"/>
-          <w:shd w:val="clear" w:color="auto" w:fill="E5E5E5"/>
-        </w:rPr>
-        <w:t> TRIM</w:t>
-      </w:r>
-      <w:r>
-        <w:rPr>
-          <w:rStyle w:val="cm-bracket"/>
-          <w:rFonts w:ascii="Courier New" w:hAnsi="Courier New" w:cs="Courier New"/>
-          <w:color w:val="999977"/>
-          <w:sz w:val="20"/>
-          <w:szCs w:val="20"/>
-          <w:shd w:val="clear" w:color="auto" w:fill="E5E5E5"/>
-        </w:rPr>
-        <w:t>(</w:t>
-      </w:r>
-      <w:r>
-        <w:rPr>
-          <w:rFonts w:ascii="Courier New" w:hAnsi="Courier New" w:cs="Courier New"/>
-          <w:color w:val="444444"/>
-          <w:sz w:val="20"/>
-          <w:szCs w:val="20"/>
-          <w:shd w:val="clear" w:color="auto" w:fill="E5E5E5"/>
-        </w:rPr>
-        <w:t>SUBSTRING_INDEX</w:t>
-      </w:r>
-      <w:r>
-        <w:rPr>
-          <w:rStyle w:val="cm-bracket"/>
-          <w:rFonts w:ascii="Courier New" w:hAnsi="Courier New" w:cs="Courier New"/>
-          <w:color w:val="999977"/>
-          <w:sz w:val="20"/>
-          <w:szCs w:val="20"/>
-          <w:shd w:val="clear" w:color="auto" w:fill="E5E5E5"/>
-        </w:rPr>
-        <w:t>(</w:t>
-      </w:r>
-      <w:r>
-        <w:rPr>
-          <w:rFonts w:ascii="Courier New" w:hAnsi="Courier New" w:cs="Courier New"/>
-          <w:color w:val="444444"/>
-          <w:sz w:val="20"/>
-          <w:szCs w:val="20"/>
-          <w:shd w:val="clear" w:color="auto" w:fill="E5E5E5"/>
-        </w:rPr>
-        <w:t>actors</w:t>
-      </w:r>
-      <w:r>
-        <w:rPr>
-          <w:rStyle w:val="cm-punctuation"/>
-          <w:rFonts w:ascii="Courier New" w:hAnsi="Courier New" w:cs="Courier New"/>
-          <w:color w:val="444444"/>
-          <w:sz w:val="20"/>
-          <w:szCs w:val="20"/>
-          <w:shd w:val="clear" w:color="auto" w:fill="E5E5E5"/>
-        </w:rPr>
-        <w:t>,</w:t>
-      </w:r>
-      <w:r>
-        <w:rPr>
-          <w:rFonts w:ascii="Courier New" w:hAnsi="Courier New" w:cs="Courier New"/>
-          <w:color w:val="444444"/>
-          <w:sz w:val="20"/>
-          <w:szCs w:val="20"/>
-          <w:shd w:val="clear" w:color="auto" w:fill="E5E5E5"/>
-        </w:rPr>
-        <w:t> </w:t>
-      </w:r>
-      <w:r>
-        <w:rPr>
-          <w:rStyle w:val="cm-string"/>
-          <w:rFonts w:ascii="Courier New" w:hAnsi="Courier New" w:cs="Courier New"/>
-          <w:color w:val="AA1111"/>
-          <w:sz w:val="20"/>
-          <w:szCs w:val="20"/>
-          <w:shd w:val="clear" w:color="auto" w:fill="E5E5E5"/>
-        </w:rPr>
-        <w:t>','</w:t>
-      </w:r>
-      <w:r>
-        <w:rPr>
-          <w:rStyle w:val="cm-punctuation"/>
-          <w:rFonts w:ascii="Courier New" w:hAnsi="Courier New" w:cs="Courier New"/>
-          <w:color w:val="444444"/>
-          <w:sz w:val="20"/>
-          <w:szCs w:val="20"/>
-          <w:shd w:val="clear" w:color="auto" w:fill="E5E5E5"/>
-        </w:rPr>
-        <w:t>,</w:t>
-      </w:r>
-      <w:r>
-        <w:rPr>
-          <w:rFonts w:ascii="Courier New" w:hAnsi="Courier New" w:cs="Courier New"/>
-          <w:color w:val="444444"/>
-          <w:sz w:val="20"/>
-          <w:szCs w:val="20"/>
-          <w:shd w:val="clear" w:color="auto" w:fill="E5E5E5"/>
-        </w:rPr>
-        <w:t> </w:t>
-      </w:r>
-      <w:r>
-        <w:rPr>
-          <w:rStyle w:val="cm-number"/>
-          <w:rFonts w:ascii="Courier New" w:hAnsi="Courier New" w:cs="Courier New"/>
-          <w:color w:val="116644"/>
-          <w:sz w:val="20"/>
-          <w:szCs w:val="20"/>
-          <w:shd w:val="clear" w:color="auto" w:fill="E5E5E5"/>
-        </w:rPr>
-        <w:t>1</w:t>
-      </w:r>
-      <w:r>
-        <w:rPr>
-          <w:rStyle w:val="cm-bracket"/>
-          <w:rFonts w:ascii="Courier New" w:hAnsi="Courier New" w:cs="Courier New"/>
-          <w:color w:val="999977"/>
-          <w:sz w:val="20"/>
-          <w:szCs w:val="20"/>
-          <w:shd w:val="clear" w:color="auto" w:fill="E5E5E5"/>
-        </w:rPr>
-        <w:t>))</w:t>
-      </w:r>
-      <w:r>
-        <w:rPr>
-          <w:rFonts w:ascii="Courier New" w:hAnsi="Courier New" w:cs="Courier New"/>
-          <w:color w:val="444444"/>
-          <w:sz w:val="20"/>
-          <w:szCs w:val="20"/>
-          <w:shd w:val="clear" w:color="auto" w:fill="E5E5E5"/>
-        </w:rPr>
-        <w:t> </w:t>
-      </w:r>
-      <w:r>
-        <w:rPr>
-          <w:rStyle w:val="cm-keyword"/>
-          <w:rFonts w:ascii="Courier New" w:hAnsi="Courier New" w:cs="Courier New"/>
-          <w:color w:val="770088"/>
-          <w:sz w:val="20"/>
-          <w:szCs w:val="20"/>
-          <w:shd w:val="clear" w:color="auto" w:fill="E5E5E5"/>
-        </w:rPr>
-        <w:t>AS</w:t>
-      </w:r>
-      <w:r>
-        <w:rPr>
-          <w:rFonts w:ascii="Courier New" w:hAnsi="Courier New" w:cs="Courier New"/>
-          <w:color w:val="444444"/>
-          <w:sz w:val="20"/>
-          <w:szCs w:val="20"/>
-          <w:shd w:val="clear" w:color="auto" w:fill="E5E5E5"/>
-        </w:rPr>
-        <w:t> main_actor</w:t>
-      </w:r>
-      <w:r>
-        <w:rPr>
-          <w:rStyle w:val="cm-punctuation"/>
-          <w:rFonts w:ascii="Courier New" w:hAnsi="Courier New" w:cs="Courier New"/>
-          <w:color w:val="444444"/>
-          <w:sz w:val="20"/>
-          <w:szCs w:val="20"/>
-          <w:shd w:val="clear" w:color="auto" w:fill="E5E5E5"/>
-        </w:rPr>
-        <w:t>,</w:t>
-      </w:r>
-      <w:r>
-        <w:rPr>
-          <w:rFonts w:ascii="Courier New" w:hAnsi="Courier New" w:cs="Courier New"/>
-          <w:color w:val="444444"/>
-          <w:sz w:val="20"/>
-          <w:szCs w:val="20"/>
-          <w:shd w:val="clear" w:color="auto" w:fill="E5E5E5"/>
-        </w:rPr>
-        <w:t> </w:t>
-      </w:r>
-      <w:hyperlink r:id="rId37" w:tgtFrame="mysql_doc" w:history="1">
-        <w:r>
-          <w:rPr>
-            <w:rStyle w:val="Hyperlink"/>
-            <w:rFonts w:ascii="Courier New" w:hAnsi="Courier New" w:cs="Courier New"/>
-            <w:sz w:val="20"/>
-            <w:szCs w:val="20"/>
-            <w:shd w:val="clear" w:color="auto" w:fill="E5E5E5"/>
-          </w:rPr>
-          <w:t>COUNT</w:t>
-        </w:r>
-      </w:hyperlink>
-      <w:r>
-        <w:rPr>
-          <w:rStyle w:val="cm-bracket"/>
-          <w:rFonts w:ascii="Courier New" w:hAnsi="Courier New" w:cs="Courier New"/>
-          <w:color w:val="999977"/>
-          <w:sz w:val="20"/>
-          <w:szCs w:val="20"/>
-          <w:shd w:val="clear" w:color="auto" w:fill="E5E5E5"/>
-        </w:rPr>
-        <w:t>(</w:t>
-      </w:r>
-      <w:r>
-        <w:rPr>
-          <w:rStyle w:val="cm-operator"/>
-          <w:rFonts w:ascii="Courier New" w:hAnsi="Courier New" w:cs="Courier New"/>
-          <w:color w:val="FF00FF"/>
-          <w:sz w:val="20"/>
-          <w:szCs w:val="20"/>
-          <w:shd w:val="clear" w:color="auto" w:fill="E5E5E5"/>
-        </w:rPr>
-        <w:t>*</w:t>
-      </w:r>
-      <w:r>
-        <w:rPr>
-          <w:rStyle w:val="cm-bracket"/>
-          <w:rFonts w:ascii="Courier New" w:hAnsi="Courier New" w:cs="Courier New"/>
-          <w:color w:val="999977"/>
-          <w:sz w:val="20"/>
-          <w:szCs w:val="20"/>
-          <w:shd w:val="clear" w:color="auto" w:fill="E5E5E5"/>
-        </w:rPr>
-        <w:t>)</w:t>
-      </w:r>
-      <w:r>
-        <w:rPr>
-          <w:rFonts w:ascii="Courier New" w:hAnsi="Courier New" w:cs="Courier New"/>
-          <w:color w:val="444444"/>
-          <w:sz w:val="20"/>
-          <w:szCs w:val="20"/>
-          <w:shd w:val="clear" w:color="auto" w:fill="E5E5E5"/>
-        </w:rPr>
-        <w:t> </w:t>
-      </w:r>
-      <w:r>
-        <w:rPr>
-          <w:rStyle w:val="cm-keyword"/>
-          <w:rFonts w:ascii="Courier New" w:hAnsi="Courier New" w:cs="Courier New"/>
-          <w:color w:val="770088"/>
-          <w:sz w:val="20"/>
-          <w:szCs w:val="20"/>
-          <w:shd w:val="clear" w:color="auto" w:fill="E5E5E5"/>
-        </w:rPr>
-        <w:t>AS</w:t>
-      </w:r>
-      <w:r>
-        <w:rPr>
-          <w:rFonts w:ascii="Courier New" w:hAnsi="Courier New" w:cs="Courier New"/>
-          <w:color w:val="444444"/>
-          <w:sz w:val="20"/>
-          <w:szCs w:val="20"/>
-          <w:shd w:val="clear" w:color="auto" w:fill="E5E5E5"/>
-        </w:rPr>
-        <w:t> movie_count </w:t>
-      </w:r>
-      <w:r>
-        <w:rPr>
-          <w:rStyle w:val="cm-keyword"/>
-          <w:rFonts w:ascii="Courier New" w:hAnsi="Courier New" w:cs="Courier New"/>
-          <w:color w:val="770088"/>
-          <w:sz w:val="20"/>
-          <w:szCs w:val="20"/>
-          <w:shd w:val="clear" w:color="auto" w:fill="E5E5E5"/>
-        </w:rPr>
-        <w:t>FROM</w:t>
-      </w:r>
-      <w:r>
-        <w:rPr>
-          <w:rFonts w:ascii="Courier New" w:hAnsi="Courier New" w:cs="Courier New"/>
-          <w:color w:val="444444"/>
-          <w:sz w:val="20"/>
-          <w:szCs w:val="20"/>
-          <w:shd w:val="clear" w:color="auto" w:fill="E5E5E5"/>
-        </w:rPr>
-        <w:t> imdb_movie_data </w:t>
-      </w:r>
-      <w:r>
-        <w:rPr>
-          <w:rStyle w:val="cm-keyword"/>
-          <w:rFonts w:ascii="Courier New" w:hAnsi="Courier New" w:cs="Courier New"/>
-          <w:color w:val="770088"/>
-          <w:sz w:val="20"/>
-          <w:szCs w:val="20"/>
-          <w:shd w:val="clear" w:color="auto" w:fill="E5E5E5"/>
-        </w:rPr>
-        <w:t>GROUP</w:t>
-      </w:r>
-      <w:r>
-        <w:rPr>
-          <w:rFonts w:ascii="Courier New" w:hAnsi="Courier New" w:cs="Courier New"/>
-          <w:color w:val="444444"/>
-          <w:sz w:val="20"/>
-          <w:szCs w:val="20"/>
-          <w:shd w:val="clear" w:color="auto" w:fill="E5E5E5"/>
-        </w:rPr>
-        <w:t> </w:t>
-      </w:r>
-      <w:r>
-        <w:rPr>
-          <w:rStyle w:val="cm-keyword"/>
-          <w:rFonts w:ascii="Courier New" w:hAnsi="Courier New" w:cs="Courier New"/>
-          <w:color w:val="770088"/>
-          <w:sz w:val="20"/>
-          <w:szCs w:val="20"/>
-          <w:shd w:val="clear" w:color="auto" w:fill="E5E5E5"/>
-        </w:rPr>
-        <w:t>BY</w:t>
-      </w:r>
-      <w:r>
-        <w:rPr>
-          <w:rFonts w:ascii="Courier New" w:hAnsi="Courier New" w:cs="Courier New"/>
-          <w:color w:val="444444"/>
-          <w:sz w:val="20"/>
-          <w:szCs w:val="20"/>
-          <w:shd w:val="clear" w:color="auto" w:fill="E5E5E5"/>
-        </w:rPr>
-        <w:t> main_actor </w:t>
-      </w:r>
-      <w:r>
-        <w:rPr>
-          <w:rStyle w:val="cm-bracket"/>
-          <w:rFonts w:ascii="Courier New" w:hAnsi="Courier New" w:cs="Courier New"/>
-          <w:color w:val="999977"/>
-          <w:sz w:val="20"/>
-          <w:szCs w:val="20"/>
-          <w:shd w:val="clear" w:color="auto" w:fill="E5E5E5"/>
-        </w:rPr>
-        <w:t>)</w:t>
-      </w:r>
-      <w:r>
-        <w:rPr>
-          <w:rFonts w:ascii="Courier New" w:hAnsi="Courier New" w:cs="Courier New"/>
-          <w:color w:val="444444"/>
-          <w:sz w:val="20"/>
-          <w:szCs w:val="20"/>
-          <w:shd w:val="clear" w:color="auto" w:fill="E5E5E5"/>
-        </w:rPr>
-        <w:t> t</w:t>
-      </w:r>
-      <w:r>
-        <w:rPr>
-          <w:rStyle w:val="cm-punctuation"/>
-          <w:rFonts w:ascii="Courier New" w:hAnsi="Courier New" w:cs="Courier New"/>
-          <w:color w:val="444444"/>
-          <w:sz w:val="20"/>
-          <w:szCs w:val="20"/>
-          <w:shd w:val="clear" w:color="auto" w:fill="E5E5E5"/>
-        </w:rPr>
-        <w:t>;</w:t>
-      </w:r>
-    </w:p>
-    <w:p>
-      <w:pPr>
-        <w:rPr>
-          <w:sz w:val="24"/>
-          <w:szCs w:val="24"/>
-        </w:rPr>
-      </w:pPr>
-      <w:r>
-        <w:rPr>
-          <w:noProof/>
-          <w:sz w:val="24"/>
-          <w:szCs w:val="24"/>
-        </w:rPr>
-        <w:drawing>
-          <wp:inline distT="0" distB="0" distL="0" distR="0" wp14:anchorId="51E9D6D1" wp14:editId="01D6C30D">
-            <wp:extent cx="5731510" cy="2456180"/>
-            <wp:effectExtent l="0" t="0" r="2540" b="1270"/>
-            <wp:docPr id="1213078126" name="Picture 1"/>
-            <wp:cNvGraphicFramePr>
-              <a:graphicFrameLocks xmlns:a="http://schemas.openxmlformats.org/drawingml/2006/main" noChangeAspect="1"/>
-            </wp:cNvGraphicFramePr>
-            <a:graphic xmlns:a="http://schemas.openxmlformats.org/drawingml/2006/main">
-              <a:graphicData uri="http://schemas.openxmlformats.org/drawingml/2006/picture">
-                <pic:pic xmlns:pic="http://schemas.openxmlformats.org/drawingml/2006/picture">
-                  <pic:nvPicPr>
-                    <pic:cNvPr id="0" name="Picture 1"/>
-                    <pic:cNvPicPr>
-                      <a:picLocks noChangeAspect="1" noChangeArrowheads="1"/>
-                    </pic:cNvPicPr>
-                  </pic:nvPicPr>
-                  <pic:blipFill>
-                    <a:blip r:embed="rId38">
-                      <a:extLst>
-                        <a:ext uri="{28A0092B-C50C-407E-A947-70E740481C1C}">
-                          <a14:useLocalDpi xmlns:a14="http://schemas.microsoft.com/office/drawing/2010/main" val="0"/>
-                        </a:ext>
-                      </a:extLst>
-                    </a:blip>
-                    <a:srcRect/>
-                    <a:stretch>
-                      <a:fillRect/>
-                    </a:stretch>
-                  </pic:blipFill>
-                  <pic:spPr bwMode="auto">
-                    <a:xfrm>
-                      <a:off x="0" y="0"/>
-                      <a:ext cx="5731510" cy="2456180"/>
-                    </a:xfrm>
-                    <a:prstGeom prst="rect">
-                      <a:avLst/>
-                    </a:prstGeom>
-                    <a:noFill/>
-                    <a:ln>
-                      <a:noFill/>
-                    </a:ln>
-                  </pic:spPr>
-                </pic:pic>
-              </a:graphicData>
-            </a:graphic>
-          </wp:inline>
-        </w:drawing>
-      </w:r>
     </w:p>
     <w:sectPr>
       <w:pgSz w:w="11906" w:h="16838"/>
@@ -5637,6 +4801,7 @@
   <w:style w:type="character" w:default="1" w:styleId="DefaultParagraphFont">
     <w:name w:val="Default Paragraph Font"/>
     <w:uiPriority w:val="1"/>
+    <w:semiHidden/>
     <w:unhideWhenUsed/>
   </w:style>
   <w:style w:type="table" w:default="1" w:styleId="TableNormal">

</xml_diff>